<commit_message>
Decisions Log: record today's decisions (stack, repository, Release 0)
Co-Authored-By: Claude Opus 5.5 <noreply@anthropic.com>
Claude-Session: https://claude.ai/code/session_01Ldobdy64eRo1kv947RTJgi
</commit_message>
<xml_diff>
--- a/docs/specs/FindHouseQuick_Decisions_Log.docx
+++ b/docs/specs/FindHouseQuick_Decisions_Log.docx
@@ -2365,6 +2365,366 @@
           </w:p>
         </w:tc>
       </w:tr>
+      <w:tr>
+        <w:tc>
+          <w:tcPr>
+            <w:tcW w:type="dxa" w:w="632"/>
+            <w:tcBorders>
+              <w:top w:val="single" w:color="A6A6A6" w:sz="4"/>
+              <w:left w:val="single" w:color="A6A6A6" w:sz="4"/>
+              <w:bottom w:val="single" w:color="A6A6A6" w:sz="4"/>
+              <w:right w:val="single" w:color="A6A6A6" w:sz="4"/>
+            </w:tcBorders>
+            <w:tcMar>
+              <w:top w:type="dxa" w:w="80"/>
+              <w:left w:type="dxa" w:w="120"/>
+              <w:bottom w:type="dxa" w:w="80"/>
+              <w:right w:type="dxa" w:w="120"/>
+            </w:tcMar>
+          </w:tcPr>
+          <w:p>
+            <w:r>
+              <w:t xml:space="preserve">24</w:t>
+            </w:r>
+          </w:p>
+        </w:tc>
+        <w:tc>
+          <w:tcPr>
+            <w:tcW w:type="dxa" w:w="1625"/>
+            <w:tcBorders>
+              <w:top w:val="single" w:color="A6A6A6" w:sz="4"/>
+              <w:left w:val="single" w:color="A6A6A6" w:sz="4"/>
+              <w:bottom w:val="single" w:color="A6A6A6" w:sz="4"/>
+              <w:right w:val="single" w:color="A6A6A6" w:sz="4"/>
+            </w:tcBorders>
+            <w:tcMar>
+              <w:top w:type="dxa" w:w="80"/>
+              <w:left w:type="dxa" w:w="120"/>
+              <w:bottom w:type="dxa" w:w="80"/>
+              <w:right w:type="dxa" w:w="120"/>
+            </w:tcMar>
+          </w:tcPr>
+          <w:p>
+            <w:r>
+              <w:t xml:space="preserve">Technology</w:t>
+            </w:r>
+          </w:p>
+        </w:tc>
+        <w:tc>
+          <w:tcPr>
+            <w:tcW w:type="dxa" w:w="5235"/>
+            <w:tcBorders>
+              <w:top w:val="single" w:color="A6A6A6" w:sz="4"/>
+              <w:left w:val="single" w:color="A6A6A6" w:sz="4"/>
+              <w:bottom w:val="single" w:color="A6A6A6" w:sz="4"/>
+              <w:right w:val="single" w:color="A6A6A6" w:sz="4"/>
+            </w:tcBorders>
+            <w:tcMar>
+              <w:top w:type="dxa" w:w="80"/>
+              <w:left w:type="dxa" w:w="120"/>
+              <w:bottom w:type="dxa" w:w="80"/>
+              <w:right w:type="dxa" w:w="120"/>
+            </w:tcMar>
+          </w:tcPr>
+          <w:p>
+            <w:r>
+              <w:t xml:space="preserve">Recommended stack adopted: Flutter apps, NestJS (TypeScript) server, PostgreSQL with PostGIS, Redis.</w:t>
+            </w:r>
+          </w:p>
+        </w:tc>
+        <w:tc>
+          <w:tcPr>
+            <w:tcW w:type="dxa" w:w="1534"/>
+            <w:tcBorders>
+              <w:top w:val="single" w:color="A6A6A6" w:sz="4"/>
+              <w:left w:val="single" w:color="A6A6A6" w:sz="4"/>
+              <w:bottom w:val="single" w:color="A6A6A6" w:sz="4"/>
+              <w:right w:val="single" w:color="A6A6A6" w:sz="4"/>
+            </w:tcBorders>
+            <w:tcMar>
+              <w:top w:type="dxa" w:w="80"/>
+              <w:left w:type="dxa" w:w="120"/>
+              <w:bottom w:type="dxa" w:w="80"/>
+              <w:right w:type="dxa" w:w="120"/>
+            </w:tcMar>
+          </w:tcPr>
+          <w:p>
+            <w:r>
+              <w:t xml:space="preserve">22 Oct 2026</w:t>
+            </w:r>
+          </w:p>
+        </w:tc>
+      </w:tr>
+      <w:tr>
+        <w:tc>
+          <w:tcPr>
+            <w:tcW w:type="dxa" w:w="632"/>
+            <w:tcBorders>
+              <w:top w:val="single" w:color="A6A6A6" w:sz="4"/>
+              <w:left w:val="single" w:color="A6A6A6" w:sz="4"/>
+              <w:bottom w:val="single" w:color="A6A6A6" w:sz="4"/>
+              <w:right w:val="single" w:color="A6A6A6" w:sz="4"/>
+            </w:tcBorders>
+            <w:tcMar>
+              <w:top w:type="dxa" w:w="80"/>
+              <w:left w:type="dxa" w:w="120"/>
+              <w:bottom w:type="dxa" w:w="80"/>
+              <w:right w:type="dxa" w:w="120"/>
+            </w:tcMar>
+          </w:tcPr>
+          <w:p>
+            <w:r>
+              <w:t xml:space="preserve">25</w:t>
+            </w:r>
+          </w:p>
+        </w:tc>
+        <w:tc>
+          <w:tcPr>
+            <w:tcW w:type="dxa" w:w="1625"/>
+            <w:tcBorders>
+              <w:top w:val="single" w:color="A6A6A6" w:sz="4"/>
+              <w:left w:val="single" w:color="A6A6A6" w:sz="4"/>
+              <w:bottom w:val="single" w:color="A6A6A6" w:sz="4"/>
+              <w:right w:val="single" w:color="A6A6A6" w:sz="4"/>
+            </w:tcBorders>
+            <w:tcMar>
+              <w:top w:type="dxa" w:w="80"/>
+              <w:left w:type="dxa" w:w="120"/>
+              <w:bottom w:type="dxa" w:w="80"/>
+              <w:right w:type="dxa" w:w="120"/>
+            </w:tcMar>
+          </w:tcPr>
+          <w:p>
+            <w:r>
+              <w:t xml:space="preserve">Old prototype</w:t>
+            </w:r>
+          </w:p>
+        </w:tc>
+        <w:tc>
+          <w:tcPr>
+            <w:tcW w:type="dxa" w:w="5235"/>
+            <w:tcBorders>
+              <w:top w:val="single" w:color="A6A6A6" w:sz="4"/>
+              <w:left w:val="single" w:color="A6A6A6" w:sz="4"/>
+              <w:bottom w:val="single" w:color="A6A6A6" w:sz="4"/>
+              <w:right w:val="single" w:color="A6A6A6" w:sz="4"/>
+            </w:tcBorders>
+            <w:tcMar>
+              <w:top w:type="dxa" w:w="80"/>
+              <w:left w:type="dxa" w:w="120"/>
+              <w:bottom w:type="dxa" w:w="80"/>
+              <w:right w:type="dxa" w:w="120"/>
+            </w:tcMar>
+          </w:tcPr>
+          <w:p>
+            <w:r>
+              <w:t xml:space="preserve">The 2023 PHP prototype is kept for reference only, in the repository findhousequick-legacy. The new build reuses the findhousequick name.</w:t>
+            </w:r>
+          </w:p>
+        </w:tc>
+        <w:tc>
+          <w:tcPr>
+            <w:tcW w:type="dxa" w:w="1534"/>
+            <w:tcBorders>
+              <w:top w:val="single" w:color="A6A6A6" w:sz="4"/>
+              <w:left w:val="single" w:color="A6A6A6" w:sz="4"/>
+              <w:bottom w:val="single" w:color="A6A6A6" w:sz="4"/>
+              <w:right w:val="single" w:color="A6A6A6" w:sz="4"/>
+            </w:tcBorders>
+            <w:tcMar>
+              <w:top w:type="dxa" w:w="80"/>
+              <w:left w:type="dxa" w:w="120"/>
+              <w:bottom w:type="dxa" w:w="80"/>
+              <w:right w:type="dxa" w:w="120"/>
+            </w:tcMar>
+          </w:tcPr>
+          <w:p>
+            <w:r>
+              <w:t xml:space="preserve">22 Oct 2026</w:t>
+            </w:r>
+          </w:p>
+        </w:tc>
+      </w:tr>
+      <w:tr>
+        <w:tc>
+          <w:tcPr>
+            <w:tcW w:type="dxa" w:w="632"/>
+            <w:tcBorders>
+              <w:top w:val="single" w:color="A6A6A6" w:sz="4"/>
+              <w:left w:val="single" w:color="A6A6A6" w:sz="4"/>
+              <w:bottom w:val="single" w:color="A6A6A6" w:sz="4"/>
+              <w:right w:val="single" w:color="A6A6A6" w:sz="4"/>
+            </w:tcBorders>
+            <w:tcMar>
+              <w:top w:type="dxa" w:w="80"/>
+              <w:left w:type="dxa" w:w="120"/>
+              <w:bottom w:type="dxa" w:w="80"/>
+              <w:right w:type="dxa" w:w="120"/>
+            </w:tcMar>
+          </w:tcPr>
+          <w:p>
+            <w:r>
+              <w:t xml:space="preserve">26</w:t>
+            </w:r>
+          </w:p>
+        </w:tc>
+        <w:tc>
+          <w:tcPr>
+            <w:tcW w:type="dxa" w:w="1625"/>
+            <w:tcBorders>
+              <w:top w:val="single" w:color="A6A6A6" w:sz="4"/>
+              <w:left w:val="single" w:color="A6A6A6" w:sz="4"/>
+              <w:bottom w:val="single" w:color="A6A6A6" w:sz="4"/>
+              <w:right w:val="single" w:color="A6A6A6" w:sz="4"/>
+            </w:tcBorders>
+            <w:tcMar>
+              <w:top w:type="dxa" w:w="80"/>
+              <w:left w:type="dxa" w:w="120"/>
+              <w:bottom w:type="dxa" w:w="80"/>
+              <w:right w:type="dxa" w:w="120"/>
+            </w:tcMar>
+          </w:tcPr>
+          <w:p>
+            <w:r>
+              <w:t xml:space="preserve">Code repository</w:t>
+            </w:r>
+          </w:p>
+        </w:tc>
+        <w:tc>
+          <w:tcPr>
+            <w:tcW w:type="dxa" w:w="5235"/>
+            <w:tcBorders>
+              <w:top w:val="single" w:color="A6A6A6" w:sz="4"/>
+              <w:left w:val="single" w:color="A6A6A6" w:sz="4"/>
+              <w:bottom w:val="single" w:color="A6A6A6" w:sz="4"/>
+              <w:right w:val="single" w:color="A6A6A6" w:sz="4"/>
+            </w:tcBorders>
+            <w:tcMar>
+              <w:top w:type="dxa" w:w="80"/>
+              <w:left w:type="dxa" w:w="120"/>
+              <w:bottom w:type="dxa" w:w="80"/>
+              <w:right w:type="dxa" w:w="120"/>
+            </w:tcMar>
+          </w:tcPr>
+          <w:p>
+            <w:r>
+              <w:t xml:space="preserve">Code lives in projectiles-tech-hub/findhousequick, owned by the Projectiles Tech Hub Limited GitHub organisation. Public during the build; production systems will run on private, secure servers.</w:t>
+            </w:r>
+          </w:p>
+        </w:tc>
+        <w:tc>
+          <w:tcPr>
+            <w:tcW w:type="dxa" w:w="1534"/>
+            <w:tcBorders>
+              <w:top w:val="single" w:color="A6A6A6" w:sz="4"/>
+              <w:left w:val="single" w:color="A6A6A6" w:sz="4"/>
+              <w:bottom w:val="single" w:color="A6A6A6" w:sz="4"/>
+              <w:right w:val="single" w:color="A6A6A6" w:sz="4"/>
+            </w:tcBorders>
+            <w:tcMar>
+              <w:top w:type="dxa" w:w="80"/>
+              <w:left w:type="dxa" w:w="120"/>
+              <w:bottom w:type="dxa" w:w="80"/>
+              <w:right w:type="dxa" w:w="120"/>
+            </w:tcMar>
+          </w:tcPr>
+          <w:p>
+            <w:r>
+              <w:t xml:space="preserve">22 Oct 2026</w:t>
+            </w:r>
+          </w:p>
+        </w:tc>
+      </w:tr>
+      <w:tr>
+        <w:tc>
+          <w:tcPr>
+            <w:tcW w:type="dxa" w:w="632"/>
+            <w:tcBorders>
+              <w:top w:val="single" w:color="A6A6A6" w:sz="4"/>
+              <w:left w:val="single" w:color="A6A6A6" w:sz="4"/>
+              <w:bottom w:val="single" w:color="A6A6A6" w:sz="4"/>
+              <w:right w:val="single" w:color="A6A6A6" w:sz="4"/>
+            </w:tcBorders>
+            <w:tcMar>
+              <w:top w:type="dxa" w:w="80"/>
+              <w:left w:type="dxa" w:w="120"/>
+              <w:bottom w:type="dxa" w:w="80"/>
+              <w:right w:type="dxa" w:w="120"/>
+            </w:tcMar>
+          </w:tcPr>
+          <w:p>
+            <w:r>
+              <w:t xml:space="preserve">27</w:t>
+            </w:r>
+          </w:p>
+        </w:tc>
+        <w:tc>
+          <w:tcPr>
+            <w:tcW w:type="dxa" w:w="1625"/>
+            <w:tcBorders>
+              <w:top w:val="single" w:color="A6A6A6" w:sz="4"/>
+              <w:left w:val="single" w:color="A6A6A6" w:sz="4"/>
+              <w:bottom w:val="single" w:color="A6A6A6" w:sz="4"/>
+              <w:right w:val="single" w:color="A6A6A6" w:sz="4"/>
+            </w:tcBorders>
+            <w:tcMar>
+              <w:top w:type="dxa" w:w="80"/>
+              <w:left w:type="dxa" w:w="120"/>
+              <w:bottom w:type="dxa" w:w="80"/>
+              <w:right w:type="dxa" w:w="120"/>
+            </w:tcMar>
+          </w:tcPr>
+          <w:p>
+            <w:r>
+              <w:t xml:space="preserve">Release 0</w:t>
+            </w:r>
+          </w:p>
+        </w:tc>
+        <w:tc>
+          <w:tcPr>
+            <w:tcW w:type="dxa" w:w="5235"/>
+            <w:tcBorders>
+              <w:top w:val="single" w:color="A6A6A6" w:sz="4"/>
+              <w:left w:val="single" w:color="A6A6A6" w:sz="4"/>
+              <w:bottom w:val="single" w:color="A6A6A6" w:sz="4"/>
+              <w:right w:val="single" w:color="A6A6A6" w:sz="4"/>
+            </w:tcBorders>
+            <w:tcMar>
+              <w:top w:type="dxa" w:w="80"/>
+              <w:left w:type="dxa" w:w="120"/>
+              <w:bottom w:type="dxa" w:w="80"/>
+              <w:right w:type="dxa" w:w="120"/>
+            </w:tcMar>
+          </w:tcPr>
+          <w:p>
+            <w:r>
+              <w:t xml:space="preserve">Foundations completed and passing all automatic checks (pull request #1).</w:t>
+            </w:r>
+          </w:p>
+        </w:tc>
+        <w:tc>
+          <w:tcPr>
+            <w:tcW w:type="dxa" w:w="1534"/>
+            <w:tcBorders>
+              <w:top w:val="single" w:color="A6A6A6" w:sz="4"/>
+              <w:left w:val="single" w:color="A6A6A6" w:sz="4"/>
+              <w:bottom w:val="single" w:color="A6A6A6" w:sz="4"/>
+              <w:right w:val="single" w:color="A6A6A6" w:sz="4"/>
+            </w:tcBorders>
+            <w:tcMar>
+              <w:top w:type="dxa" w:w="80"/>
+              <w:left w:type="dxa" w:w="120"/>
+              <w:bottom w:type="dxa" w:w="80"/>
+              <w:right w:type="dxa" w:w="120"/>
+            </w:tcMar>
+          </w:tcPr>
+          <w:p>
+            <w:r>
+              <w:t xml:space="preserve">22 Oct 2026</w:t>
+            </w:r>
+          </w:p>
+        </w:tc>
+      </w:tr>
     </w:tbl>
     <w:p>
       <w:pPr>
@@ -3138,7 +3498,7 @@
           </w:tcPr>
           <w:p>
             <w:r>
-              <w:t xml:space="preserve">Technology choices</w:t>
+              <w:t xml:space="preserve">Budget for development and first 12 to 18 months of running costs</w:t>
             </w:r>
           </w:p>
         </w:tc>
@@ -3160,7 +3520,7 @@
           </w:tcPr>
           <w:p>
             <w:r>
-              <w:t xml:space="preserve">Recommended in the Technical Architecture and Execution Plan; to be confirmed with the technical lead</w:t>
+              <w:t xml:space="preserve">To be prepared</w:t>
             </w:r>
           </w:p>
         </w:tc>
@@ -3206,7 +3566,7 @@
           </w:tcPr>
           <w:p>
             <w:r>
-              <w:t xml:space="preserve">Budget for development and first 12 to 18 months of running costs</w:t>
+              <w:t xml:space="preserve">Hiring of technical lead and team</w:t>
             </w:r>
           </w:p>
         </w:tc>
@@ -3228,7 +3588,7 @@
           </w:tcPr>
           <w:p>
             <w:r>
-              <w:t xml:space="preserve">To be prepared</w:t>
+              <w:t xml:space="preserve">To be started</w:t>
             </w:r>
           </w:p>
         </w:tc>
@@ -3274,7 +3634,7 @@
           </w:tcPr>
           <w:p>
             <w:r>
-              <w:t xml:space="preserve">Hiring of technical lead and team</w:t>
+              <w:t xml:space="preserve">Domain name, trademark and app store name checks for FindHouseQuick</w:t>
             </w:r>
           </w:p>
         </w:tc>
@@ -3296,7 +3656,7 @@
           </w:tcPr>
           <w:p>
             <w:r>
-              <w:t xml:space="preserve">To be started</w:t>
+              <w:t xml:space="preserve">To be done</w:t>
             </w:r>
           </w:p>
         </w:tc>
@@ -3342,7 +3702,7 @@
           </w:tcPr>
           <w:p>
             <w:r>
-              <w:t xml:space="preserve">GitHub account for Projectiles and the FindHouseQuick repository</w:t>
+              <w:t xml:space="preserve">Feature controls: up to 30 seconds for a switch change to reach every server</w:t>
             </w:r>
           </w:p>
         </w:tc>
@@ -3364,7 +3724,7 @@
           </w:tcPr>
           <w:p>
             <w:r>
-              <w:t xml:space="preserve">To be created and connected</w:t>
+              <w:t xml:space="preserve">To be confirmed (ADR 0002)</w:t>
             </w:r>
           </w:p>
         </w:tc>
@@ -3410,7 +3770,7 @@
           </w:tcPr>
           <w:p>
             <w:r>
-              <w:t xml:space="preserve">Domain name, trademark and app store name checks for FindHouseQuick</w:t>
+              <w:t xml:space="preserve">Feature controls: country managers may change non-critical switches in their own countries without a second approval</w:t>
             </w:r>
           </w:p>
         </w:tc>
@@ -3432,7 +3792,75 @@
           </w:tcPr>
           <w:p>
             <w:r>
-              <w:t xml:space="preserve">To be done</w:t>
+              <w:t xml:space="preserve">To be confirmed (ADR 0002)</w:t>
+            </w:r>
+          </w:p>
+        </w:tc>
+      </w:tr>
+      <w:tr>
+        <w:tc>
+          <w:tcPr>
+            <w:tcW w:type="dxa" w:w="632"/>
+            <w:tcBorders>
+              <w:top w:val="single" w:color="A6A6A6" w:sz="4"/>
+              <w:left w:val="single" w:color="A6A6A6" w:sz="4"/>
+              <w:bottom w:val="single" w:color="A6A6A6" w:sz="4"/>
+              <w:right w:val="single" w:color="A6A6A6" w:sz="4"/>
+            </w:tcBorders>
+            <w:tcMar>
+              <w:top w:type="dxa" w:w="80"/>
+              <w:left w:type="dxa" w:w="120"/>
+              <w:bottom w:type="dxa" w:w="80"/>
+              <w:right w:type="dxa" w:w="120"/>
+            </w:tcMar>
+          </w:tcPr>
+          <w:p>
+            <w:r>
+              <w:t xml:space="preserve">15</w:t>
+            </w:r>
+          </w:p>
+        </w:tc>
+        <w:tc>
+          <w:tcPr>
+            <w:tcW w:type="dxa" w:w="4784"/>
+            <w:tcBorders>
+              <w:top w:val="single" w:color="A6A6A6" w:sz="4"/>
+              <w:left w:val="single" w:color="A6A6A6" w:sz="4"/>
+              <w:bottom w:val="single" w:color="A6A6A6" w:sz="4"/>
+              <w:right w:val="single" w:color="A6A6A6" w:sz="4"/>
+            </w:tcBorders>
+            <w:tcMar>
+              <w:top w:type="dxa" w:w="80"/>
+              <w:left w:type="dxa" w:w="120"/>
+              <w:bottom w:type="dxa" w:w="80"/>
+              <w:right w:type="dxa" w:w="120"/>
+            </w:tcMar>
+          </w:tcPr>
+          <w:p>
+            <w:r>
+              <w:t xml:space="preserve">Whether to make the code repository private again before launch</w:t>
+            </w:r>
+          </w:p>
+        </w:tc>
+        <w:tc>
+          <w:tcPr>
+            <w:tcW w:type="dxa" w:w="3610"/>
+            <w:tcBorders>
+              <w:top w:val="single" w:color="A6A6A6" w:sz="4"/>
+              <w:left w:val="single" w:color="A6A6A6" w:sz="4"/>
+              <w:bottom w:val="single" w:color="A6A6A6" w:sz="4"/>
+              <w:right w:val="single" w:color="A6A6A6" w:sz="4"/>
+            </w:tcBorders>
+            <w:tcMar>
+              <w:top w:type="dxa" w:w="80"/>
+              <w:left w:type="dxa" w:w="120"/>
+              <w:bottom w:type="dxa" w:w="80"/>
+              <w:right w:type="dxa" w:w="120"/>
+            </w:tcMar>
+          </w:tcPr>
+          <w:p>
+            <w:r>
+              <w:t xml:space="preserve">To be decided</w:t>
             </w:r>
           </w:p>
         </w:tc>
@@ -3616,6 +4044,52 @@
           <w:p>
             <w:r>
               <w:t xml:space="preserve">1.0, 22 October 2026</w:t>
+            </w:r>
+          </w:p>
+        </w:tc>
+      </w:tr>
+      <w:tr>
+        <w:tc>
+          <w:tcPr>
+            <w:tcW w:type="dxa" w:w="6318"/>
+            <w:tcBorders>
+              <w:top w:val="single" w:color="A6A6A6" w:sz="4"/>
+              <w:left w:val="single" w:color="A6A6A6" w:sz="4"/>
+              <w:bottom w:val="single" w:color="A6A6A6" w:sz="4"/>
+              <w:right w:val="single" w:color="A6A6A6" w:sz="4"/>
+            </w:tcBorders>
+            <w:tcMar>
+              <w:top w:type="dxa" w:w="80"/>
+              <w:left w:type="dxa" w:w="120"/>
+              <w:bottom w:type="dxa" w:w="80"/>
+              <w:right w:type="dxa" w:w="120"/>
+            </w:tcMar>
+          </w:tcPr>
+          <w:p>
+            <w:r>
+              <w:t xml:space="preserve">Project status (in the code repository)</w:t>
+            </w:r>
+          </w:p>
+        </w:tc>
+        <w:tc>
+          <w:tcPr>
+            <w:tcW w:type="dxa" w:w="2708"/>
+            <w:tcBorders>
+              <w:top w:val="single" w:color="A6A6A6" w:sz="4"/>
+              <w:left w:val="single" w:color="A6A6A6" w:sz="4"/>
+              <w:bottom w:val="single" w:color="A6A6A6" w:sz="4"/>
+              <w:right w:val="single" w:color="A6A6A6" w:sz="4"/>
+            </w:tcBorders>
+            <w:tcMar>
+              <w:top w:type="dxa" w:w="80"/>
+              <w:left w:type="dxa" w:w="120"/>
+              <w:bottom w:type="dxa" w:w="80"/>
+              <w:right w:type="dxa" w:w="120"/>
+            </w:tcMar>
+          </w:tcPr>
+          <w:p>
+            <w:r>
+              <w:t xml:space="preserve">docs/STATUS.md</w:t>
             </w:r>
           </w:p>
         </w:tc>

</xml_diff>

<commit_message>
Record decisions 28 to 30: feature controls confirmed with change; staff two-step login; staff accounts
ADR 0002 accepted with Emmanuel's change (country managers need a super admin's
approval for everything except switching off). ADR 0005 sets out staff accounts
and two-step login.

Co-Authored-By: Claude Opus 5.5 <noreply@anthropic.com>
Claude-Session: https://claude.ai/code/session_01LvvfiTEfqhn9xLA45B6EdW
</commit_message>
<xml_diff>
--- a/docs/specs/FindHouseQuick_Decisions_Log.docx
+++ b/docs/specs/FindHouseQuick_Decisions_Log.docx
@@ -2725,6 +2725,276 @@
           </w:p>
         </w:tc>
       </w:tr>
+      <w:tr>
+        <w:tc>
+          <w:tcPr>
+            <w:tcW w:type="dxa" w:w="632"/>
+            <w:tcBorders>
+              <w:top w:val="single" w:color="A6A6A6" w:sz="4"/>
+              <w:left w:val="single" w:color="A6A6A6" w:sz="4"/>
+              <w:bottom w:val="single" w:color="A6A6A6" w:sz="4"/>
+              <w:right w:val="single" w:color="A6A6A6" w:sz="4"/>
+            </w:tcBorders>
+            <w:tcMar>
+              <w:top w:type="dxa" w:w="80"/>
+              <w:left w:type="dxa" w:w="120"/>
+              <w:bottom w:type="dxa" w:w="80"/>
+              <w:right w:type="dxa" w:w="120"/>
+            </w:tcMar>
+          </w:tcPr>
+          <w:p>
+            <w:r>
+              <w:t xml:space="preserve">28</w:t>
+            </w:r>
+          </w:p>
+        </w:tc>
+        <w:tc>
+          <w:tcPr>
+            <w:tcW w:type="dxa" w:w="1625"/>
+            <w:tcBorders>
+              <w:top w:val="single" w:color="A6A6A6" w:sz="4"/>
+              <w:left w:val="single" w:color="A6A6A6" w:sz="4"/>
+              <w:bottom w:val="single" w:color="A6A6A6" w:sz="4"/>
+              <w:right w:val="single" w:color="A6A6A6" w:sz="4"/>
+            </w:tcBorders>
+            <w:tcMar>
+              <w:top w:type="dxa" w:w="80"/>
+              <w:left w:type="dxa" w:w="120"/>
+              <w:bottom w:type="dxa" w:w="80"/>
+              <w:right w:type="dxa" w:w="120"/>
+            </w:tcMar>
+          </w:tcPr>
+          <w:p>
+            <w:r>
+              <w:t xml:space="preserve">Feature controls</w:t>
+            </w:r>
+          </w:p>
+        </w:tc>
+        <w:tc>
+          <w:tcPr>
+            <w:tcW w:type="dxa" w:w="5235"/>
+            <w:tcBorders>
+              <w:top w:val="single" w:color="A6A6A6" w:sz="4"/>
+              <w:left w:val="single" w:color="A6A6A6" w:sz="4"/>
+              <w:bottom w:val="single" w:color="A6A6A6" w:sz="4"/>
+              <w:right w:val="single" w:color="A6A6A6" w:sz="4"/>
+            </w:tcBorders>
+            <w:tcMar>
+              <w:top w:type="dxa" w:w="80"/>
+              <w:left w:type="dxa" w:w="120"/>
+              <w:bottom w:type="dxa" w:w="80"/>
+              <w:right w:type="dxa" w:w="120"/>
+            </w:tcMar>
+          </w:tcPr>
+          <w:p>
+            <w:r>
+              <w:t xml:space="preserve">ADR 0002 confirmed: a switch change reaches every server within 30 seconds. Country managers may switch features off or pause them in their own countries at once; every other change they make (switching on, scheduling, gradual release, withdrawing a rule) needs a super admin’s approval. Switching a critical feature on always needs a second person, one of them a super admin.</w:t>
+            </w:r>
+          </w:p>
+        </w:tc>
+        <w:tc>
+          <w:tcPr>
+            <w:tcW w:type="dxa" w:w="1534"/>
+            <w:tcBorders>
+              <w:top w:val="single" w:color="A6A6A6" w:sz="4"/>
+              <w:left w:val="single" w:color="A6A6A6" w:sz="4"/>
+              <w:bottom w:val="single" w:color="A6A6A6" w:sz="4"/>
+              <w:right w:val="single" w:color="A6A6A6" w:sz="4"/>
+            </w:tcBorders>
+            <w:tcMar>
+              <w:top w:type="dxa" w:w="80"/>
+              <w:left w:type="dxa" w:w="120"/>
+              <w:bottom w:type="dxa" w:w="80"/>
+              <w:right w:type="dxa" w:w="120"/>
+            </w:tcMar>
+          </w:tcPr>
+          <w:p>
+            <w:r>
+              <w:t xml:space="preserve">22 Oct 2026</w:t>
+            </w:r>
+          </w:p>
+        </w:tc>
+      </w:tr>
+      <w:tr>
+        <w:tc>
+          <w:tcPr>
+            <w:tcW w:type="dxa" w:w="632"/>
+            <w:tcBorders>
+              <w:top w:val="single" w:color="A6A6A6" w:sz="4"/>
+              <w:left w:val="single" w:color="A6A6A6" w:sz="4"/>
+              <w:bottom w:val="single" w:color="A6A6A6" w:sz="4"/>
+              <w:right w:val="single" w:color="A6A6A6" w:sz="4"/>
+            </w:tcBorders>
+            <w:tcMar>
+              <w:top w:type="dxa" w:w="80"/>
+              <w:left w:type="dxa" w:w="120"/>
+              <w:bottom w:type="dxa" w:w="80"/>
+              <w:right w:type="dxa" w:w="120"/>
+            </w:tcMar>
+          </w:tcPr>
+          <w:p>
+            <w:r>
+              <w:t xml:space="preserve">29</w:t>
+            </w:r>
+          </w:p>
+        </w:tc>
+        <w:tc>
+          <w:tcPr>
+            <w:tcW w:type="dxa" w:w="1625"/>
+            <w:tcBorders>
+              <w:top w:val="single" w:color="A6A6A6" w:sz="4"/>
+              <w:left w:val="single" w:color="A6A6A6" w:sz="4"/>
+              <w:bottom w:val="single" w:color="A6A6A6" w:sz="4"/>
+              <w:right w:val="single" w:color="A6A6A6" w:sz="4"/>
+            </w:tcBorders>
+            <w:tcMar>
+              <w:top w:type="dxa" w:w="80"/>
+              <w:left w:type="dxa" w:w="120"/>
+              <w:bottom w:type="dxa" w:w="80"/>
+              <w:right w:type="dxa" w:w="120"/>
+            </w:tcMar>
+          </w:tcPr>
+          <w:p>
+            <w:r>
+              <w:t xml:space="preserve">Staff two-step login</w:t>
+            </w:r>
+          </w:p>
+        </w:tc>
+        <w:tc>
+          <w:tcPr>
+            <w:tcW w:type="dxa" w:w="5235"/>
+            <w:tcBorders>
+              <w:top w:val="single" w:color="A6A6A6" w:sz="4"/>
+              <w:left w:val="single" w:color="A6A6A6" w:sz="4"/>
+              <w:bottom w:val="single" w:color="A6A6A6" w:sz="4"/>
+              <w:right w:val="single" w:color="A6A6A6" w:sz="4"/>
+            </w:tcBorders>
+            <w:tcMar>
+              <w:top w:type="dxa" w:w="80"/>
+              <w:left w:type="dxa" w:w="120"/>
+              <w:bottom w:type="dxa" w:w="80"/>
+              <w:right w:type="dxa" w:w="120"/>
+            </w:tcMar>
+          </w:tcPr>
+          <w:p>
+            <w:r>
+              <w:t xml:space="preserve">Staff sign in with two steps. The second step can be either an SMS code or a code from an authenticator app; both are built.</w:t>
+            </w:r>
+          </w:p>
+        </w:tc>
+        <w:tc>
+          <w:tcPr>
+            <w:tcW w:type="dxa" w:w="1534"/>
+            <w:tcBorders>
+              <w:top w:val="single" w:color="A6A6A6" w:sz="4"/>
+              <w:left w:val="single" w:color="A6A6A6" w:sz="4"/>
+              <w:bottom w:val="single" w:color="A6A6A6" w:sz="4"/>
+              <w:right w:val="single" w:color="A6A6A6" w:sz="4"/>
+            </w:tcBorders>
+            <w:tcMar>
+              <w:top w:type="dxa" w:w="80"/>
+              <w:left w:type="dxa" w:w="120"/>
+              <w:bottom w:type="dxa" w:w="80"/>
+              <w:right w:type="dxa" w:w="120"/>
+            </w:tcMar>
+          </w:tcPr>
+          <w:p>
+            <w:r>
+              <w:t xml:space="preserve">22 Oct 2026</w:t>
+            </w:r>
+          </w:p>
+        </w:tc>
+      </w:tr>
+      <w:tr>
+        <w:tc>
+          <w:tcPr>
+            <w:tcW w:type="dxa" w:w="632"/>
+            <w:tcBorders>
+              <w:top w:val="single" w:color="A6A6A6" w:sz="4"/>
+              <w:left w:val="single" w:color="A6A6A6" w:sz="4"/>
+              <w:bottom w:val="single" w:color="A6A6A6" w:sz="4"/>
+              <w:right w:val="single" w:color="A6A6A6" w:sz="4"/>
+            </w:tcBorders>
+            <w:tcMar>
+              <w:top w:type="dxa" w:w="80"/>
+              <w:left w:type="dxa" w:w="120"/>
+              <w:bottom w:type="dxa" w:w="80"/>
+              <w:right w:type="dxa" w:w="120"/>
+            </w:tcMar>
+          </w:tcPr>
+          <w:p>
+            <w:r>
+              <w:t xml:space="preserve">30</w:t>
+            </w:r>
+          </w:p>
+        </w:tc>
+        <w:tc>
+          <w:tcPr>
+            <w:tcW w:type="dxa" w:w="1625"/>
+            <w:tcBorders>
+              <w:top w:val="single" w:color="A6A6A6" w:sz="4"/>
+              <w:left w:val="single" w:color="A6A6A6" w:sz="4"/>
+              <w:bottom w:val="single" w:color="A6A6A6" w:sz="4"/>
+              <w:right w:val="single" w:color="A6A6A6" w:sz="4"/>
+            </w:tcBorders>
+            <w:tcMar>
+              <w:top w:type="dxa" w:w="80"/>
+              <w:left w:type="dxa" w:w="120"/>
+              <w:bottom w:type="dxa" w:w="80"/>
+              <w:right w:type="dxa" w:w="120"/>
+            </w:tcMar>
+          </w:tcPr>
+          <w:p>
+            <w:r>
+              <w:t xml:space="preserve">Staff accounts</w:t>
+            </w:r>
+          </w:p>
+        </w:tc>
+        <w:tc>
+          <w:tcPr>
+            <w:tcW w:type="dxa" w:w="5235"/>
+            <w:tcBorders>
+              <w:top w:val="single" w:color="A6A6A6" w:sz="4"/>
+              <w:left w:val="single" w:color="A6A6A6" w:sz="4"/>
+              <w:bottom w:val="single" w:color="A6A6A6" w:sz="4"/>
+              <w:right w:val="single" w:color="A6A6A6" w:sz="4"/>
+            </w:tcBorders>
+            <w:tcMar>
+              <w:top w:type="dxa" w:w="80"/>
+              <w:left w:type="dxa" w:w="120"/>
+              <w:bottom w:type="dxa" w:w="80"/>
+              <w:right w:type="dxa" w:w="120"/>
+            </w:tcMar>
+          </w:tcPr>
+          <w:p>
+            <w:r>
+              <w:t xml:space="preserve">Super admins add staff, set their roles and countries, and deactivate them through the admin endpoints, with every change recorded. The first super admin is created with a one-time server command.</w:t>
+            </w:r>
+          </w:p>
+        </w:tc>
+        <w:tc>
+          <w:tcPr>
+            <w:tcW w:type="dxa" w:w="1534"/>
+            <w:tcBorders>
+              <w:top w:val="single" w:color="A6A6A6" w:sz="4"/>
+              <w:left w:val="single" w:color="A6A6A6" w:sz="4"/>
+              <w:bottom w:val="single" w:color="A6A6A6" w:sz="4"/>
+              <w:right w:val="single" w:color="A6A6A6" w:sz="4"/>
+            </w:tcBorders>
+            <w:tcMar>
+              <w:top w:type="dxa" w:w="80"/>
+              <w:left w:type="dxa" w:w="120"/>
+              <w:bottom w:type="dxa" w:w="80"/>
+              <w:right w:type="dxa" w:w="120"/>
+            </w:tcMar>
+          </w:tcPr>
+          <w:p>
+            <w:r>
+              <w:t xml:space="preserve">22 Oct 2026</w:t>
+            </w:r>
+          </w:p>
+        </w:tc>
+      </w:tr>
     </w:tbl>
     <w:p>
       <w:pPr>
@@ -3681,142 +3951,6 @@
           <w:p>
             <w:r>
               <w:t xml:space="preserve">13</w:t>
-            </w:r>
-          </w:p>
-        </w:tc>
-        <w:tc>
-          <w:tcPr>
-            <w:tcW w:type="dxa" w:w="4784"/>
-            <w:tcBorders>
-              <w:top w:val="single" w:color="A6A6A6" w:sz="4"/>
-              <w:left w:val="single" w:color="A6A6A6" w:sz="4"/>
-              <w:bottom w:val="single" w:color="A6A6A6" w:sz="4"/>
-              <w:right w:val="single" w:color="A6A6A6" w:sz="4"/>
-            </w:tcBorders>
-            <w:tcMar>
-              <w:top w:type="dxa" w:w="80"/>
-              <w:left w:type="dxa" w:w="120"/>
-              <w:bottom w:type="dxa" w:w="80"/>
-              <w:right w:type="dxa" w:w="120"/>
-            </w:tcMar>
-          </w:tcPr>
-          <w:p>
-            <w:r>
-              <w:t xml:space="preserve">Feature controls: up to 30 seconds for a switch change to reach every server</w:t>
-            </w:r>
-          </w:p>
-        </w:tc>
-        <w:tc>
-          <w:tcPr>
-            <w:tcW w:type="dxa" w:w="3610"/>
-            <w:tcBorders>
-              <w:top w:val="single" w:color="A6A6A6" w:sz="4"/>
-              <w:left w:val="single" w:color="A6A6A6" w:sz="4"/>
-              <w:bottom w:val="single" w:color="A6A6A6" w:sz="4"/>
-              <w:right w:val="single" w:color="A6A6A6" w:sz="4"/>
-            </w:tcBorders>
-            <w:tcMar>
-              <w:top w:type="dxa" w:w="80"/>
-              <w:left w:type="dxa" w:w="120"/>
-              <w:bottom w:type="dxa" w:w="80"/>
-              <w:right w:type="dxa" w:w="120"/>
-            </w:tcMar>
-          </w:tcPr>
-          <w:p>
-            <w:r>
-              <w:t xml:space="preserve">To be confirmed (ADR 0002)</w:t>
-            </w:r>
-          </w:p>
-        </w:tc>
-      </w:tr>
-      <w:tr>
-        <w:tc>
-          <w:tcPr>
-            <w:tcW w:type="dxa" w:w="632"/>
-            <w:tcBorders>
-              <w:top w:val="single" w:color="A6A6A6" w:sz="4"/>
-              <w:left w:val="single" w:color="A6A6A6" w:sz="4"/>
-              <w:bottom w:val="single" w:color="A6A6A6" w:sz="4"/>
-              <w:right w:val="single" w:color="A6A6A6" w:sz="4"/>
-            </w:tcBorders>
-            <w:tcMar>
-              <w:top w:type="dxa" w:w="80"/>
-              <w:left w:type="dxa" w:w="120"/>
-              <w:bottom w:type="dxa" w:w="80"/>
-              <w:right w:type="dxa" w:w="120"/>
-            </w:tcMar>
-          </w:tcPr>
-          <w:p>
-            <w:r>
-              <w:t xml:space="preserve">14</w:t>
-            </w:r>
-          </w:p>
-        </w:tc>
-        <w:tc>
-          <w:tcPr>
-            <w:tcW w:type="dxa" w:w="4784"/>
-            <w:tcBorders>
-              <w:top w:val="single" w:color="A6A6A6" w:sz="4"/>
-              <w:left w:val="single" w:color="A6A6A6" w:sz="4"/>
-              <w:bottom w:val="single" w:color="A6A6A6" w:sz="4"/>
-              <w:right w:val="single" w:color="A6A6A6" w:sz="4"/>
-            </w:tcBorders>
-            <w:tcMar>
-              <w:top w:type="dxa" w:w="80"/>
-              <w:left w:type="dxa" w:w="120"/>
-              <w:bottom w:type="dxa" w:w="80"/>
-              <w:right w:type="dxa" w:w="120"/>
-            </w:tcMar>
-          </w:tcPr>
-          <w:p>
-            <w:r>
-              <w:t xml:space="preserve">Feature controls: country managers may change non-critical switches in their own countries without a second approval</w:t>
-            </w:r>
-          </w:p>
-        </w:tc>
-        <w:tc>
-          <w:tcPr>
-            <w:tcW w:type="dxa" w:w="3610"/>
-            <w:tcBorders>
-              <w:top w:val="single" w:color="A6A6A6" w:sz="4"/>
-              <w:left w:val="single" w:color="A6A6A6" w:sz="4"/>
-              <w:bottom w:val="single" w:color="A6A6A6" w:sz="4"/>
-              <w:right w:val="single" w:color="A6A6A6" w:sz="4"/>
-            </w:tcBorders>
-            <w:tcMar>
-              <w:top w:type="dxa" w:w="80"/>
-              <w:left w:type="dxa" w:w="120"/>
-              <w:bottom w:type="dxa" w:w="80"/>
-              <w:right w:type="dxa" w:w="120"/>
-            </w:tcMar>
-          </w:tcPr>
-          <w:p>
-            <w:r>
-              <w:t xml:space="preserve">To be confirmed (ADR 0002)</w:t>
-            </w:r>
-          </w:p>
-        </w:tc>
-      </w:tr>
-      <w:tr>
-        <w:tc>
-          <w:tcPr>
-            <w:tcW w:type="dxa" w:w="632"/>
-            <w:tcBorders>
-              <w:top w:val="single" w:color="A6A6A6" w:sz="4"/>
-              <w:left w:val="single" w:color="A6A6A6" w:sz="4"/>
-              <w:bottom w:val="single" w:color="A6A6A6" w:sz="4"/>
-              <w:right w:val="single" w:color="A6A6A6" w:sz="4"/>
-            </w:tcBorders>
-            <w:tcMar>
-              <w:top w:type="dxa" w:w="80"/>
-              <w:left w:type="dxa" w:w="120"/>
-              <w:bottom w:type="dxa" w:w="80"/>
-              <w:right w:type="dxa" w:w="120"/>
-            </w:tcMar>
-          </w:tcPr>
-          <w:p>
-            <w:r>
-              <w:t xml:space="preserve">15</w:t>
             </w:r>
           </w:p>
         </w:tc>

</xml_diff>

<commit_message>
Record decisions 31 to 34: second-step pause, 3-hour staff second step, switch-off reading, different factors
Decisions Log (Word and text copies), ADR 0005 and status updated before any
code that depends on them.

Co-Authored-By: Claude Opus 5.5 <noreply@anthropic.com>
Claude-Session: https://claude.ai/code/session_01LvvfiTEfqhn9xLA45B6EdW
</commit_message>
<xml_diff>
--- a/docs/specs/FindHouseQuick_Decisions_Log.docx
+++ b/docs/specs/FindHouseQuick_Decisions_Log.docx
@@ -2991,6 +2991,366 @@
           <w:p>
             <w:r>
               <w:t xml:space="preserve">22 Oct 2026</w:t>
+            </w:r>
+          </w:p>
+        </w:tc>
+      </w:tr>
+      <w:tr>
+        <w:tc>
+          <w:tcPr>
+            <w:tcW w:type="dxa" w:w="632"/>
+            <w:tcBorders>
+              <w:top w:val="single" w:color="A6A6A6" w:sz="4"/>
+              <w:left w:val="single" w:color="A6A6A6" w:sz="4"/>
+              <w:bottom w:val="single" w:color="A6A6A6" w:sz="4"/>
+              <w:right w:val="single" w:color="A6A6A6" w:sz="4"/>
+            </w:tcBorders>
+            <w:tcMar>
+              <w:top w:type="dxa" w:w="80"/>
+              <w:left w:type="dxa" w:w="120"/>
+              <w:bottom w:type="dxa" w:w="80"/>
+              <w:right w:type="dxa" w:w="120"/>
+            </w:tcMar>
+          </w:tcPr>
+          <w:p>
+            <w:r>
+              <w:t>31</w:t>
+            </w:r>
+          </w:p>
+        </w:tc>
+        <w:tc>
+          <w:tcPr>
+            <w:tcW w:type="dxa" w:w="1625"/>
+            <w:tcBorders>
+              <w:top w:val="single" w:color="A6A6A6" w:sz="4"/>
+              <w:left w:val="single" w:color="A6A6A6" w:sz="4"/>
+              <w:bottom w:val="single" w:color="A6A6A6" w:sz="4"/>
+              <w:right w:val="single" w:color="A6A6A6" w:sz="4"/>
+            </w:tcBorders>
+            <w:tcMar>
+              <w:top w:type="dxa" w:w="80"/>
+              <w:left w:type="dxa" w:w="120"/>
+              <w:bottom w:type="dxa" w:w="80"/>
+              <w:right w:type="dxa" w:w="120"/>
+            </w:tcMar>
+          </w:tcPr>
+          <w:p>
+            <w:r>
+              <w:t>Staff two-step login</w:t>
+            </w:r>
+          </w:p>
+        </w:tc>
+        <w:tc>
+          <w:tcPr>
+            <w:tcW w:type="dxa" w:w="5235"/>
+            <w:tcBorders>
+              <w:top w:val="single" w:color="A6A6A6" w:sz="4"/>
+              <w:left w:val="single" w:color="A6A6A6" w:sz="4"/>
+              <w:bottom w:val="single" w:color="A6A6A6" w:sz="4"/>
+              <w:right w:val="single" w:color="A6A6A6" w:sz="4"/>
+            </w:tcBorders>
+            <w:tcMar>
+              <w:top w:type="dxa" w:w="80"/>
+              <w:left w:type="dxa" w:w="120"/>
+              <w:bottom w:type="dxa" w:w="80"/>
+              <w:right w:type="dxa" w:w="120"/>
+            </w:tcMar>
+          </w:tcPr>
+          <w:p>
+            <w:r>
+              <w:t>ADR 0005 details confirmed: after 5 wrong second-step codes, the second step pauses for 15 minutes for that staff member. Two-step login for ordinary users is left for a later step.</w:t>
+            </w:r>
+          </w:p>
+        </w:tc>
+        <w:tc>
+          <w:tcPr>
+            <w:tcW w:type="dxa" w:w="1534"/>
+            <w:tcBorders>
+              <w:top w:val="single" w:color="A6A6A6" w:sz="4"/>
+              <w:left w:val="single" w:color="A6A6A6" w:sz="4"/>
+              <w:bottom w:val="single" w:color="A6A6A6" w:sz="4"/>
+              <w:right w:val="single" w:color="A6A6A6" w:sz="4"/>
+            </w:tcBorders>
+            <w:tcMar>
+              <w:top w:type="dxa" w:w="80"/>
+              <w:left w:type="dxa" w:w="120"/>
+              <w:bottom w:type="dxa" w:w="80"/>
+              <w:right w:type="dxa" w:w="120"/>
+            </w:tcMar>
+          </w:tcPr>
+          <w:p>
+            <w:r>
+              <w:t>22 Oct 2026</w:t>
+            </w:r>
+          </w:p>
+        </w:tc>
+      </w:tr>
+      <w:tr>
+        <w:tc>
+          <w:tcPr>
+            <w:tcW w:type="dxa" w:w="632"/>
+            <w:tcBorders>
+              <w:top w:val="single" w:color="A6A6A6" w:sz="4"/>
+              <w:left w:val="single" w:color="A6A6A6" w:sz="4"/>
+              <w:bottom w:val="single" w:color="A6A6A6" w:sz="4"/>
+              <w:right w:val="single" w:color="A6A6A6" w:sz="4"/>
+            </w:tcBorders>
+            <w:tcMar>
+              <w:top w:type="dxa" w:w="80"/>
+              <w:left w:type="dxa" w:w="120"/>
+              <w:bottom w:type="dxa" w:w="80"/>
+              <w:right w:type="dxa" w:w="120"/>
+            </w:tcMar>
+          </w:tcPr>
+          <w:p>
+            <w:r>
+              <w:t>32</w:t>
+            </w:r>
+          </w:p>
+        </w:tc>
+        <w:tc>
+          <w:tcPr>
+            <w:tcW w:type="dxa" w:w="1625"/>
+            <w:tcBorders>
+              <w:top w:val="single" w:color="A6A6A6" w:sz="4"/>
+              <w:left w:val="single" w:color="A6A6A6" w:sz="4"/>
+              <w:bottom w:val="single" w:color="A6A6A6" w:sz="4"/>
+              <w:right w:val="single" w:color="A6A6A6" w:sz="4"/>
+            </w:tcBorders>
+            <w:tcMar>
+              <w:top w:type="dxa" w:w="80"/>
+              <w:left w:type="dxa" w:w="120"/>
+              <w:bottom w:type="dxa" w:w="80"/>
+              <w:right w:type="dxa" w:w="120"/>
+            </w:tcMar>
+          </w:tcPr>
+          <w:p>
+            <w:r>
+              <w:t>Staff two-step login</w:t>
+            </w:r>
+          </w:p>
+        </w:tc>
+        <w:tc>
+          <w:tcPr>
+            <w:tcW w:type="dxa" w:w="5235"/>
+            <w:tcBorders>
+              <w:top w:val="single" w:color="A6A6A6" w:sz="4"/>
+              <w:left w:val="single" w:color="A6A6A6" w:sz="4"/>
+              <w:bottom w:val="single" w:color="A6A6A6" w:sz="4"/>
+              <w:right w:val="single" w:color="A6A6A6" w:sz="4"/>
+            </w:tcBorders>
+            <w:tcMar>
+              <w:top w:type="dxa" w:w="80"/>
+              <w:left w:type="dxa" w:w="120"/>
+              <w:bottom w:type="dxa" w:w="80"/>
+              <w:right w:type="dxa" w:w="120"/>
+            </w:tcMar>
+          </w:tcPr>
+          <w:p>
+            <w:r>
+              <w:t>The staff second step lasts 3 hours, then must be done again. The period is a platform setting that super admins can change through the admin endpoints, with every change recorded.</w:t>
+            </w:r>
+          </w:p>
+        </w:tc>
+        <w:tc>
+          <w:tcPr>
+            <w:tcW w:type="dxa" w:w="1534"/>
+            <w:tcBorders>
+              <w:top w:val="single" w:color="A6A6A6" w:sz="4"/>
+              <w:left w:val="single" w:color="A6A6A6" w:sz="4"/>
+              <w:bottom w:val="single" w:color="A6A6A6" w:sz="4"/>
+              <w:right w:val="single" w:color="A6A6A6" w:sz="4"/>
+            </w:tcBorders>
+            <w:tcMar>
+              <w:top w:type="dxa" w:w="80"/>
+              <w:left w:type="dxa" w:w="120"/>
+              <w:bottom w:type="dxa" w:w="80"/>
+              <w:right w:type="dxa" w:w="120"/>
+            </w:tcMar>
+          </w:tcPr>
+          <w:p>
+            <w:r>
+              <w:t>22 Oct 2026</w:t>
+            </w:r>
+          </w:p>
+        </w:tc>
+      </w:tr>
+      <w:tr>
+        <w:tc>
+          <w:tcPr>
+            <w:tcW w:type="dxa" w:w="632"/>
+            <w:tcBorders>
+              <w:top w:val="single" w:color="A6A6A6" w:sz="4"/>
+              <w:left w:val="single" w:color="A6A6A6" w:sz="4"/>
+              <w:bottom w:val="single" w:color="A6A6A6" w:sz="4"/>
+              <w:right w:val="single" w:color="A6A6A6" w:sz="4"/>
+            </w:tcBorders>
+            <w:tcMar>
+              <w:top w:type="dxa" w:w="80"/>
+              <w:left w:type="dxa" w:w="120"/>
+              <w:bottom w:type="dxa" w:w="80"/>
+              <w:right w:type="dxa" w:w="120"/>
+            </w:tcMar>
+          </w:tcPr>
+          <w:p>
+            <w:r>
+              <w:t>33</w:t>
+            </w:r>
+          </w:p>
+        </w:tc>
+        <w:tc>
+          <w:tcPr>
+            <w:tcW w:type="dxa" w:w="1625"/>
+            <w:tcBorders>
+              <w:top w:val="single" w:color="A6A6A6" w:sz="4"/>
+              <w:left w:val="single" w:color="A6A6A6" w:sz="4"/>
+              <w:bottom w:val="single" w:color="A6A6A6" w:sz="4"/>
+              <w:right w:val="single" w:color="A6A6A6" w:sz="4"/>
+            </w:tcBorders>
+            <w:tcMar>
+              <w:top w:type="dxa" w:w="80"/>
+              <w:left w:type="dxa" w:w="120"/>
+              <w:bottom w:type="dxa" w:w="80"/>
+              <w:right w:type="dxa" w:w="120"/>
+            </w:tcMar>
+          </w:tcPr>
+          <w:p>
+            <w:r>
+              <w:t>Feature controls</w:t>
+            </w:r>
+          </w:p>
+        </w:tc>
+        <w:tc>
+          <w:tcPr>
+            <w:tcW w:type="dxa" w:w="5235"/>
+            <w:tcBorders>
+              <w:top w:val="single" w:color="A6A6A6" w:sz="4"/>
+              <w:left w:val="single" w:color="A6A6A6" w:sz="4"/>
+              <w:bottom w:val="single" w:color="A6A6A6" w:sz="4"/>
+              <w:right w:val="single" w:color="A6A6A6" w:sz="4"/>
+            </w:tcBorders>
+            <w:tcMar>
+              <w:top w:type="dxa" w:w="80"/>
+              <w:left w:type="dxa" w:w="120"/>
+              <w:bottom w:type="dxa" w:w="80"/>
+              <w:right w:type="dxa" w:w="120"/>
+            </w:tcMar>
+          </w:tcPr>
+          <w:p>
+            <w:r>
+              <w:t>"Switching off at once" (decision 28) means an off rule with no start time, end time or percentage. An off rule with a start or end time made by a country manager waits for a super admin.</w:t>
+            </w:r>
+          </w:p>
+        </w:tc>
+        <w:tc>
+          <w:tcPr>
+            <w:tcW w:type="dxa" w:w="1534"/>
+            <w:tcBorders>
+              <w:top w:val="single" w:color="A6A6A6" w:sz="4"/>
+              <w:left w:val="single" w:color="A6A6A6" w:sz="4"/>
+              <w:bottom w:val="single" w:color="A6A6A6" w:sz="4"/>
+              <w:right w:val="single" w:color="A6A6A6" w:sz="4"/>
+            </w:tcBorders>
+            <w:tcMar>
+              <w:top w:type="dxa" w:w="80"/>
+              <w:left w:type="dxa" w:w="120"/>
+              <w:bottom w:type="dxa" w:w="80"/>
+              <w:right w:type="dxa" w:w="120"/>
+            </w:tcMar>
+          </w:tcPr>
+          <w:p>
+            <w:r>
+              <w:t>22 Oct 2026</w:t>
+            </w:r>
+          </w:p>
+        </w:tc>
+      </w:tr>
+      <w:tr>
+        <w:tc>
+          <w:tcPr>
+            <w:tcW w:type="dxa" w:w="632"/>
+            <w:tcBorders>
+              <w:top w:val="single" w:color="A6A6A6" w:sz="4"/>
+              <w:left w:val="single" w:color="A6A6A6" w:sz="4"/>
+              <w:bottom w:val="single" w:color="A6A6A6" w:sz="4"/>
+              <w:right w:val="single" w:color="A6A6A6" w:sz="4"/>
+            </w:tcBorders>
+            <w:tcMar>
+              <w:top w:type="dxa" w:w="80"/>
+              <w:left w:type="dxa" w:w="120"/>
+              <w:bottom w:type="dxa" w:w="80"/>
+              <w:right w:type="dxa" w:w="120"/>
+            </w:tcMar>
+          </w:tcPr>
+          <w:p>
+            <w:r>
+              <w:t>34</w:t>
+            </w:r>
+          </w:p>
+        </w:tc>
+        <w:tc>
+          <w:tcPr>
+            <w:tcW w:type="dxa" w:w="1625"/>
+            <w:tcBorders>
+              <w:top w:val="single" w:color="A6A6A6" w:sz="4"/>
+              <w:left w:val="single" w:color="A6A6A6" w:sz="4"/>
+              <w:bottom w:val="single" w:color="A6A6A6" w:sz="4"/>
+              <w:right w:val="single" w:color="A6A6A6" w:sz="4"/>
+            </w:tcBorders>
+            <w:tcMar>
+              <w:top w:type="dxa" w:w="80"/>
+              <w:left w:type="dxa" w:w="120"/>
+              <w:bottom w:type="dxa" w:w="80"/>
+              <w:right w:type="dxa" w:w="120"/>
+            </w:tcMar>
+          </w:tcPr>
+          <w:p>
+            <w:r>
+              <w:t>Staff two-step login</w:t>
+            </w:r>
+          </w:p>
+        </w:tc>
+        <w:tc>
+          <w:tcPr>
+            <w:tcW w:type="dxa" w:w="5235"/>
+            <w:tcBorders>
+              <w:top w:val="single" w:color="A6A6A6" w:sz="4"/>
+              <w:left w:val="single" w:color="A6A6A6" w:sz="4"/>
+              <w:bottom w:val="single" w:color="A6A6A6" w:sz="4"/>
+              <w:right w:val="single" w:color="A6A6A6" w:sz="4"/>
+            </w:tcBorders>
+            <w:tcMar>
+              <w:top w:type="dxa" w:w="80"/>
+              <w:left w:type="dxa" w:w="120"/>
+              <w:bottom w:type="dxa" w:w="80"/>
+              <w:right w:type="dxa" w:w="120"/>
+            </w:tcMar>
+          </w:tcPr>
+          <w:p>
+            <w:r>
+              <w:t>The second step must be a different factor from the sign-in. The platform records how each device signed in. A device signed in with an SMS code must complete the second step with an authenticator app code; a device signed in with a password may use an SMS code or an authenticator app code.</w:t>
+            </w:r>
+          </w:p>
+        </w:tc>
+        <w:tc>
+          <w:tcPr>
+            <w:tcW w:type="dxa" w:w="1534"/>
+            <w:tcBorders>
+              <w:top w:val="single" w:color="A6A6A6" w:sz="4"/>
+              <w:left w:val="single" w:color="A6A6A6" w:sz="4"/>
+              <w:bottom w:val="single" w:color="A6A6A6" w:sz="4"/>
+              <w:right w:val="single" w:color="A6A6A6" w:sz="4"/>
+            </w:tcBorders>
+            <w:tcMar>
+              <w:top w:type="dxa" w:w="80"/>
+              <w:left w:type="dxa" w:w="120"/>
+              <w:bottom w:type="dxa" w:w="80"/>
+              <w:right w:type="dxa" w:w="120"/>
+            </w:tcMar>
+          </w:tcPr>
+          <w:p>
+            <w:r>
+              <w:t>22 Oct 2026</w:t>
             </w:r>
           </w:p>
         </w:tc>

</xml_diff>

<commit_message>
Docs: record open points raised in chat (ID documents, ID image retention), legal steps, a known minor gap
Co-Authored-By: Claude Opus 5.5 <noreply@anthropic.com>
Claude-Session: https://claude.ai/code/session_01LvvfiTEfqhn9xLA45B6EdW
</commit_message>
<xml_diff>
--- a/docs/specs/FindHouseQuick_Decisions_Log.docx
+++ b/docs/specs/FindHouseQuick_Decisions_Log.docx
@@ -4355,6 +4355,142 @@
           <w:p>
             <w:r>
               <w:t xml:space="preserve">To be decided</w:t>
+            </w:r>
+          </w:p>
+        </w:tc>
+      </w:tr>
+      <w:tr>
+        <w:tc>
+          <w:tcPr>
+            <w:tcW w:type="dxa" w:w="632"/>
+            <w:tcBorders>
+              <w:top w:val="single" w:color="A6A6A6" w:sz="4"/>
+              <w:left w:val="single" w:color="A6A6A6" w:sz="4"/>
+              <w:bottom w:val="single" w:color="A6A6A6" w:sz="4"/>
+              <w:right w:val="single" w:color="A6A6A6" w:sz="4"/>
+            </w:tcBorders>
+            <w:tcMar>
+              <w:top w:type="dxa" w:w="80"/>
+              <w:left w:type="dxa" w:w="120"/>
+              <w:bottom w:type="dxa" w:w="80"/>
+              <w:right w:type="dxa" w:w="120"/>
+            </w:tcMar>
+          </w:tcPr>
+          <w:p>
+            <w:r>
+              <w:t>14</w:t>
+            </w:r>
+          </w:p>
+        </w:tc>
+        <w:tc>
+          <w:tcPr>
+            <w:tcW w:type="dxa" w:w="4784"/>
+            <w:tcBorders>
+              <w:top w:val="single" w:color="A6A6A6" w:sz="4"/>
+              <w:left w:val="single" w:color="A6A6A6" w:sz="4"/>
+              <w:bottom w:val="single" w:color="A6A6A6" w:sz="4"/>
+              <w:right w:val="single" w:color="A6A6A6" w:sz="4"/>
+            </w:tcBorders>
+            <w:tcMar>
+              <w:top w:type="dxa" w:w="80"/>
+              <w:left w:type="dxa" w:w="120"/>
+              <w:bottom w:type="dxa" w:w="80"/>
+              <w:right w:type="dxa" w:w="120"/>
+            </w:tcMar>
+          </w:tcPr>
+          <w:p>
+            <w:r>
+              <w:t>Identity documents accepted in Nigeria besides NIN (for example voter's card, international passport, driver's licence)</w:t>
+            </w:r>
+          </w:p>
+        </w:tc>
+        <w:tc>
+          <w:tcPr>
+            <w:tcW w:type="dxa" w:w="3610"/>
+            <w:tcBorders>
+              <w:top w:val="single" w:color="A6A6A6" w:sz="4"/>
+              <w:left w:val="single" w:color="A6A6A6" w:sz="4"/>
+              <w:bottom w:val="single" w:color="A6A6A6" w:sz="4"/>
+              <w:right w:val="single" w:color="A6A6A6" w:sz="4"/>
+            </w:tcBorders>
+            <w:tcMar>
+              <w:top w:type="dxa" w:w="80"/>
+              <w:left w:type="dxa" w:w="120"/>
+              <w:bottom w:type="dxa" w:w="80"/>
+              <w:right w:type="dxa" w:w="120"/>
+            </w:tcMar>
+          </w:tcPr>
+          <w:p>
+            <w:r>
+              <w:t>To be decided before identity checks go live; held in the country settings</w:t>
+            </w:r>
+          </w:p>
+        </w:tc>
+      </w:tr>
+      <w:tr>
+        <w:tc>
+          <w:tcPr>
+            <w:tcW w:type="dxa" w:w="632"/>
+            <w:tcBorders>
+              <w:top w:val="single" w:color="A6A6A6" w:sz="4"/>
+              <w:left w:val="single" w:color="A6A6A6" w:sz="4"/>
+              <w:bottom w:val="single" w:color="A6A6A6" w:sz="4"/>
+              <w:right w:val="single" w:color="A6A6A6" w:sz="4"/>
+            </w:tcBorders>
+            <w:tcMar>
+              <w:top w:type="dxa" w:w="80"/>
+              <w:left w:type="dxa" w:w="120"/>
+              <w:bottom w:type="dxa" w:w="80"/>
+              <w:right w:type="dxa" w:w="120"/>
+            </w:tcMar>
+          </w:tcPr>
+          <w:p>
+            <w:r>
+              <w:t>15</w:t>
+            </w:r>
+          </w:p>
+        </w:tc>
+        <w:tc>
+          <w:tcPr>
+            <w:tcW w:type="dxa" w:w="4784"/>
+            <w:tcBorders>
+              <w:top w:val="single" w:color="A6A6A6" w:sz="4"/>
+              <w:left w:val="single" w:color="A6A6A6" w:sz="4"/>
+              <w:bottom w:val="single" w:color="A6A6A6" w:sz="4"/>
+              <w:right w:val="single" w:color="A6A6A6" w:sz="4"/>
+            </w:tcBorders>
+            <w:tcMar>
+              <w:top w:type="dxa" w:w="80"/>
+              <w:left w:type="dxa" w:w="120"/>
+              <w:bottom w:type="dxa" w:w="80"/>
+              <w:right w:type="dxa" w:w="120"/>
+            </w:tcMar>
+          </w:tcPr>
+          <w:p>
+            <w:r>
+              <w:t>How long identity images are kept after verification (Specification 15.2: "the period required by law")</w:t>
+            </w:r>
+          </w:p>
+        </w:tc>
+        <w:tc>
+          <w:tcPr>
+            <w:tcW w:type="dxa" w:w="3610"/>
+            <w:tcBorders>
+              <w:top w:val="single" w:color="A6A6A6" w:sz="4"/>
+              <w:left w:val="single" w:color="A6A6A6" w:sz="4"/>
+              <w:bottom w:val="single" w:color="A6A6A6" w:sz="4"/>
+              <w:right w:val="single" w:color="A6A6A6" w:sz="4"/>
+            </w:tcBorders>
+            <w:tcMar>
+              <w:top w:type="dxa" w:w="80"/>
+              <w:left w:type="dxa" w:w="120"/>
+              <w:bottom w:type="dxa" w:w="80"/>
+              <w:right w:type="dxa" w:w="120"/>
+            </w:tcMar>
+          </w:tcPr>
+          <w:p>
+            <w:r>
+              <w:t>To be confirmed with a lawyer; held in the country settings</w:t>
             </w:r>
           </w:p>
         </w:tc>

</xml_diff>

<commit_message>
Status: step 2 done; record decisions 35 and 36 (email) and open points 16 and 17
Co-Authored-By: Claude Opus 5.5 <noreply@anthropic.com>
Claude-Session: https://claude.ai/code/session_01LvvfiTEfqhn9xLA45B6EdW
</commit_message>
<xml_diff>
--- a/docs/specs/FindHouseQuick_Decisions_Log.docx
+++ b/docs/specs/FindHouseQuick_Decisions_Log.docx
@@ -3355,6 +3355,186 @@
           </w:p>
         </w:tc>
       </w:tr>
+      <w:tr>
+        <w:tc>
+          <w:tcPr>
+            <w:tcW w:type="dxa" w:w="632"/>
+            <w:tcBorders>
+              <w:top w:val="single" w:color="A6A6A6" w:sz="4"/>
+              <w:left w:val="single" w:color="A6A6A6" w:sz="4"/>
+              <w:bottom w:val="single" w:color="A6A6A6" w:sz="4"/>
+              <w:right w:val="single" w:color="A6A6A6" w:sz="4"/>
+            </w:tcBorders>
+            <w:tcMar>
+              <w:top w:type="dxa" w:w="80"/>
+              <w:left w:type="dxa" w:w="120"/>
+              <w:bottom w:type="dxa" w:w="80"/>
+              <w:right w:type="dxa" w:w="120"/>
+            </w:tcMar>
+          </w:tcPr>
+          <w:p>
+            <w:r>
+              <w:t>35</w:t>
+            </w:r>
+          </w:p>
+        </w:tc>
+        <w:tc>
+          <w:tcPr>
+            <w:tcW w:type="dxa" w:w="1625"/>
+            <w:tcBorders>
+              <w:top w:val="single" w:color="A6A6A6" w:sz="4"/>
+              <w:left w:val="single" w:color="A6A6A6" w:sz="4"/>
+              <w:bottom w:val="single" w:color="A6A6A6" w:sz="4"/>
+              <w:right w:val="single" w:color="A6A6A6" w:sz="4"/>
+            </w:tcBorders>
+            <w:tcMar>
+              <w:top w:type="dxa" w:w="80"/>
+              <w:left w:type="dxa" w:w="120"/>
+              <w:bottom w:type="dxa" w:w="80"/>
+              <w:right w:type="dxa" w:w="120"/>
+            </w:tcMar>
+          </w:tcPr>
+          <w:p>
+            <w:r>
+              <w:t>Email and sign-in</w:t>
+            </w:r>
+          </w:p>
+        </w:tc>
+        <w:tc>
+          <w:tcPr>
+            <w:tcW w:type="dxa" w:w="5235"/>
+            <w:tcBorders>
+              <w:top w:val="single" w:color="A6A6A6" w:sz="4"/>
+              <w:left w:val="single" w:color="A6A6A6" w:sz="4"/>
+              <w:bottom w:val="single" w:color="A6A6A6" w:sz="4"/>
+              <w:right w:val="single" w:color="A6A6A6" w:sz="4"/>
+            </w:tcBorders>
+            <w:tcMar>
+              <w:top w:type="dxa" w:w="80"/>
+              <w:left w:type="dxa" w:w="120"/>
+              <w:bottom w:type="dxa" w:w="80"/>
+              <w:right w:type="dxa" w:w="120"/>
+            </w:tcMar>
+          </w:tcPr>
+          <w:p>
+            <w:r>
+              <w:t>Email address is required at registration, as Specification Section 3 says. Users sign up with either their phone number or their email address, and must confirm both: the phone by an SMS code and the email by a code sent to it. Until the phone is confirmed, a user may only browse; any action or progress needs a confirmed phone. Users sign in with either, by password or by a code sent to it.</w:t>
+            </w:r>
+          </w:p>
+        </w:tc>
+        <w:tc>
+          <w:tcPr>
+            <w:tcW w:type="dxa" w:w="1534"/>
+            <w:tcBorders>
+              <w:top w:val="single" w:color="A6A6A6" w:sz="4"/>
+              <w:left w:val="single" w:color="A6A6A6" w:sz="4"/>
+              <w:bottom w:val="single" w:color="A6A6A6" w:sz="4"/>
+              <w:right w:val="single" w:color="A6A6A6" w:sz="4"/>
+            </w:tcBorders>
+            <w:tcMar>
+              <w:top w:type="dxa" w:w="80"/>
+              <w:left w:type="dxa" w:w="120"/>
+              <w:bottom w:type="dxa" w:w="80"/>
+              <w:right w:type="dxa" w:w="120"/>
+            </w:tcMar>
+          </w:tcPr>
+          <w:p>
+            <w:r>
+              <w:t>22 Oct 2026</w:t>
+            </w:r>
+          </w:p>
+        </w:tc>
+      </w:tr>
+      <w:tr>
+        <w:tc>
+          <w:tcPr>
+            <w:tcW w:type="dxa" w:w="632"/>
+            <w:tcBorders>
+              <w:top w:val="single" w:color="A6A6A6" w:sz="4"/>
+              <w:left w:val="single" w:color="A6A6A6" w:sz="4"/>
+              <w:bottom w:val="single" w:color="A6A6A6" w:sz="4"/>
+              <w:right w:val="single" w:color="A6A6A6" w:sz="4"/>
+            </w:tcBorders>
+            <w:tcMar>
+              <w:top w:type="dxa" w:w="80"/>
+              <w:left w:type="dxa" w:w="120"/>
+              <w:bottom w:type="dxa" w:w="80"/>
+              <w:right w:type="dxa" w:w="120"/>
+            </w:tcMar>
+          </w:tcPr>
+          <w:p>
+            <w:r>
+              <w:t>36</w:t>
+            </w:r>
+          </w:p>
+        </w:tc>
+        <w:tc>
+          <w:tcPr>
+            <w:tcW w:type="dxa" w:w="1625"/>
+            <w:tcBorders>
+              <w:top w:val="single" w:color="A6A6A6" w:sz="4"/>
+              <w:left w:val="single" w:color="A6A6A6" w:sz="4"/>
+              <w:bottom w:val="single" w:color="A6A6A6" w:sz="4"/>
+              <w:right w:val="single" w:color="A6A6A6" w:sz="4"/>
+            </w:tcBorders>
+            <w:tcMar>
+              <w:top w:type="dxa" w:w="80"/>
+              <w:left w:type="dxa" w:w="120"/>
+              <w:bottom w:type="dxa" w:w="80"/>
+              <w:right w:type="dxa" w:w="120"/>
+            </w:tcMar>
+          </w:tcPr>
+          <w:p>
+            <w:r>
+              <w:t>Two-step login and password reset</w:t>
+            </w:r>
+          </w:p>
+        </w:tc>
+        <w:tc>
+          <w:tcPr>
+            <w:tcW w:type="dxa" w:w="5235"/>
+            <w:tcBorders>
+              <w:top w:val="single" w:color="A6A6A6" w:sz="4"/>
+              <w:left w:val="single" w:color="A6A6A6" w:sz="4"/>
+              <w:bottom w:val="single" w:color="A6A6A6" w:sz="4"/>
+              <w:right w:val="single" w:color="A6A6A6" w:sz="4"/>
+            </w:tcBorders>
+            <w:tcMar>
+              <w:top w:type="dxa" w:w="80"/>
+              <w:left w:type="dxa" w:w="120"/>
+              <w:bottom w:type="dxa" w:w="80"/>
+              <w:right w:type="dxa" w:w="120"/>
+            </w:tcMar>
+          </w:tcPr>
+          <w:p>
+            <w:r>
+              <w:t>The second step never uses the same channel as the sign-in (refines decision 34): after an SMS code sign-in, an email code or the authenticator app; after an email code sign-in, an SMS code or the authenticator app. After a password sign-in, the second step is offered in this order: the authenticator app if the user has set one up, then an email code, then an SMS code, because SMS delivery is not always reliable. Password reset codes go by SMS or email, as the user chooses.</w:t>
+            </w:r>
+          </w:p>
+        </w:tc>
+        <w:tc>
+          <w:tcPr>
+            <w:tcW w:type="dxa" w:w="1534"/>
+            <w:tcBorders>
+              <w:top w:val="single" w:color="A6A6A6" w:sz="4"/>
+              <w:left w:val="single" w:color="A6A6A6" w:sz="4"/>
+              <w:bottom w:val="single" w:color="A6A6A6" w:sz="4"/>
+              <w:right w:val="single" w:color="A6A6A6" w:sz="4"/>
+            </w:tcBorders>
+            <w:tcMar>
+              <w:top w:type="dxa" w:w="80"/>
+              <w:left w:type="dxa" w:w="120"/>
+              <w:bottom w:type="dxa" w:w="80"/>
+              <w:right w:type="dxa" w:w="120"/>
+            </w:tcMar>
+          </w:tcPr>
+          <w:p>
+            <w:r>
+              <w:t>22 Oct 2026</w:t>
+            </w:r>
+          </w:p>
+        </w:tc>
+      </w:tr>
     </w:tbl>
     <w:p>
       <w:pPr>
@@ -4491,6 +4671,142 @@
           <w:p>
             <w:r>
               <w:t>To be confirmed with a lawyer; held in the country settings</w:t>
+            </w:r>
+          </w:p>
+        </w:tc>
+      </w:tr>
+      <w:tr>
+        <w:tc>
+          <w:tcPr>
+            <w:tcW w:type="dxa" w:w="632"/>
+            <w:tcBorders>
+              <w:top w:val="single" w:color="A6A6A6" w:sz="4"/>
+              <w:left w:val="single" w:color="A6A6A6" w:sz="4"/>
+              <w:bottom w:val="single" w:color="A6A6A6" w:sz="4"/>
+              <w:right w:val="single" w:color="A6A6A6" w:sz="4"/>
+            </w:tcBorders>
+            <w:tcMar>
+              <w:top w:type="dxa" w:w="80"/>
+              <w:left w:type="dxa" w:w="120"/>
+              <w:bottom w:type="dxa" w:w="80"/>
+              <w:right w:type="dxa" w:w="120"/>
+            </w:tcMar>
+          </w:tcPr>
+          <w:p>
+            <w:r>
+              <w:t>16</w:t>
+            </w:r>
+          </w:p>
+        </w:tc>
+        <w:tc>
+          <w:tcPr>
+            <w:tcW w:type="dxa" w:w="4784"/>
+            <w:tcBorders>
+              <w:top w:val="single" w:color="A6A6A6" w:sz="4"/>
+              <w:left w:val="single" w:color="A6A6A6" w:sz="4"/>
+              <w:bottom w:val="single" w:color="A6A6A6" w:sz="4"/>
+              <w:right w:val="single" w:color="A6A6A6" w:sz="4"/>
+            </w:tcBorders>
+            <w:tcMar>
+              <w:top w:type="dxa" w:w="80"/>
+              <w:left w:type="dxa" w:w="120"/>
+              <w:bottom w:type="dxa" w:w="80"/>
+              <w:right w:type="dxa" w:w="120"/>
+            </w:tcMar>
+          </w:tcPr>
+          <w:p>
+            <w:r>
+              <w:t>When a user who signed up with their phone must confirm their email (for example, before reaching level 1)</w:t>
+            </w:r>
+          </w:p>
+        </w:tc>
+        <w:tc>
+          <w:tcPr>
+            <w:tcW w:type="dxa" w:w="3610"/>
+            <w:tcBorders>
+              <w:top w:val="single" w:color="A6A6A6" w:sz="4"/>
+              <w:left w:val="single" w:color="A6A6A6" w:sz="4"/>
+              <w:bottom w:val="single" w:color="A6A6A6" w:sz="4"/>
+              <w:right w:val="single" w:color="A6A6A6" w:sz="4"/>
+            </w:tcBorders>
+            <w:tcMar>
+              <w:top w:type="dxa" w:w="80"/>
+              <w:left w:type="dxa" w:w="120"/>
+              <w:bottom w:type="dxa" w:w="80"/>
+              <w:right w:type="dxa" w:w="120"/>
+            </w:tcMar>
+          </w:tcPr>
+          <w:p>
+            <w:r>
+              <w:t>To be decided</w:t>
+            </w:r>
+          </w:p>
+        </w:tc>
+      </w:tr>
+      <w:tr>
+        <w:tc>
+          <w:tcPr>
+            <w:tcW w:type="dxa" w:w="632"/>
+            <w:tcBorders>
+              <w:top w:val="single" w:color="A6A6A6" w:sz="4"/>
+              <w:left w:val="single" w:color="A6A6A6" w:sz="4"/>
+              <w:bottom w:val="single" w:color="A6A6A6" w:sz="4"/>
+              <w:right w:val="single" w:color="A6A6A6" w:sz="4"/>
+            </w:tcBorders>
+            <w:tcMar>
+              <w:top w:type="dxa" w:w="80"/>
+              <w:left w:type="dxa" w:w="120"/>
+              <w:bottom w:type="dxa" w:w="80"/>
+              <w:right w:type="dxa" w:w="120"/>
+            </w:tcMar>
+          </w:tcPr>
+          <w:p>
+            <w:r>
+              <w:t>17</w:t>
+            </w:r>
+          </w:p>
+        </w:tc>
+        <w:tc>
+          <w:tcPr>
+            <w:tcW w:type="dxa" w:w="4784"/>
+            <w:tcBorders>
+              <w:top w:val="single" w:color="A6A6A6" w:sz="4"/>
+              <w:left w:val="single" w:color="A6A6A6" w:sz="4"/>
+              <w:bottom w:val="single" w:color="A6A6A6" w:sz="4"/>
+              <w:right w:val="single" w:color="A6A6A6" w:sz="4"/>
+            </w:tcBorders>
+            <w:tcMar>
+              <w:top w:type="dxa" w:w="80"/>
+              <w:left w:type="dxa" w:w="120"/>
+              <w:bottom w:type="dxa" w:w="80"/>
+              <w:right w:type="dxa" w:w="120"/>
+            </w:tcMar>
+          </w:tcPr>
+          <w:p>
+            <w:r>
+              <w:t>Adding staff by confirmed email address as well as by phone number</w:t>
+            </w:r>
+          </w:p>
+        </w:tc>
+        <w:tc>
+          <w:tcPr>
+            <w:tcW w:type="dxa" w:w="3610"/>
+            <w:tcBorders>
+              <w:top w:val="single" w:color="A6A6A6" w:sz="4"/>
+              <w:left w:val="single" w:color="A6A6A6" w:sz="4"/>
+              <w:bottom w:val="single" w:color="A6A6A6" w:sz="4"/>
+              <w:right w:val="single" w:color="A6A6A6" w:sz="4"/>
+            </w:tcBorders>
+            <w:tcMar>
+              <w:top w:type="dxa" w:w="80"/>
+              <w:left w:type="dxa" w:w="120"/>
+              <w:bottom w:type="dxa" w:w="80"/>
+              <w:right w:type="dxa" w:w="120"/>
+            </w:tcMar>
+          </w:tcPr>
+          <w:p>
+            <w:r>
+              <w:t>To be decided</w:t>
             </w:r>
           </w:p>
         </w:tc>

</xml_diff>

<commit_message>
Record decisions 37 and 38 (were open points 16 and 17)
Co-Authored-By: Claude Opus 5.5 <noreply@anthropic.com>
Claude-Session: https://claude.ai/code/session_01LvvfiTEfqhn9xLA45B6EdW
</commit_message>
<xml_diff>
--- a/docs/specs/FindHouseQuick_Decisions_Log.docx
+++ b/docs/specs/FindHouseQuick_Decisions_Log.docx
@@ -3535,6 +3535,186 @@
           </w:p>
         </w:tc>
       </w:tr>
+      <w:tr>
+        <w:tc>
+          <w:tcPr>
+            <w:tcW w:type="dxa" w:w="632"/>
+            <w:tcBorders>
+              <w:top w:val="single" w:color="A6A6A6" w:sz="4"/>
+              <w:left w:val="single" w:color="A6A6A6" w:sz="4"/>
+              <w:bottom w:val="single" w:color="A6A6A6" w:sz="4"/>
+              <w:right w:val="single" w:color="A6A6A6" w:sz="4"/>
+            </w:tcBorders>
+            <w:tcMar>
+              <w:top w:type="dxa" w:w="80"/>
+              <w:left w:type="dxa" w:w="120"/>
+              <w:bottom w:type="dxa" w:w="80"/>
+              <w:right w:type="dxa" w:w="120"/>
+            </w:tcMar>
+          </w:tcPr>
+          <w:p>
+            <w:r>
+              <w:t>37</w:t>
+            </w:r>
+          </w:p>
+        </w:tc>
+        <w:tc>
+          <w:tcPr>
+            <w:tcW w:type="dxa" w:w="1625"/>
+            <w:tcBorders>
+              <w:top w:val="single" w:color="A6A6A6" w:sz="4"/>
+              <w:left w:val="single" w:color="A6A6A6" w:sz="4"/>
+              <w:bottom w:val="single" w:color="A6A6A6" w:sz="4"/>
+              <w:right w:val="single" w:color="A6A6A6" w:sz="4"/>
+            </w:tcBorders>
+            <w:tcMar>
+              <w:top w:type="dxa" w:w="80"/>
+              <w:left w:type="dxa" w:w="120"/>
+              <w:bottom w:type="dxa" w:w="80"/>
+              <w:right w:type="dxa" w:w="120"/>
+            </w:tcMar>
+          </w:tcPr>
+          <w:p>
+            <w:r>
+              <w:t>Email and sign-in</w:t>
+            </w:r>
+          </w:p>
+        </w:tc>
+        <w:tc>
+          <w:tcPr>
+            <w:tcW w:type="dxa" w:w="5235"/>
+            <w:tcBorders>
+              <w:top w:val="single" w:color="A6A6A6" w:sz="4"/>
+              <w:left w:val="single" w:color="A6A6A6" w:sz="4"/>
+              <w:bottom w:val="single" w:color="A6A6A6" w:sz="4"/>
+              <w:right w:val="single" w:color="A6A6A6" w:sz="4"/>
+            </w:tcBorders>
+            <w:tcMar>
+              <w:top w:type="dxa" w:w="80"/>
+              <w:left w:type="dxa" w:w="120"/>
+              <w:bottom w:type="dxa" w:w="80"/>
+              <w:right w:type="dxa" w:w="120"/>
+            </w:tcMar>
+          </w:tcPr>
+          <w:p>
+            <w:r>
+              <w:t>A user who signed up with their phone must confirm their email before reaching verification level 1, so level 1 means both phone and email are confirmed (Specification Sections 3.2 to 3.4).</w:t>
+            </w:r>
+          </w:p>
+        </w:tc>
+        <w:tc>
+          <w:tcPr>
+            <w:tcW w:type="dxa" w:w="1534"/>
+            <w:tcBorders>
+              <w:top w:val="single" w:color="A6A6A6" w:sz="4"/>
+              <w:left w:val="single" w:color="A6A6A6" w:sz="4"/>
+              <w:bottom w:val="single" w:color="A6A6A6" w:sz="4"/>
+              <w:right w:val="single" w:color="A6A6A6" w:sz="4"/>
+            </w:tcBorders>
+            <w:tcMar>
+              <w:top w:type="dxa" w:w="80"/>
+              <w:left w:type="dxa" w:w="120"/>
+              <w:bottom w:type="dxa" w:w="80"/>
+              <w:right w:type="dxa" w:w="120"/>
+            </w:tcMar>
+          </w:tcPr>
+          <w:p>
+            <w:r>
+              <w:t>22 Oct 2026</w:t>
+            </w:r>
+          </w:p>
+        </w:tc>
+      </w:tr>
+      <w:tr>
+        <w:tc>
+          <w:tcPr>
+            <w:tcW w:type="dxa" w:w="632"/>
+            <w:tcBorders>
+              <w:top w:val="single" w:color="A6A6A6" w:sz="4"/>
+              <w:left w:val="single" w:color="A6A6A6" w:sz="4"/>
+              <w:bottom w:val="single" w:color="A6A6A6" w:sz="4"/>
+              <w:right w:val="single" w:color="A6A6A6" w:sz="4"/>
+            </w:tcBorders>
+            <w:tcMar>
+              <w:top w:type="dxa" w:w="80"/>
+              <w:left w:type="dxa" w:w="120"/>
+              <w:bottom w:type="dxa" w:w="80"/>
+              <w:right w:type="dxa" w:w="120"/>
+            </w:tcMar>
+          </w:tcPr>
+          <w:p>
+            <w:r>
+              <w:t>38</w:t>
+            </w:r>
+          </w:p>
+        </w:tc>
+        <w:tc>
+          <w:tcPr>
+            <w:tcW w:type="dxa" w:w="1625"/>
+            <w:tcBorders>
+              <w:top w:val="single" w:color="A6A6A6" w:sz="4"/>
+              <w:left w:val="single" w:color="A6A6A6" w:sz="4"/>
+              <w:bottom w:val="single" w:color="A6A6A6" w:sz="4"/>
+              <w:right w:val="single" w:color="A6A6A6" w:sz="4"/>
+            </w:tcBorders>
+            <w:tcMar>
+              <w:top w:type="dxa" w:w="80"/>
+              <w:left w:type="dxa" w:w="120"/>
+              <w:bottom w:type="dxa" w:w="80"/>
+              <w:right w:type="dxa" w:w="120"/>
+            </w:tcMar>
+          </w:tcPr>
+          <w:p>
+            <w:r>
+              <w:t>Staff accounts</w:t>
+            </w:r>
+          </w:p>
+        </w:tc>
+        <w:tc>
+          <w:tcPr>
+            <w:tcW w:type="dxa" w:w="5235"/>
+            <w:tcBorders>
+              <w:top w:val="single" w:color="A6A6A6" w:sz="4"/>
+              <w:left w:val="single" w:color="A6A6A6" w:sz="4"/>
+              <w:bottom w:val="single" w:color="A6A6A6" w:sz="4"/>
+              <w:right w:val="single" w:color="A6A6A6" w:sz="4"/>
+            </w:tcBorders>
+            <w:tcMar>
+              <w:top w:type="dxa" w:w="80"/>
+              <w:left w:type="dxa" w:w="120"/>
+              <w:bottom w:type="dxa" w:w="80"/>
+              <w:right w:type="dxa" w:w="120"/>
+            </w:tcMar>
+          </w:tcPr>
+          <w:p>
+            <w:r>
+              <w:t>Super admins may add staff by confirmed email address as well as by phone number (adds to decision 30).</w:t>
+            </w:r>
+          </w:p>
+        </w:tc>
+        <w:tc>
+          <w:tcPr>
+            <w:tcW w:type="dxa" w:w="1534"/>
+            <w:tcBorders>
+              <w:top w:val="single" w:color="A6A6A6" w:sz="4"/>
+              <w:left w:val="single" w:color="A6A6A6" w:sz="4"/>
+              <w:bottom w:val="single" w:color="A6A6A6" w:sz="4"/>
+              <w:right w:val="single" w:color="A6A6A6" w:sz="4"/>
+            </w:tcBorders>
+            <w:tcMar>
+              <w:top w:type="dxa" w:w="80"/>
+              <w:left w:type="dxa" w:w="120"/>
+              <w:bottom w:type="dxa" w:w="80"/>
+              <w:right w:type="dxa" w:w="120"/>
+            </w:tcMar>
+          </w:tcPr>
+          <w:p>
+            <w:r>
+              <w:t>22 Oct 2026</w:t>
+            </w:r>
+          </w:p>
+        </w:tc>
+      </w:tr>
     </w:tbl>
     <w:p>
       <w:pPr>
@@ -4671,142 +4851,6 @@
           <w:p>
             <w:r>
               <w:t>To be confirmed with a lawyer; held in the country settings</w:t>
-            </w:r>
-          </w:p>
-        </w:tc>
-      </w:tr>
-      <w:tr>
-        <w:tc>
-          <w:tcPr>
-            <w:tcW w:type="dxa" w:w="632"/>
-            <w:tcBorders>
-              <w:top w:val="single" w:color="A6A6A6" w:sz="4"/>
-              <w:left w:val="single" w:color="A6A6A6" w:sz="4"/>
-              <w:bottom w:val="single" w:color="A6A6A6" w:sz="4"/>
-              <w:right w:val="single" w:color="A6A6A6" w:sz="4"/>
-            </w:tcBorders>
-            <w:tcMar>
-              <w:top w:type="dxa" w:w="80"/>
-              <w:left w:type="dxa" w:w="120"/>
-              <w:bottom w:type="dxa" w:w="80"/>
-              <w:right w:type="dxa" w:w="120"/>
-            </w:tcMar>
-          </w:tcPr>
-          <w:p>
-            <w:r>
-              <w:t>16</w:t>
-            </w:r>
-          </w:p>
-        </w:tc>
-        <w:tc>
-          <w:tcPr>
-            <w:tcW w:type="dxa" w:w="4784"/>
-            <w:tcBorders>
-              <w:top w:val="single" w:color="A6A6A6" w:sz="4"/>
-              <w:left w:val="single" w:color="A6A6A6" w:sz="4"/>
-              <w:bottom w:val="single" w:color="A6A6A6" w:sz="4"/>
-              <w:right w:val="single" w:color="A6A6A6" w:sz="4"/>
-            </w:tcBorders>
-            <w:tcMar>
-              <w:top w:type="dxa" w:w="80"/>
-              <w:left w:type="dxa" w:w="120"/>
-              <w:bottom w:type="dxa" w:w="80"/>
-              <w:right w:type="dxa" w:w="120"/>
-            </w:tcMar>
-          </w:tcPr>
-          <w:p>
-            <w:r>
-              <w:t>When a user who signed up with their phone must confirm their email (for example, before reaching level 1)</w:t>
-            </w:r>
-          </w:p>
-        </w:tc>
-        <w:tc>
-          <w:tcPr>
-            <w:tcW w:type="dxa" w:w="3610"/>
-            <w:tcBorders>
-              <w:top w:val="single" w:color="A6A6A6" w:sz="4"/>
-              <w:left w:val="single" w:color="A6A6A6" w:sz="4"/>
-              <w:bottom w:val="single" w:color="A6A6A6" w:sz="4"/>
-              <w:right w:val="single" w:color="A6A6A6" w:sz="4"/>
-            </w:tcBorders>
-            <w:tcMar>
-              <w:top w:type="dxa" w:w="80"/>
-              <w:left w:type="dxa" w:w="120"/>
-              <w:bottom w:type="dxa" w:w="80"/>
-              <w:right w:type="dxa" w:w="120"/>
-            </w:tcMar>
-          </w:tcPr>
-          <w:p>
-            <w:r>
-              <w:t>To be decided</w:t>
-            </w:r>
-          </w:p>
-        </w:tc>
-      </w:tr>
-      <w:tr>
-        <w:tc>
-          <w:tcPr>
-            <w:tcW w:type="dxa" w:w="632"/>
-            <w:tcBorders>
-              <w:top w:val="single" w:color="A6A6A6" w:sz="4"/>
-              <w:left w:val="single" w:color="A6A6A6" w:sz="4"/>
-              <w:bottom w:val="single" w:color="A6A6A6" w:sz="4"/>
-              <w:right w:val="single" w:color="A6A6A6" w:sz="4"/>
-            </w:tcBorders>
-            <w:tcMar>
-              <w:top w:type="dxa" w:w="80"/>
-              <w:left w:type="dxa" w:w="120"/>
-              <w:bottom w:type="dxa" w:w="80"/>
-              <w:right w:type="dxa" w:w="120"/>
-            </w:tcMar>
-          </w:tcPr>
-          <w:p>
-            <w:r>
-              <w:t>17</w:t>
-            </w:r>
-          </w:p>
-        </w:tc>
-        <w:tc>
-          <w:tcPr>
-            <w:tcW w:type="dxa" w:w="4784"/>
-            <w:tcBorders>
-              <w:top w:val="single" w:color="A6A6A6" w:sz="4"/>
-              <w:left w:val="single" w:color="A6A6A6" w:sz="4"/>
-              <w:bottom w:val="single" w:color="A6A6A6" w:sz="4"/>
-              <w:right w:val="single" w:color="A6A6A6" w:sz="4"/>
-            </w:tcBorders>
-            <w:tcMar>
-              <w:top w:type="dxa" w:w="80"/>
-              <w:left w:type="dxa" w:w="120"/>
-              <w:bottom w:type="dxa" w:w="80"/>
-              <w:right w:type="dxa" w:w="120"/>
-            </w:tcMar>
-          </w:tcPr>
-          <w:p>
-            <w:r>
-              <w:t>Adding staff by confirmed email address as well as by phone number</w:t>
-            </w:r>
-          </w:p>
-        </w:tc>
-        <w:tc>
-          <w:tcPr>
-            <w:tcW w:type="dxa" w:w="3610"/>
-            <w:tcBorders>
-              <w:top w:val="single" w:color="A6A6A6" w:sz="4"/>
-              <w:left w:val="single" w:color="A6A6A6" w:sz="4"/>
-              <w:bottom w:val="single" w:color="A6A6A6" w:sz="4"/>
-              <w:right w:val="single" w:color="A6A6A6" w:sz="4"/>
-            </w:tcBorders>
-            <w:tcMar>
-              <w:top w:type="dxa" w:w="80"/>
-              <w:left w:type="dxa" w:w="120"/>
-              <w:bottom w:type="dxa" w:w="80"/>
-              <w:right w:type="dxa" w:w="120"/>
-            </w:tcMar>
-          </w:tcPr>
-          <w:p>
-            <w:r>
-              <w:t>To be decided</w:t>
             </w:r>
           </w:p>
         </w:tc>

</xml_diff>

<commit_message>
Record decisions 39 to 59 (specification check); API design, status and deployment guide updated; decided report
Co-Authored-By: Claude Opus 5.5 <noreply@anthropic.com>
Claude-Session: https://claude.ai/code/session_01LvvfiTEfqhn9xLA45B6EdW
</commit_message>
<xml_diff>
--- a/docs/specs/FindHouseQuick_Decisions_Log.docx
+++ b/docs/specs/FindHouseQuick_Decisions_Log.docx
@@ -67,7 +67,7 @@
           <w:sz w:val="22"/>
           <w:szCs w:val="22"/>
         </w:rPr>
-        <w:t xml:space="preserve">Updated 22 October 2026</w:t>
+        <w:t>Updated 23 October 2026</w:t>
       </w:r>
     </w:p>
     <w:p>
@@ -3715,6 +3715,1896 @@
           </w:p>
         </w:tc>
       </w:tr>
+      <w:tr>
+        <w:tc>
+          <w:tcPr>
+            <w:tcW w:type="dxa" w:w="632"/>
+            <w:tcBorders>
+              <w:top w:val="single" w:color="A6A6A6" w:sz="4"/>
+              <w:left w:val="single" w:color="A6A6A6" w:sz="4"/>
+              <w:bottom w:val="single" w:color="A6A6A6" w:sz="4"/>
+              <w:right w:val="single" w:color="A6A6A6" w:sz="4"/>
+            </w:tcBorders>
+            <w:tcMar>
+              <w:top w:type="dxa" w:w="80"/>
+              <w:left w:type="dxa" w:w="120"/>
+              <w:bottom w:type="dxa" w:w="80"/>
+              <w:right w:type="dxa" w:w="120"/>
+            </w:tcMar>
+          </w:tcPr>
+          <w:p>
+            <w:r>
+              <w:t>39</w:t>
+            </w:r>
+          </w:p>
+        </w:tc>
+        <w:tc>
+          <w:tcPr>
+            <w:tcW w:type="dxa" w:w="1625"/>
+            <w:tcBorders>
+              <w:top w:val="single" w:color="A6A6A6" w:sz="4"/>
+              <w:left w:val="single" w:color="A6A6A6" w:sz="4"/>
+              <w:bottom w:val="single" w:color="A6A6A6" w:sz="4"/>
+              <w:right w:val="single" w:color="A6A6A6" w:sz="4"/>
+            </w:tcBorders>
+            <w:tcMar>
+              <w:top w:type="dxa" w:w="80"/>
+              <w:left w:type="dxa" w:w="120"/>
+              <w:bottom w:type="dxa" w:w="80"/>
+              <w:right w:type="dxa" w:w="120"/>
+            </w:tcMar>
+          </w:tcPr>
+          <w:p>
+            <w:r>
+              <w:t>Public access</w:t>
+            </w:r>
+          </w:p>
+        </w:tc>
+        <w:tc>
+          <w:tcPr>
+            <w:tcW w:type="dxa" w:w="5235"/>
+            <w:tcBorders>
+              <w:top w:val="single" w:color="A6A6A6" w:sz="4"/>
+              <w:left w:val="single" w:color="A6A6A6" w:sz="4"/>
+              <w:bottom w:val="single" w:color="A6A6A6" w:sz="4"/>
+              <w:right w:val="single" w:color="A6A6A6" w:sz="4"/>
+            </w:tcBorders>
+            <w:tcMar>
+              <w:top w:type="dxa" w:w="80"/>
+              <w:left w:type="dxa" w:w="120"/>
+              <w:bottom w:type="dxa" w:w="80"/>
+              <w:right w:type="dxa" w:w="120"/>
+            </w:tcMar>
+          </w:tcPr>
+          <w:p>
+            <w:r>
+              <w:t>Signed-out visitors see a summary of each listing only: cover photo, rent, area, number of rooms and badges. Everything else (photo gallery, walkthrough, details, map position, contact, saving and alerts) needs an account.</w:t>
+            </w:r>
+          </w:p>
+        </w:tc>
+        <w:tc>
+          <w:tcPr>
+            <w:tcW w:type="dxa" w:w="1534"/>
+            <w:tcBorders>
+              <w:top w:val="single" w:color="A6A6A6" w:sz="4"/>
+              <w:left w:val="single" w:color="A6A6A6" w:sz="4"/>
+              <w:bottom w:val="single" w:color="A6A6A6" w:sz="4"/>
+              <w:right w:val="single" w:color="A6A6A6" w:sz="4"/>
+            </w:tcBorders>
+            <w:tcMar>
+              <w:top w:type="dxa" w:w="80"/>
+              <w:left w:type="dxa" w:w="120"/>
+              <w:bottom w:type="dxa" w:w="80"/>
+              <w:right w:type="dxa" w:w="120"/>
+            </w:tcMar>
+          </w:tcPr>
+          <w:p>
+            <w:r>
+              <w:t>23 Oct 2026</w:t>
+            </w:r>
+          </w:p>
+        </w:tc>
+      </w:tr>
+      <w:tr>
+        <w:tc>
+          <w:tcPr>
+            <w:tcW w:type="dxa" w:w="632"/>
+            <w:tcBorders>
+              <w:top w:val="single" w:color="A6A6A6" w:sz="4"/>
+              <w:left w:val="single" w:color="A6A6A6" w:sz="4"/>
+              <w:bottom w:val="single" w:color="A6A6A6" w:sz="4"/>
+              <w:right w:val="single" w:color="A6A6A6" w:sz="4"/>
+            </w:tcBorders>
+            <w:tcMar>
+              <w:top w:type="dxa" w:w="80"/>
+              <w:left w:type="dxa" w:w="120"/>
+              <w:bottom w:type="dxa" w:w="80"/>
+              <w:right w:type="dxa" w:w="120"/>
+            </w:tcMar>
+          </w:tcPr>
+          <w:p>
+            <w:r>
+              <w:t>40</w:t>
+            </w:r>
+          </w:p>
+        </w:tc>
+        <w:tc>
+          <w:tcPr>
+            <w:tcW w:type="dxa" w:w="1625"/>
+            <w:tcBorders>
+              <w:top w:val="single" w:color="A6A6A6" w:sz="4"/>
+              <w:left w:val="single" w:color="A6A6A6" w:sz="4"/>
+              <w:bottom w:val="single" w:color="A6A6A6" w:sz="4"/>
+              <w:right w:val="single" w:color="A6A6A6" w:sz="4"/>
+            </w:tcBorders>
+            <w:tcMar>
+              <w:top w:type="dxa" w:w="80"/>
+              <w:left w:type="dxa" w:w="120"/>
+              <w:bottom w:type="dxa" w:w="80"/>
+              <w:right w:type="dxa" w:w="120"/>
+            </w:tcMar>
+          </w:tcPr>
+          <w:p>
+            <w:r>
+              <w:t>Languages</w:t>
+            </w:r>
+          </w:p>
+        </w:tc>
+        <w:tc>
+          <w:tcPr>
+            <w:tcW w:type="dxa" w:w="5235"/>
+            <w:tcBorders>
+              <w:top w:val="single" w:color="A6A6A6" w:sz="4"/>
+              <w:left w:val="single" w:color="A6A6A6" w:sz="4"/>
+              <w:bottom w:val="single" w:color="A6A6A6" w:sz="4"/>
+              <w:right w:val="single" w:color="A6A6A6" w:sz="4"/>
+            </w:tcBorders>
+            <w:tcMar>
+              <w:top w:type="dxa" w:w="80"/>
+              <w:left w:type="dxa" w:w="120"/>
+              <w:bottom w:type="dxa" w:w="80"/>
+              <w:right w:type="dxa" w:w="120"/>
+            </w:tcMar>
+          </w:tcPr>
+          <w:p>
+            <w:r>
+              <w:t>English and Pidgin are switched on at launch. Each user chooses their language in their settings, from the languages switched on for their country. Other languages (Yoruba, Igbo, Hausa, French) are added to that list when their translations are ready and checked.</w:t>
+            </w:r>
+          </w:p>
+        </w:tc>
+        <w:tc>
+          <w:tcPr>
+            <w:tcW w:type="dxa" w:w="1534"/>
+            <w:tcBorders>
+              <w:top w:val="single" w:color="A6A6A6" w:sz="4"/>
+              <w:left w:val="single" w:color="A6A6A6" w:sz="4"/>
+              <w:bottom w:val="single" w:color="A6A6A6" w:sz="4"/>
+              <w:right w:val="single" w:color="A6A6A6" w:sz="4"/>
+            </w:tcBorders>
+            <w:tcMar>
+              <w:top w:type="dxa" w:w="80"/>
+              <w:left w:type="dxa" w:w="120"/>
+              <w:bottom w:type="dxa" w:w="80"/>
+              <w:right w:type="dxa" w:w="120"/>
+            </w:tcMar>
+          </w:tcPr>
+          <w:p>
+            <w:r>
+              <w:t>23 Oct 2026</w:t>
+            </w:r>
+          </w:p>
+        </w:tc>
+      </w:tr>
+      <w:tr>
+        <w:tc>
+          <w:tcPr>
+            <w:tcW w:type="dxa" w:w="632"/>
+            <w:tcBorders>
+              <w:top w:val="single" w:color="A6A6A6" w:sz="4"/>
+              <w:left w:val="single" w:color="A6A6A6" w:sz="4"/>
+              <w:bottom w:val="single" w:color="A6A6A6" w:sz="4"/>
+              <w:right w:val="single" w:color="A6A6A6" w:sz="4"/>
+            </w:tcBorders>
+            <w:tcMar>
+              <w:top w:type="dxa" w:w="80"/>
+              <w:left w:type="dxa" w:w="120"/>
+              <w:bottom w:type="dxa" w:w="80"/>
+              <w:right w:type="dxa" w:w="120"/>
+            </w:tcMar>
+          </w:tcPr>
+          <w:p>
+            <w:r>
+              <w:t>41</w:t>
+            </w:r>
+          </w:p>
+        </w:tc>
+        <w:tc>
+          <w:tcPr>
+            <w:tcW w:type="dxa" w:w="1625"/>
+            <w:tcBorders>
+              <w:top w:val="single" w:color="A6A6A6" w:sz="4"/>
+              <w:left w:val="single" w:color="A6A6A6" w:sz="4"/>
+              <w:bottom w:val="single" w:color="A6A6A6" w:sz="4"/>
+              <w:right w:val="single" w:color="A6A6A6" w:sz="4"/>
+            </w:tcBorders>
+            <w:tcMar>
+              <w:top w:type="dxa" w:w="80"/>
+              <w:left w:type="dxa" w:w="120"/>
+              <w:bottom w:type="dxa" w:w="80"/>
+              <w:right w:type="dxa" w:w="120"/>
+            </w:tcMar>
+          </w:tcPr>
+          <w:p>
+            <w:r>
+              <w:t>Customer support</w:t>
+            </w:r>
+          </w:p>
+        </w:tc>
+        <w:tc>
+          <w:tcPr>
+            <w:tcW w:type="dxa" w:w="5235"/>
+            <w:tcBorders>
+              <w:top w:val="single" w:color="A6A6A6" w:sz="4"/>
+              <w:left w:val="single" w:color="A6A6A6" w:sz="4"/>
+              <w:bottom w:val="single" w:color="A6A6A6" w:sz="4"/>
+              <w:right w:val="single" w:color="A6A6A6" w:sz="4"/>
+            </w:tcBorders>
+            <w:tcMar>
+              <w:top w:type="dxa" w:w="80"/>
+              <w:left w:type="dxa" w:w="120"/>
+              <w:bottom w:type="dxa" w:w="80"/>
+              <w:right w:type="dxa" w:w="120"/>
+            </w:tcMar>
+          </w:tcPr>
+          <w:p>
+            <w:r>
+              <w:t>At launch: a help page in the app and website, plus WhatsApp and phone lines run by the support team. In-app support chat and tickets come in Release 2.</w:t>
+            </w:r>
+          </w:p>
+        </w:tc>
+        <w:tc>
+          <w:tcPr>
+            <w:tcW w:type="dxa" w:w="1534"/>
+            <w:tcBorders>
+              <w:top w:val="single" w:color="A6A6A6" w:sz="4"/>
+              <w:left w:val="single" w:color="A6A6A6" w:sz="4"/>
+              <w:bottom w:val="single" w:color="A6A6A6" w:sz="4"/>
+              <w:right w:val="single" w:color="A6A6A6" w:sz="4"/>
+            </w:tcBorders>
+            <w:tcMar>
+              <w:top w:type="dxa" w:w="80"/>
+              <w:left w:type="dxa" w:w="120"/>
+              <w:bottom w:type="dxa" w:w="80"/>
+              <w:right w:type="dxa" w:w="120"/>
+            </w:tcMar>
+          </w:tcPr>
+          <w:p>
+            <w:r>
+              <w:t>23 Oct 2026</w:t>
+            </w:r>
+          </w:p>
+        </w:tc>
+      </w:tr>
+      <w:tr>
+        <w:tc>
+          <w:tcPr>
+            <w:tcW w:type="dxa" w:w="632"/>
+            <w:tcBorders>
+              <w:top w:val="single" w:color="A6A6A6" w:sz="4"/>
+              <w:left w:val="single" w:color="A6A6A6" w:sz="4"/>
+              <w:bottom w:val="single" w:color="A6A6A6" w:sz="4"/>
+              <w:right w:val="single" w:color="A6A6A6" w:sz="4"/>
+            </w:tcBorders>
+            <w:tcMar>
+              <w:top w:type="dxa" w:w="80"/>
+              <w:left w:type="dxa" w:w="120"/>
+              <w:bottom w:type="dxa" w:w="80"/>
+              <w:right w:type="dxa" w:w="120"/>
+            </w:tcMar>
+          </w:tcPr>
+          <w:p>
+            <w:r>
+              <w:t>42</w:t>
+            </w:r>
+          </w:p>
+        </w:tc>
+        <w:tc>
+          <w:tcPr>
+            <w:tcW w:type="dxa" w:w="1625"/>
+            <w:tcBorders>
+              <w:top w:val="single" w:color="A6A6A6" w:sz="4"/>
+              <w:left w:val="single" w:color="A6A6A6" w:sz="4"/>
+              <w:bottom w:val="single" w:color="A6A6A6" w:sz="4"/>
+              <w:right w:val="single" w:color="A6A6A6" w:sz="4"/>
+            </w:tcBorders>
+            <w:tcMar>
+              <w:top w:type="dxa" w:w="80"/>
+              <w:left w:type="dxa" w:w="120"/>
+              <w:bottom w:type="dxa" w:w="80"/>
+              <w:right w:type="dxa" w:w="120"/>
+            </w:tcMar>
+          </w:tcPr>
+          <w:p>
+            <w:r>
+              <w:t>Screen designs and hosting</w:t>
+            </w:r>
+          </w:p>
+        </w:tc>
+        <w:tc>
+          <w:tcPr>
+            <w:tcW w:type="dxa" w:w="5235"/>
+            <w:tcBorders>
+              <w:top w:val="single" w:color="A6A6A6" w:sz="4"/>
+              <w:left w:val="single" w:color="A6A6A6" w:sz="4"/>
+              <w:bottom w:val="single" w:color="A6A6A6" w:sz="4"/>
+              <w:right w:val="single" w:color="A6A6A6" w:sz="4"/>
+            </w:tcBorders>
+            <w:tcMar>
+              <w:top w:type="dxa" w:w="80"/>
+              <w:left w:type="dxa" w:w="120"/>
+              <w:bottom w:type="dxa" w:w="80"/>
+              <w:right w:type="dxa" w:w="120"/>
+            </w:tcMar>
+          </w:tcPr>
+          <w:p>
+            <w:r>
+              <w:t>There will be no human designer. The screen designs are produced in the build sessions using the Figma connector, as a separate step, for Emmanuel's review and approval before the app screens are built. The hosting account (and so the test system) follows once the company has a dollar card.</w:t>
+            </w:r>
+          </w:p>
+        </w:tc>
+        <w:tc>
+          <w:tcPr>
+            <w:tcW w:type="dxa" w:w="1534"/>
+            <w:tcBorders>
+              <w:top w:val="single" w:color="A6A6A6" w:sz="4"/>
+              <w:left w:val="single" w:color="A6A6A6" w:sz="4"/>
+              <w:bottom w:val="single" w:color="A6A6A6" w:sz="4"/>
+              <w:right w:val="single" w:color="A6A6A6" w:sz="4"/>
+            </w:tcBorders>
+            <w:tcMar>
+              <w:top w:type="dxa" w:w="80"/>
+              <w:left w:type="dxa" w:w="120"/>
+              <w:bottom w:type="dxa" w:w="80"/>
+              <w:right w:type="dxa" w:w="120"/>
+            </w:tcMar>
+          </w:tcPr>
+          <w:p>
+            <w:r>
+              <w:t>23 Oct 2026</w:t>
+            </w:r>
+          </w:p>
+        </w:tc>
+      </w:tr>
+      <w:tr>
+        <w:tc>
+          <w:tcPr>
+            <w:tcW w:type="dxa" w:w="632"/>
+            <w:tcBorders>
+              <w:top w:val="single" w:color="A6A6A6" w:sz="4"/>
+              <w:left w:val="single" w:color="A6A6A6" w:sz="4"/>
+              <w:bottom w:val="single" w:color="A6A6A6" w:sz="4"/>
+              <w:right w:val="single" w:color="A6A6A6" w:sz="4"/>
+            </w:tcBorders>
+            <w:tcMar>
+              <w:top w:type="dxa" w:w="80"/>
+              <w:left w:type="dxa" w:w="120"/>
+              <w:bottom w:type="dxa" w:w="80"/>
+              <w:right w:type="dxa" w:w="120"/>
+            </w:tcMar>
+          </w:tcPr>
+          <w:p>
+            <w:r>
+              <w:t>43</w:t>
+            </w:r>
+          </w:p>
+        </w:tc>
+        <w:tc>
+          <w:tcPr>
+            <w:tcW w:type="dxa" w:w="1625"/>
+            <w:tcBorders>
+              <w:top w:val="single" w:color="A6A6A6" w:sz="4"/>
+              <w:left w:val="single" w:color="A6A6A6" w:sz="4"/>
+              <w:bottom w:val="single" w:color="A6A6A6" w:sz="4"/>
+              <w:right w:val="single" w:color="A6A6A6" w:sz="4"/>
+            </w:tcBorders>
+            <w:tcMar>
+              <w:top w:type="dxa" w:w="80"/>
+              <w:left w:type="dxa" w:w="120"/>
+              <w:bottom w:type="dxa" w:w="80"/>
+              <w:right w:type="dxa" w:w="120"/>
+            </w:tcMar>
+          </w:tcPr>
+          <w:p>
+            <w:r>
+              <w:t>Property registration</w:t>
+            </w:r>
+          </w:p>
+        </w:tc>
+        <w:tc>
+          <w:tcPr>
+            <w:tcW w:type="dxa" w:w="5235"/>
+            <w:tcBorders>
+              <w:top w:val="single" w:color="A6A6A6" w:sz="4"/>
+              <w:left w:val="single" w:color="A6A6A6" w:sz="4"/>
+              <w:bottom w:val="single" w:color="A6A6A6" w:sz="4"/>
+              <w:right w:val="single" w:color="A6A6A6" w:sz="4"/>
+            </w:tcBorders>
+            <w:tcMar>
+              <w:top w:type="dxa" w:w="80"/>
+              <w:left w:type="dxa" w:w="120"/>
+              <w:bottom w:type="dxa" w:w="80"/>
+              <w:right w:type="dxa" w:w="120"/>
+            </w:tcMar>
+          </w:tcPr>
+          <w:p>
+            <w:r>
+              <w:t>Landlords do all of their own building registration; the platform does not register properties for them. Field officers only carry out verification checks, because the manpower needed for the platform to register properties itself is not realistic. This replaces field-team property capture in Specification Section 20 and Technical Architecture Sections 3 and 5.</w:t>
+            </w:r>
+          </w:p>
+        </w:tc>
+        <w:tc>
+          <w:tcPr>
+            <w:tcW w:type="dxa" w:w="1534"/>
+            <w:tcBorders>
+              <w:top w:val="single" w:color="A6A6A6" w:sz="4"/>
+              <w:left w:val="single" w:color="A6A6A6" w:sz="4"/>
+              <w:bottom w:val="single" w:color="A6A6A6" w:sz="4"/>
+              <w:right w:val="single" w:color="A6A6A6" w:sz="4"/>
+            </w:tcBorders>
+            <w:tcMar>
+              <w:top w:type="dxa" w:w="80"/>
+              <w:left w:type="dxa" w:w="120"/>
+              <w:bottom w:type="dxa" w:w="80"/>
+              <w:right w:type="dxa" w:w="120"/>
+            </w:tcMar>
+          </w:tcPr>
+          <w:p>
+            <w:r>
+              <w:t>23 Oct 2026</w:t>
+            </w:r>
+          </w:p>
+        </w:tc>
+      </w:tr>
+      <w:tr>
+        <w:tc>
+          <w:tcPr>
+            <w:tcW w:type="dxa" w:w="632"/>
+            <w:tcBorders>
+              <w:top w:val="single" w:color="A6A6A6" w:sz="4"/>
+              <w:left w:val="single" w:color="A6A6A6" w:sz="4"/>
+              <w:bottom w:val="single" w:color="A6A6A6" w:sz="4"/>
+              <w:right w:val="single" w:color="A6A6A6" w:sz="4"/>
+            </w:tcBorders>
+            <w:tcMar>
+              <w:top w:type="dxa" w:w="80"/>
+              <w:left w:type="dxa" w:w="120"/>
+              <w:bottom w:type="dxa" w:w="80"/>
+              <w:right w:type="dxa" w:w="120"/>
+            </w:tcMar>
+          </w:tcPr>
+          <w:p>
+            <w:r>
+              <w:t>44</w:t>
+            </w:r>
+          </w:p>
+        </w:tc>
+        <w:tc>
+          <w:tcPr>
+            <w:tcW w:type="dxa" w:w="1625"/>
+            <w:tcBorders>
+              <w:top w:val="single" w:color="A6A6A6" w:sz="4"/>
+              <w:left w:val="single" w:color="A6A6A6" w:sz="4"/>
+              <w:bottom w:val="single" w:color="A6A6A6" w:sz="4"/>
+              <w:right w:val="single" w:color="A6A6A6" w:sz="4"/>
+            </w:tcBorders>
+            <w:tcMar>
+              <w:top w:type="dxa" w:w="80"/>
+              <w:left w:type="dxa" w:w="120"/>
+              <w:bottom w:type="dxa" w:w="80"/>
+              <w:right w:type="dxa" w:w="120"/>
+            </w:tcMar>
+          </w:tcPr>
+          <w:p>
+            <w:r>
+              <w:t>Calling</w:t>
+            </w:r>
+          </w:p>
+        </w:tc>
+        <w:tc>
+          <w:tcPr>
+            <w:tcW w:type="dxa" w:w="5235"/>
+            <w:tcBorders>
+              <w:top w:val="single" w:color="A6A6A6" w:sz="4"/>
+              <w:left w:val="single" w:color="A6A6A6" w:sz="4"/>
+              <w:bottom w:val="single" w:color="A6A6A6" w:sz="4"/>
+              <w:right w:val="single" w:color="A6A6A6" w:sz="4"/>
+            </w:tcBorders>
+            <w:tcMar>
+              <w:top w:type="dxa" w:w="80"/>
+              <w:left w:type="dxa" w:w="120"/>
+              <w:bottom w:type="dxa" w:w="80"/>
+              <w:right w:type="dxa" w:w="120"/>
+            </w:tcMar>
+          </w:tcPr>
+          <w:p>
+            <w:r>
+              <w:t>Calling inside the app (voice calls over the internet, with phone numbers kept hidden) is part of Release 1.</w:t>
+            </w:r>
+          </w:p>
+        </w:tc>
+        <w:tc>
+          <w:tcPr>
+            <w:tcW w:type="dxa" w:w="1534"/>
+            <w:tcBorders>
+              <w:top w:val="single" w:color="A6A6A6" w:sz="4"/>
+              <w:left w:val="single" w:color="A6A6A6" w:sz="4"/>
+              <w:bottom w:val="single" w:color="A6A6A6" w:sz="4"/>
+              <w:right w:val="single" w:color="A6A6A6" w:sz="4"/>
+            </w:tcBorders>
+            <w:tcMar>
+              <w:top w:type="dxa" w:w="80"/>
+              <w:left w:type="dxa" w:w="120"/>
+              <w:bottom w:type="dxa" w:w="80"/>
+              <w:right w:type="dxa" w:w="120"/>
+            </w:tcMar>
+          </w:tcPr>
+          <w:p>
+            <w:r>
+              <w:t>23 Oct 2026</w:t>
+            </w:r>
+          </w:p>
+        </w:tc>
+      </w:tr>
+      <w:tr>
+        <w:tc>
+          <w:tcPr>
+            <w:tcW w:type="dxa" w:w="632"/>
+            <w:tcBorders>
+              <w:top w:val="single" w:color="A6A6A6" w:sz="4"/>
+              <w:left w:val="single" w:color="A6A6A6" w:sz="4"/>
+              <w:bottom w:val="single" w:color="A6A6A6" w:sz="4"/>
+              <w:right w:val="single" w:color="A6A6A6" w:sz="4"/>
+            </w:tcBorders>
+            <w:tcMar>
+              <w:top w:type="dxa" w:w="80"/>
+              <w:left w:type="dxa" w:w="120"/>
+              <w:bottom w:type="dxa" w:w="80"/>
+              <w:right w:type="dxa" w:w="120"/>
+            </w:tcMar>
+          </w:tcPr>
+          <w:p>
+            <w:r>
+              <w:t>45</w:t>
+            </w:r>
+          </w:p>
+        </w:tc>
+        <w:tc>
+          <w:tcPr>
+            <w:tcW w:type="dxa" w:w="1625"/>
+            <w:tcBorders>
+              <w:top w:val="single" w:color="A6A6A6" w:sz="4"/>
+              <w:left w:val="single" w:color="A6A6A6" w:sz="4"/>
+              <w:bottom w:val="single" w:color="A6A6A6" w:sz="4"/>
+              <w:right w:val="single" w:color="A6A6A6" w:sz="4"/>
+            </w:tcBorders>
+            <w:tcMar>
+              <w:top w:type="dxa" w:w="80"/>
+              <w:left w:type="dxa" w:w="120"/>
+              <w:bottom w:type="dxa" w:w="80"/>
+              <w:right w:type="dxa" w:w="120"/>
+            </w:tcMar>
+          </w:tcPr>
+          <w:p>
+            <w:r>
+              <w:t>Inspections</w:t>
+            </w:r>
+          </w:p>
+        </w:tc>
+        <w:tc>
+          <w:tcPr>
+            <w:tcW w:type="dxa" w:w="5235"/>
+            <w:tcBorders>
+              <w:top w:val="single" w:color="A6A6A6" w:sz="4"/>
+              <w:left w:val="single" w:color="A6A6A6" w:sz="4"/>
+              <w:bottom w:val="single" w:color="A6A6A6" w:sz="4"/>
+              <w:right w:val="single" w:color="A6A6A6" w:sz="4"/>
+            </w:tcBorders>
+            <w:tcMar>
+              <w:top w:type="dxa" w:w="80"/>
+              <w:left w:type="dxa" w:w="120"/>
+              <w:bottom w:type="dxa" w:w="80"/>
+              <w:right w:type="dxa" w:w="120"/>
+            </w:tcMar>
+          </w:tcPr>
+          <w:p>
+            <w:r>
+              <w:t>Landlords and agents set the times they are available for inspections; tenants book by choosing one of the free time slots. The lister then confirms or reschedules as designed.</w:t>
+            </w:r>
+          </w:p>
+        </w:tc>
+        <w:tc>
+          <w:tcPr>
+            <w:tcW w:type="dxa" w:w="1534"/>
+            <w:tcBorders>
+              <w:top w:val="single" w:color="A6A6A6" w:sz="4"/>
+              <w:left w:val="single" w:color="A6A6A6" w:sz="4"/>
+              <w:bottom w:val="single" w:color="A6A6A6" w:sz="4"/>
+              <w:right w:val="single" w:color="A6A6A6" w:sz="4"/>
+            </w:tcBorders>
+            <w:tcMar>
+              <w:top w:type="dxa" w:w="80"/>
+              <w:left w:type="dxa" w:w="120"/>
+              <w:bottom w:type="dxa" w:w="80"/>
+              <w:right w:type="dxa" w:w="120"/>
+            </w:tcMar>
+          </w:tcPr>
+          <w:p>
+            <w:r>
+              <w:t>23 Oct 2026</w:t>
+            </w:r>
+          </w:p>
+        </w:tc>
+      </w:tr>
+      <w:tr>
+        <w:tc>
+          <w:tcPr>
+            <w:tcW w:type="dxa" w:w="632"/>
+            <w:tcBorders>
+              <w:top w:val="single" w:color="A6A6A6" w:sz="4"/>
+              <w:left w:val="single" w:color="A6A6A6" w:sz="4"/>
+              <w:bottom w:val="single" w:color="A6A6A6" w:sz="4"/>
+              <w:right w:val="single" w:color="A6A6A6" w:sz="4"/>
+            </w:tcBorders>
+            <w:tcMar>
+              <w:top w:type="dxa" w:w="80"/>
+              <w:left w:type="dxa" w:w="120"/>
+              <w:bottom w:type="dxa" w:w="80"/>
+              <w:right w:type="dxa" w:w="120"/>
+            </w:tcMar>
+          </w:tcPr>
+          <w:p>
+            <w:r>
+              <w:t>46</w:t>
+            </w:r>
+          </w:p>
+        </w:tc>
+        <w:tc>
+          <w:tcPr>
+            <w:tcW w:type="dxa" w:w="1625"/>
+            <w:tcBorders>
+              <w:top w:val="single" w:color="A6A6A6" w:sz="4"/>
+              <w:left w:val="single" w:color="A6A6A6" w:sz="4"/>
+              <w:bottom w:val="single" w:color="A6A6A6" w:sz="4"/>
+              <w:right w:val="single" w:color="A6A6A6" w:sz="4"/>
+            </w:tcBorders>
+            <w:tcMar>
+              <w:top w:type="dxa" w:w="80"/>
+              <w:left w:type="dxa" w:w="120"/>
+              <w:bottom w:type="dxa" w:w="80"/>
+              <w:right w:type="dxa" w:w="120"/>
+            </w:tcMar>
+          </w:tcPr>
+          <w:p>
+            <w:r>
+              <w:t>Notifications</w:t>
+            </w:r>
+          </w:p>
+        </w:tc>
+        <w:tc>
+          <w:tcPr>
+            <w:tcW w:type="dxa" w:w="5235"/>
+            <w:tcBorders>
+              <w:top w:val="single" w:color="A6A6A6" w:sz="4"/>
+              <w:left w:val="single" w:color="A6A6A6" w:sz="4"/>
+              <w:bottom w:val="single" w:color="A6A6A6" w:sz="4"/>
+              <w:right w:val="single" w:color="A6A6A6" w:sz="4"/>
+            </w:tcBorders>
+            <w:tcMar>
+              <w:top w:type="dxa" w:w="80"/>
+              <w:left w:type="dxa" w:w="120"/>
+              <w:bottom w:type="dxa" w:w="80"/>
+              <w:right w:type="dxa" w:w="120"/>
+            </w:tcMar>
+          </w:tcPr>
+          <w:p>
+            <w:r>
+              <w:t>Release 1 includes push notifications (each phone registered for them) and notification settings for each user: which notifications they receive and by which channel (push, email or SMS). Security messages (codes and sign-in alerts) cannot be switched off.</w:t>
+            </w:r>
+          </w:p>
+        </w:tc>
+        <w:tc>
+          <w:tcPr>
+            <w:tcW w:type="dxa" w:w="1534"/>
+            <w:tcBorders>
+              <w:top w:val="single" w:color="A6A6A6" w:sz="4"/>
+              <w:left w:val="single" w:color="A6A6A6" w:sz="4"/>
+              <w:bottom w:val="single" w:color="A6A6A6" w:sz="4"/>
+              <w:right w:val="single" w:color="A6A6A6" w:sz="4"/>
+            </w:tcBorders>
+            <w:tcMar>
+              <w:top w:type="dxa" w:w="80"/>
+              <w:left w:type="dxa" w:w="120"/>
+              <w:bottom w:type="dxa" w:w="80"/>
+              <w:right w:type="dxa" w:w="120"/>
+            </w:tcMar>
+          </w:tcPr>
+          <w:p>
+            <w:r>
+              <w:t>23 Oct 2026</w:t>
+            </w:r>
+          </w:p>
+        </w:tc>
+      </w:tr>
+      <w:tr>
+        <w:tc>
+          <w:tcPr>
+            <w:tcW w:type="dxa" w:w="632"/>
+            <w:tcBorders>
+              <w:top w:val="single" w:color="A6A6A6" w:sz="4"/>
+              <w:left w:val="single" w:color="A6A6A6" w:sz="4"/>
+              <w:bottom w:val="single" w:color="A6A6A6" w:sz="4"/>
+              <w:right w:val="single" w:color="A6A6A6" w:sz="4"/>
+            </w:tcBorders>
+            <w:tcMar>
+              <w:top w:type="dxa" w:w="80"/>
+              <w:left w:type="dxa" w:w="120"/>
+              <w:bottom w:type="dxa" w:w="80"/>
+              <w:right w:type="dxa" w:w="120"/>
+            </w:tcMar>
+          </w:tcPr>
+          <w:p>
+            <w:r>
+              <w:t>47</w:t>
+            </w:r>
+          </w:p>
+        </w:tc>
+        <w:tc>
+          <w:tcPr>
+            <w:tcW w:type="dxa" w:w="1625"/>
+            <w:tcBorders>
+              <w:top w:val="single" w:color="A6A6A6" w:sz="4"/>
+              <w:left w:val="single" w:color="A6A6A6" w:sz="4"/>
+              <w:bottom w:val="single" w:color="A6A6A6" w:sz="4"/>
+              <w:right w:val="single" w:color="A6A6A6" w:sz="4"/>
+            </w:tcBorders>
+            <w:tcMar>
+              <w:top w:type="dxa" w:w="80"/>
+              <w:left w:type="dxa" w:w="120"/>
+              <w:bottom w:type="dxa" w:w="80"/>
+              <w:right w:type="dxa" w:w="120"/>
+            </w:tcMar>
+          </w:tcPr>
+          <w:p>
+            <w:r>
+              <w:t>Live updates</w:t>
+            </w:r>
+          </w:p>
+        </w:tc>
+        <w:tc>
+          <w:tcPr>
+            <w:tcW w:type="dxa" w:w="5235"/>
+            <w:tcBorders>
+              <w:top w:val="single" w:color="A6A6A6" w:sz="4"/>
+              <w:left w:val="single" w:color="A6A6A6" w:sz="4"/>
+              <w:bottom w:val="single" w:color="A6A6A6" w:sz="4"/>
+              <w:right w:val="single" w:color="A6A6A6" w:sz="4"/>
+            </w:tcBorders>
+            <w:tcMar>
+              <w:top w:type="dxa" w:w="80"/>
+              <w:left w:type="dxa" w:w="120"/>
+              <w:bottom w:type="dxa" w:w="80"/>
+              <w:right w:type="dxa" w:w="120"/>
+            </w:tcMar>
+          </w:tcPr>
+          <w:p>
+            <w:r>
+              <w:t>Release 1 includes a live connection for chat messages and inspection status, with push notifications when the app is closed.</w:t>
+            </w:r>
+          </w:p>
+        </w:tc>
+        <w:tc>
+          <w:tcPr>
+            <w:tcW w:type="dxa" w:w="1534"/>
+            <w:tcBorders>
+              <w:top w:val="single" w:color="A6A6A6" w:sz="4"/>
+              <w:left w:val="single" w:color="A6A6A6" w:sz="4"/>
+              <w:bottom w:val="single" w:color="A6A6A6" w:sz="4"/>
+              <w:right w:val="single" w:color="A6A6A6" w:sz="4"/>
+            </w:tcBorders>
+            <w:tcMar>
+              <w:top w:type="dxa" w:w="80"/>
+              <w:left w:type="dxa" w:w="120"/>
+              <w:bottom w:type="dxa" w:w="80"/>
+              <w:right w:type="dxa" w:w="120"/>
+            </w:tcMar>
+          </w:tcPr>
+          <w:p>
+            <w:r>
+              <w:t>23 Oct 2026</w:t>
+            </w:r>
+          </w:p>
+        </w:tc>
+      </w:tr>
+      <w:tr>
+        <w:tc>
+          <w:tcPr>
+            <w:tcW w:type="dxa" w:w="632"/>
+            <w:tcBorders>
+              <w:top w:val="single" w:color="A6A6A6" w:sz="4"/>
+              <w:left w:val="single" w:color="A6A6A6" w:sz="4"/>
+              <w:bottom w:val="single" w:color="A6A6A6" w:sz="4"/>
+              <w:right w:val="single" w:color="A6A6A6" w:sz="4"/>
+            </w:tcBorders>
+            <w:tcMar>
+              <w:top w:type="dxa" w:w="80"/>
+              <w:left w:type="dxa" w:w="120"/>
+              <w:bottom w:type="dxa" w:w="80"/>
+              <w:right w:type="dxa" w:w="120"/>
+            </w:tcMar>
+          </w:tcPr>
+          <w:p>
+            <w:r>
+              <w:t>48</w:t>
+            </w:r>
+          </w:p>
+        </w:tc>
+        <w:tc>
+          <w:tcPr>
+            <w:tcW w:type="dxa" w:w="1625"/>
+            <w:tcBorders>
+              <w:top w:val="single" w:color="A6A6A6" w:sz="4"/>
+              <w:left w:val="single" w:color="A6A6A6" w:sz="4"/>
+              <w:bottom w:val="single" w:color="A6A6A6" w:sz="4"/>
+              <w:right w:val="single" w:color="A6A6A6" w:sz="4"/>
+            </w:tcBorders>
+            <w:tcMar>
+              <w:top w:type="dxa" w:w="80"/>
+              <w:left w:type="dxa" w:w="120"/>
+              <w:bottom w:type="dxa" w:w="80"/>
+              <w:right w:type="dxa" w:w="120"/>
+            </w:tcMar>
+          </w:tcPr>
+          <w:p>
+            <w:r>
+              <w:t>Saved places</w:t>
+            </w:r>
+          </w:p>
+        </w:tc>
+        <w:tc>
+          <w:tcPr>
+            <w:tcW w:type="dxa" w:w="5235"/>
+            <w:tcBorders>
+              <w:top w:val="single" w:color="A6A6A6" w:sz="4"/>
+              <w:left w:val="single" w:color="A6A6A6" w:sz="4"/>
+              <w:bottom w:val="single" w:color="A6A6A6" w:sz="4"/>
+              <w:right w:val="single" w:color="A6A6A6" w:sz="4"/>
+            </w:tcBorders>
+            <w:tcMar>
+              <w:top w:type="dxa" w:w="80"/>
+              <w:left w:type="dxa" w:w="120"/>
+              <w:bottom w:type="dxa" w:w="80"/>
+              <w:right w:type="dxa" w:w="120"/>
+            </w:tcMar>
+          </w:tcPr>
+          <w:p>
+            <w:r>
+              <w:t>Tenants can save places of their choosing (a name and a location, such as an office or school), and the property page shows the travel distance to them. Built in Release 1 step 5 or later in Release 1.</w:t>
+            </w:r>
+          </w:p>
+        </w:tc>
+        <w:tc>
+          <w:tcPr>
+            <w:tcW w:type="dxa" w:w="1534"/>
+            <w:tcBorders>
+              <w:top w:val="single" w:color="A6A6A6" w:sz="4"/>
+              <w:left w:val="single" w:color="A6A6A6" w:sz="4"/>
+              <w:bottom w:val="single" w:color="A6A6A6" w:sz="4"/>
+              <w:right w:val="single" w:color="A6A6A6" w:sz="4"/>
+            </w:tcBorders>
+            <w:tcMar>
+              <w:top w:type="dxa" w:w="80"/>
+              <w:left w:type="dxa" w:w="120"/>
+              <w:bottom w:type="dxa" w:w="80"/>
+              <w:right w:type="dxa" w:w="120"/>
+            </w:tcMar>
+          </w:tcPr>
+          <w:p>
+            <w:r>
+              <w:t>23 Oct 2026</w:t>
+            </w:r>
+          </w:p>
+        </w:tc>
+      </w:tr>
+      <w:tr>
+        <w:tc>
+          <w:tcPr>
+            <w:tcW w:type="dxa" w:w="632"/>
+            <w:tcBorders>
+              <w:top w:val="single" w:color="A6A6A6" w:sz="4"/>
+              <w:left w:val="single" w:color="A6A6A6" w:sz="4"/>
+              <w:bottom w:val="single" w:color="A6A6A6" w:sz="4"/>
+              <w:right w:val="single" w:color="A6A6A6" w:sz="4"/>
+            </w:tcBorders>
+            <w:tcMar>
+              <w:top w:type="dxa" w:w="80"/>
+              <w:left w:type="dxa" w:w="120"/>
+              <w:bottom w:type="dxa" w:w="80"/>
+              <w:right w:type="dxa" w:w="120"/>
+            </w:tcMar>
+          </w:tcPr>
+          <w:p>
+            <w:r>
+              <w:t>49</w:t>
+            </w:r>
+          </w:p>
+        </w:tc>
+        <w:tc>
+          <w:tcPr>
+            <w:tcW w:type="dxa" w:w="1625"/>
+            <w:tcBorders>
+              <w:top w:val="single" w:color="A6A6A6" w:sz="4"/>
+              <w:left w:val="single" w:color="A6A6A6" w:sz="4"/>
+              <w:bottom w:val="single" w:color="A6A6A6" w:sz="4"/>
+              <w:right w:val="single" w:color="A6A6A6" w:sz="4"/>
+            </w:tcBorders>
+            <w:tcMar>
+              <w:top w:type="dxa" w:w="80"/>
+              <w:left w:type="dxa" w:w="120"/>
+              <w:bottom w:type="dxa" w:w="80"/>
+              <w:right w:type="dxa" w:w="120"/>
+            </w:tcMar>
+          </w:tcPr>
+          <w:p>
+            <w:r>
+              <w:t>Identity document</w:t>
+            </w:r>
+          </w:p>
+        </w:tc>
+        <w:tc>
+          <w:tcPr>
+            <w:tcW w:type="dxa" w:w="5235"/>
+            <w:tcBorders>
+              <w:top w:val="single" w:color="A6A6A6" w:sz="4"/>
+              <w:left w:val="single" w:color="A6A6A6" w:sz="4"/>
+              <w:bottom w:val="single" w:color="A6A6A6" w:sz="4"/>
+              <w:right w:val="single" w:color="A6A6A6" w:sz="4"/>
+            </w:tcBorders>
+            <w:tcMar>
+              <w:top w:type="dxa" w:w="80"/>
+              <w:left w:type="dxa" w:w="120"/>
+              <w:bottom w:type="dxa" w:w="80"/>
+              <w:right w:type="dxa" w:w="120"/>
+            </w:tcMar>
+          </w:tcPr>
+          <w:p>
+            <w:r>
+              <w:t>No document photo is asked for by default at level 2. A document photo is asked for only when the NIN check fails or the details do not match. Accepted documents: driver's licence, international passport and NIN slip. (Settles open point 14.)</w:t>
+            </w:r>
+          </w:p>
+        </w:tc>
+        <w:tc>
+          <w:tcPr>
+            <w:tcW w:type="dxa" w:w="1534"/>
+            <w:tcBorders>
+              <w:top w:val="single" w:color="A6A6A6" w:sz="4"/>
+              <w:left w:val="single" w:color="A6A6A6" w:sz="4"/>
+              <w:bottom w:val="single" w:color="A6A6A6" w:sz="4"/>
+              <w:right w:val="single" w:color="A6A6A6" w:sz="4"/>
+            </w:tcBorders>
+            <w:tcMar>
+              <w:top w:type="dxa" w:w="80"/>
+              <w:left w:type="dxa" w:w="120"/>
+              <w:bottom w:type="dxa" w:w="80"/>
+              <w:right w:type="dxa" w:w="120"/>
+            </w:tcMar>
+          </w:tcPr>
+          <w:p>
+            <w:r>
+              <w:t>23 Oct 2026</w:t>
+            </w:r>
+          </w:p>
+        </w:tc>
+      </w:tr>
+      <w:tr>
+        <w:tc>
+          <w:tcPr>
+            <w:tcW w:type="dxa" w:w="632"/>
+            <w:tcBorders>
+              <w:top w:val="single" w:color="A6A6A6" w:sz="4"/>
+              <w:left w:val="single" w:color="A6A6A6" w:sz="4"/>
+              <w:bottom w:val="single" w:color="A6A6A6" w:sz="4"/>
+              <w:right w:val="single" w:color="A6A6A6" w:sz="4"/>
+            </w:tcBorders>
+            <w:tcMar>
+              <w:top w:type="dxa" w:w="80"/>
+              <w:left w:type="dxa" w:w="120"/>
+              <w:bottom w:type="dxa" w:w="80"/>
+              <w:right w:type="dxa" w:w="120"/>
+            </w:tcMar>
+          </w:tcPr>
+          <w:p>
+            <w:r>
+              <w:t>50</w:t>
+            </w:r>
+          </w:p>
+        </w:tc>
+        <w:tc>
+          <w:tcPr>
+            <w:tcW w:type="dxa" w:w="1625"/>
+            <w:tcBorders>
+              <w:top w:val="single" w:color="A6A6A6" w:sz="4"/>
+              <w:left w:val="single" w:color="A6A6A6" w:sz="4"/>
+              <w:bottom w:val="single" w:color="A6A6A6" w:sz="4"/>
+              <w:right w:val="single" w:color="A6A6A6" w:sz="4"/>
+            </w:tcBorders>
+            <w:tcMar>
+              <w:top w:type="dxa" w:w="80"/>
+              <w:left w:type="dxa" w:w="120"/>
+              <w:bottom w:type="dxa" w:w="80"/>
+              <w:right w:type="dxa" w:w="120"/>
+            </w:tcMar>
+          </w:tcPr>
+          <w:p>
+            <w:r>
+              <w:t>Agent company details</w:t>
+            </w:r>
+          </w:p>
+        </w:tc>
+        <w:tc>
+          <w:tcPr>
+            <w:tcW w:type="dxa" w:w="5235"/>
+            <w:tcBorders>
+              <w:top w:val="single" w:color="A6A6A6" w:sz="4"/>
+              <w:left w:val="single" w:color="A6A6A6" w:sz="4"/>
+              <w:bottom w:val="single" w:color="A6A6A6" w:sz="4"/>
+              <w:right w:val="single" w:color="A6A6A6" w:sz="4"/>
+            </w:tcBorders>
+            <w:tcMar>
+              <w:top w:type="dxa" w:w="80"/>
+              <w:left w:type="dxa" w:w="120"/>
+              <w:bottom w:type="dxa" w:w="80"/>
+              <w:right w:type="dxa" w:w="120"/>
+            </w:tcMar>
+          </w:tcPr>
+          <w:p>
+            <w:r>
+              <w:t>Agents can add their company details (business name and registration number) to their profile in Release 1 step 3, checked by the verification team.</w:t>
+            </w:r>
+          </w:p>
+        </w:tc>
+        <w:tc>
+          <w:tcPr>
+            <w:tcW w:type="dxa" w:w="1534"/>
+            <w:tcBorders>
+              <w:top w:val="single" w:color="A6A6A6" w:sz="4"/>
+              <w:left w:val="single" w:color="A6A6A6" w:sz="4"/>
+              <w:bottom w:val="single" w:color="A6A6A6" w:sz="4"/>
+              <w:right w:val="single" w:color="A6A6A6" w:sz="4"/>
+            </w:tcBorders>
+            <w:tcMar>
+              <w:top w:type="dxa" w:w="80"/>
+              <w:left w:type="dxa" w:w="120"/>
+              <w:bottom w:type="dxa" w:w="80"/>
+              <w:right w:type="dxa" w:w="120"/>
+            </w:tcMar>
+          </w:tcPr>
+          <w:p>
+            <w:r>
+              <w:t>23 Oct 2026</w:t>
+            </w:r>
+          </w:p>
+        </w:tc>
+      </w:tr>
+      <w:tr>
+        <w:tc>
+          <w:tcPr>
+            <w:tcW w:type="dxa" w:w="632"/>
+            <w:tcBorders>
+              <w:top w:val="single" w:color="A6A6A6" w:sz="4"/>
+              <w:left w:val="single" w:color="A6A6A6" w:sz="4"/>
+              <w:bottom w:val="single" w:color="A6A6A6" w:sz="4"/>
+              <w:right w:val="single" w:color="A6A6A6" w:sz="4"/>
+            </w:tcBorders>
+            <w:tcMar>
+              <w:top w:type="dxa" w:w="80"/>
+              <w:left w:type="dxa" w:w="120"/>
+              <w:bottom w:type="dxa" w:w="80"/>
+              <w:right w:type="dxa" w:w="120"/>
+            </w:tcMar>
+          </w:tcPr>
+          <w:p>
+            <w:r>
+              <w:t>51</w:t>
+            </w:r>
+          </w:p>
+        </w:tc>
+        <w:tc>
+          <w:tcPr>
+            <w:tcW w:type="dxa" w:w="1625"/>
+            <w:tcBorders>
+              <w:top w:val="single" w:color="A6A6A6" w:sz="4"/>
+              <w:left w:val="single" w:color="A6A6A6" w:sz="4"/>
+              <w:bottom w:val="single" w:color="A6A6A6" w:sz="4"/>
+              <w:right w:val="single" w:color="A6A6A6" w:sz="4"/>
+            </w:tcBorders>
+            <w:tcMar>
+              <w:top w:type="dxa" w:w="80"/>
+              <w:left w:type="dxa" w:w="120"/>
+              <w:bottom w:type="dxa" w:w="80"/>
+              <w:right w:type="dxa" w:w="120"/>
+            </w:tcMar>
+          </w:tcPr>
+          <w:p>
+            <w:r>
+              <w:t>Enforcement</w:t>
+            </w:r>
+          </w:p>
+        </w:tc>
+        <w:tc>
+          <w:tcPr>
+            <w:tcW w:type="dxa" w:w="5235"/>
+            <w:tcBorders>
+              <w:top w:val="single" w:color="A6A6A6" w:sz="4"/>
+              <w:left w:val="single" w:color="A6A6A6" w:sz="4"/>
+              <w:bottom w:val="single" w:color="A6A6A6" w:sz="4"/>
+              <w:right w:val="single" w:color="A6A6A6" w:sz="4"/>
+            </w:tcBorders>
+            <w:tcMar>
+              <w:top w:type="dxa" w:w="80"/>
+              <w:left w:type="dxa" w:w="120"/>
+              <w:bottom w:type="dxa" w:w="80"/>
+              <w:right w:type="dxa" w:w="120"/>
+            </w:tcMar>
+          </w:tcPr>
+          <w:p>
+            <w:r>
+              <w:t>Staff review decisions can also remove a verified badge and ban a user, each recorded against the user's verified identity.</w:t>
+            </w:r>
+          </w:p>
+        </w:tc>
+        <w:tc>
+          <w:tcPr>
+            <w:tcW w:type="dxa" w:w="1534"/>
+            <w:tcBorders>
+              <w:top w:val="single" w:color="A6A6A6" w:sz="4"/>
+              <w:left w:val="single" w:color="A6A6A6" w:sz="4"/>
+              <w:bottom w:val="single" w:color="A6A6A6" w:sz="4"/>
+              <w:right w:val="single" w:color="A6A6A6" w:sz="4"/>
+            </w:tcBorders>
+            <w:tcMar>
+              <w:top w:type="dxa" w:w="80"/>
+              <w:left w:type="dxa" w:w="120"/>
+              <w:bottom w:type="dxa" w:w="80"/>
+              <w:right w:type="dxa" w:w="120"/>
+            </w:tcMar>
+          </w:tcPr>
+          <w:p>
+            <w:r>
+              <w:t>23 Oct 2026</w:t>
+            </w:r>
+          </w:p>
+        </w:tc>
+      </w:tr>
+      <w:tr>
+        <w:tc>
+          <w:tcPr>
+            <w:tcW w:type="dxa" w:w="632"/>
+            <w:tcBorders>
+              <w:top w:val="single" w:color="A6A6A6" w:sz="4"/>
+              <w:left w:val="single" w:color="A6A6A6" w:sz="4"/>
+              <w:bottom w:val="single" w:color="A6A6A6" w:sz="4"/>
+              <w:right w:val="single" w:color="A6A6A6" w:sz="4"/>
+            </w:tcBorders>
+            <w:tcMar>
+              <w:top w:type="dxa" w:w="80"/>
+              <w:left w:type="dxa" w:w="120"/>
+              <w:bottom w:type="dxa" w:w="80"/>
+              <w:right w:type="dxa" w:w="120"/>
+            </w:tcMar>
+          </w:tcPr>
+          <w:p>
+            <w:r>
+              <w:t>52</w:t>
+            </w:r>
+          </w:p>
+        </w:tc>
+        <w:tc>
+          <w:tcPr>
+            <w:tcW w:type="dxa" w:w="1625"/>
+            <w:tcBorders>
+              <w:top w:val="single" w:color="A6A6A6" w:sz="4"/>
+              <w:left w:val="single" w:color="A6A6A6" w:sz="4"/>
+              <w:bottom w:val="single" w:color="A6A6A6" w:sz="4"/>
+              <w:right w:val="single" w:color="A6A6A6" w:sz="4"/>
+            </w:tcBorders>
+            <w:tcMar>
+              <w:top w:type="dxa" w:w="80"/>
+              <w:left w:type="dxa" w:w="120"/>
+              <w:bottom w:type="dxa" w:w="80"/>
+              <w:right w:type="dxa" w:w="120"/>
+            </w:tcMar>
+          </w:tcPr>
+          <w:p>
+            <w:r>
+              <w:t>Copy protection</w:t>
+            </w:r>
+          </w:p>
+        </w:tc>
+        <w:tc>
+          <w:tcPr>
+            <w:tcW w:type="dxa" w:w="5235"/>
+            <w:tcBorders>
+              <w:top w:val="single" w:color="A6A6A6" w:sz="4"/>
+              <w:left w:val="single" w:color="A6A6A6" w:sz="4"/>
+              <w:bottom w:val="single" w:color="A6A6A6" w:sz="4"/>
+              <w:right w:val="single" w:color="A6A6A6" w:sz="4"/>
+            </w:tcBorders>
+            <w:tcMar>
+              <w:top w:type="dxa" w:w="80"/>
+              <w:left w:type="dxa" w:w="120"/>
+              <w:bottom w:type="dxa" w:w="80"/>
+              <w:right w:type="dxa" w:w="120"/>
+            </w:tcMar>
+          </w:tcPr>
+          <w:p>
+            <w:r>
+              <w:t>Limits per account on viewing listings and photos, counted in Redis so every server shares them, are built with search and the property page.</w:t>
+            </w:r>
+          </w:p>
+        </w:tc>
+        <w:tc>
+          <w:tcPr>
+            <w:tcW w:type="dxa" w:w="1534"/>
+            <w:tcBorders>
+              <w:top w:val="single" w:color="A6A6A6" w:sz="4"/>
+              <w:left w:val="single" w:color="A6A6A6" w:sz="4"/>
+              <w:bottom w:val="single" w:color="A6A6A6" w:sz="4"/>
+              <w:right w:val="single" w:color="A6A6A6" w:sz="4"/>
+            </w:tcBorders>
+            <w:tcMar>
+              <w:top w:type="dxa" w:w="80"/>
+              <w:left w:type="dxa" w:w="120"/>
+              <w:bottom w:type="dxa" w:w="80"/>
+              <w:right w:type="dxa" w:w="120"/>
+            </w:tcMar>
+          </w:tcPr>
+          <w:p>
+            <w:r>
+              <w:t>23 Oct 2026</w:t>
+            </w:r>
+          </w:p>
+        </w:tc>
+      </w:tr>
+      <w:tr>
+        <w:tc>
+          <w:tcPr>
+            <w:tcW w:type="dxa" w:w="632"/>
+            <w:tcBorders>
+              <w:top w:val="single" w:color="A6A6A6" w:sz="4"/>
+              <w:left w:val="single" w:color="A6A6A6" w:sz="4"/>
+              <w:bottom w:val="single" w:color="A6A6A6" w:sz="4"/>
+              <w:right w:val="single" w:color="A6A6A6" w:sz="4"/>
+            </w:tcBorders>
+            <w:tcMar>
+              <w:top w:type="dxa" w:w="80"/>
+              <w:left w:type="dxa" w:w="120"/>
+              <w:bottom w:type="dxa" w:w="80"/>
+              <w:right w:type="dxa" w:w="120"/>
+            </w:tcMar>
+          </w:tcPr>
+          <w:p>
+            <w:r>
+              <w:t>53</w:t>
+            </w:r>
+          </w:p>
+        </w:tc>
+        <w:tc>
+          <w:tcPr>
+            <w:tcW w:type="dxa" w:w="1625"/>
+            <w:tcBorders>
+              <w:top w:val="single" w:color="A6A6A6" w:sz="4"/>
+              <w:left w:val="single" w:color="A6A6A6" w:sz="4"/>
+              <w:bottom w:val="single" w:color="A6A6A6" w:sz="4"/>
+              <w:right w:val="single" w:color="A6A6A6" w:sz="4"/>
+            </w:tcBorders>
+            <w:tcMar>
+              <w:top w:type="dxa" w:w="80"/>
+              <w:left w:type="dxa" w:w="120"/>
+              <w:bottom w:type="dxa" w:w="80"/>
+              <w:right w:type="dxa" w:w="120"/>
+            </w:tcMar>
+          </w:tcPr>
+          <w:p>
+            <w:r>
+              <w:t>Feature switches</w:t>
+            </w:r>
+          </w:p>
+        </w:tc>
+        <w:tc>
+          <w:tcPr>
+            <w:tcW w:type="dxa" w:w="5235"/>
+            <w:tcBorders>
+              <w:top w:val="single" w:color="A6A6A6" w:sz="4"/>
+              <w:left w:val="single" w:color="A6A6A6" w:sz="4"/>
+              <w:bottom w:val="single" w:color="A6A6A6" w:sz="4"/>
+              <w:right w:val="single" w:color="A6A6A6" w:sz="4"/>
+            </w:tcBorders>
+            <w:tcMar>
+              <w:top w:type="dxa" w:w="80"/>
+              <w:left w:type="dxa" w:w="120"/>
+              <w:bottom w:type="dxa" w:w="80"/>
+              <w:right w:type="dxa" w:w="120"/>
+            </w:tcMar>
+          </w:tcPr>
+          <w:p>
+            <w:r>
+              <w:t>A switch rule can carry an optional message and return time shown to users, and the admin panel warns when switching off a feature that others depend on. Built with the admin screens.</w:t>
+            </w:r>
+          </w:p>
+        </w:tc>
+        <w:tc>
+          <w:tcPr>
+            <w:tcW w:type="dxa" w:w="1534"/>
+            <w:tcBorders>
+              <w:top w:val="single" w:color="A6A6A6" w:sz="4"/>
+              <w:left w:val="single" w:color="A6A6A6" w:sz="4"/>
+              <w:bottom w:val="single" w:color="A6A6A6" w:sz="4"/>
+              <w:right w:val="single" w:color="A6A6A6" w:sz="4"/>
+            </w:tcBorders>
+            <w:tcMar>
+              <w:top w:type="dxa" w:w="80"/>
+              <w:left w:type="dxa" w:w="120"/>
+              <w:bottom w:type="dxa" w:w="80"/>
+              <w:right w:type="dxa" w:w="120"/>
+            </w:tcMar>
+          </w:tcPr>
+          <w:p>
+            <w:r>
+              <w:t>23 Oct 2026</w:t>
+            </w:r>
+          </w:p>
+        </w:tc>
+      </w:tr>
+      <w:tr>
+        <w:tc>
+          <w:tcPr>
+            <w:tcW w:type="dxa" w:w="632"/>
+            <w:tcBorders>
+              <w:top w:val="single" w:color="A6A6A6" w:sz="4"/>
+              <w:left w:val="single" w:color="A6A6A6" w:sz="4"/>
+              <w:bottom w:val="single" w:color="A6A6A6" w:sz="4"/>
+              <w:right w:val="single" w:color="A6A6A6" w:sz="4"/>
+            </w:tcBorders>
+            <w:tcMar>
+              <w:top w:type="dxa" w:w="80"/>
+              <w:left w:type="dxa" w:w="120"/>
+              <w:bottom w:type="dxa" w:w="80"/>
+              <w:right w:type="dxa" w:w="120"/>
+            </w:tcMar>
+          </w:tcPr>
+          <w:p>
+            <w:r>
+              <w:t>54</w:t>
+            </w:r>
+          </w:p>
+        </w:tc>
+        <w:tc>
+          <w:tcPr>
+            <w:tcW w:type="dxa" w:w="1625"/>
+            <w:tcBorders>
+              <w:top w:val="single" w:color="A6A6A6" w:sz="4"/>
+              <w:left w:val="single" w:color="A6A6A6" w:sz="4"/>
+              <w:bottom w:val="single" w:color="A6A6A6" w:sz="4"/>
+              <w:right w:val="single" w:color="A6A6A6" w:sz="4"/>
+            </w:tcBorders>
+            <w:tcMar>
+              <w:top w:type="dxa" w:w="80"/>
+              <w:left w:type="dxa" w:w="120"/>
+              <w:bottom w:type="dxa" w:w="80"/>
+              <w:right w:type="dxa" w:w="120"/>
+            </w:tcMar>
+          </w:tcPr>
+          <w:p>
+            <w:r>
+              <w:t>Restricted countries</w:t>
+            </w:r>
+          </w:p>
+        </w:tc>
+        <w:tc>
+          <w:tcPr>
+            <w:tcW w:type="dxa" w:w="5235"/>
+            <w:tcBorders>
+              <w:top w:val="single" w:color="A6A6A6" w:sz="4"/>
+              <w:left w:val="single" w:color="A6A6A6" w:sz="4"/>
+              <w:bottom w:val="single" w:color="A6A6A6" w:sz="4"/>
+              <w:right w:val="single" w:color="A6A6A6" w:sz="4"/>
+            </w:tcBorders>
+            <w:tcMar>
+              <w:top w:type="dxa" w:w="80"/>
+              <w:left w:type="dxa" w:w="120"/>
+              <w:bottom w:type="dxa" w:w="80"/>
+              <w:right w:type="dxa" w:w="120"/>
+            </w:tcMar>
+          </w:tcPr>
+          <w:p>
+            <w:r>
+              <w:t>Blocking restricted countries is added before a second country is opened (Release 3).</w:t>
+            </w:r>
+          </w:p>
+        </w:tc>
+        <w:tc>
+          <w:tcPr>
+            <w:tcW w:type="dxa" w:w="1534"/>
+            <w:tcBorders>
+              <w:top w:val="single" w:color="A6A6A6" w:sz="4"/>
+              <w:left w:val="single" w:color="A6A6A6" w:sz="4"/>
+              <w:bottom w:val="single" w:color="A6A6A6" w:sz="4"/>
+              <w:right w:val="single" w:color="A6A6A6" w:sz="4"/>
+            </w:tcBorders>
+            <w:tcMar>
+              <w:top w:type="dxa" w:w="80"/>
+              <w:left w:type="dxa" w:w="120"/>
+              <w:bottom w:type="dxa" w:w="80"/>
+              <w:right w:type="dxa" w:w="120"/>
+            </w:tcMar>
+          </w:tcPr>
+          <w:p>
+            <w:r>
+              <w:t>23 Oct 2026</w:t>
+            </w:r>
+          </w:p>
+        </w:tc>
+      </w:tr>
+      <w:tr>
+        <w:tc>
+          <w:tcPr>
+            <w:tcW w:type="dxa" w:w="632"/>
+            <w:tcBorders>
+              <w:top w:val="single" w:color="A6A6A6" w:sz="4"/>
+              <w:left w:val="single" w:color="A6A6A6" w:sz="4"/>
+              <w:bottom w:val="single" w:color="A6A6A6" w:sz="4"/>
+              <w:right w:val="single" w:color="A6A6A6" w:sz="4"/>
+            </w:tcBorders>
+            <w:tcMar>
+              <w:top w:type="dxa" w:w="80"/>
+              <w:left w:type="dxa" w:w="120"/>
+              <w:bottom w:type="dxa" w:w="80"/>
+              <w:right w:type="dxa" w:w="120"/>
+            </w:tcMar>
+          </w:tcPr>
+          <w:p>
+            <w:r>
+              <w:t>55</w:t>
+            </w:r>
+          </w:p>
+        </w:tc>
+        <w:tc>
+          <w:tcPr>
+            <w:tcW w:type="dxa" w:w="1625"/>
+            <w:tcBorders>
+              <w:top w:val="single" w:color="A6A6A6" w:sz="4"/>
+              <w:left w:val="single" w:color="A6A6A6" w:sz="4"/>
+              <w:bottom w:val="single" w:color="A6A6A6" w:sz="4"/>
+              <w:right w:val="single" w:color="A6A6A6" w:sz="4"/>
+            </w:tcBorders>
+            <w:tcMar>
+              <w:top w:type="dxa" w:w="80"/>
+              <w:left w:type="dxa" w:w="120"/>
+              <w:bottom w:type="dxa" w:w="80"/>
+              <w:right w:type="dxa" w:w="120"/>
+            </w:tcMar>
+          </w:tcPr>
+          <w:p>
+            <w:r>
+              <w:t>Country settings</w:t>
+            </w:r>
+          </w:p>
+        </w:tc>
+        <w:tc>
+          <w:tcPr>
+            <w:tcW w:type="dxa" w:w="5235"/>
+            <w:tcBorders>
+              <w:top w:val="single" w:color="A6A6A6" w:sz="4"/>
+              <w:left w:val="single" w:color="A6A6A6" w:sz="4"/>
+              <w:bottom w:val="single" w:color="A6A6A6" w:sz="4"/>
+              <w:right w:val="single" w:color="A6A6A6" w:sz="4"/>
+            </w:tcBorders>
+            <w:tcMar>
+              <w:top w:type="dxa" w:w="80"/>
+              <w:left w:type="dxa" w:w="120"/>
+              <w:bottom w:type="dxa" w:w="80"/>
+              <w:right w:type="dxa" w:w="120"/>
+            </w:tcMar>
+          </w:tcPr>
+          <w:p>
+            <w:r>
+              <w:t>Data retention becomes a country setting in Release 1 step 3, with the period set after legal advice (open point 15). Other country settings are added with the features that need them: fee types shown on listings in step 5, the rest in Releases 2 and 3. The fixed fee fields remain for Release 1 in Nigeria.</w:t>
+            </w:r>
+          </w:p>
+        </w:tc>
+        <w:tc>
+          <w:tcPr>
+            <w:tcW w:type="dxa" w:w="1534"/>
+            <w:tcBorders>
+              <w:top w:val="single" w:color="A6A6A6" w:sz="4"/>
+              <w:left w:val="single" w:color="A6A6A6" w:sz="4"/>
+              <w:bottom w:val="single" w:color="A6A6A6" w:sz="4"/>
+              <w:right w:val="single" w:color="A6A6A6" w:sz="4"/>
+            </w:tcBorders>
+            <w:tcMar>
+              <w:top w:type="dxa" w:w="80"/>
+              <w:left w:type="dxa" w:w="120"/>
+              <w:bottom w:type="dxa" w:w="80"/>
+              <w:right w:type="dxa" w:w="120"/>
+            </w:tcMar>
+          </w:tcPr>
+          <w:p>
+            <w:r>
+              <w:t>23 Oct 2026</w:t>
+            </w:r>
+          </w:p>
+        </w:tc>
+      </w:tr>
+      <w:tr>
+        <w:tc>
+          <w:tcPr>
+            <w:tcW w:type="dxa" w:w="632"/>
+            <w:tcBorders>
+              <w:top w:val="single" w:color="A6A6A6" w:sz="4"/>
+              <w:left w:val="single" w:color="A6A6A6" w:sz="4"/>
+              <w:bottom w:val="single" w:color="A6A6A6" w:sz="4"/>
+              <w:right w:val="single" w:color="A6A6A6" w:sz="4"/>
+            </w:tcBorders>
+            <w:tcMar>
+              <w:top w:type="dxa" w:w="80"/>
+              <w:left w:type="dxa" w:w="120"/>
+              <w:bottom w:type="dxa" w:w="80"/>
+              <w:right w:type="dxa" w:w="120"/>
+            </w:tcMar>
+          </w:tcPr>
+          <w:p>
+            <w:r>
+              <w:t>56</w:t>
+            </w:r>
+          </w:p>
+        </w:tc>
+        <w:tc>
+          <w:tcPr>
+            <w:tcW w:type="dxa" w:w="1625"/>
+            <w:tcBorders>
+              <w:top w:val="single" w:color="A6A6A6" w:sz="4"/>
+              <w:left w:val="single" w:color="A6A6A6" w:sz="4"/>
+              <w:bottom w:val="single" w:color="A6A6A6" w:sz="4"/>
+              <w:right w:val="single" w:color="A6A6A6" w:sz="4"/>
+            </w:tcBorders>
+            <w:tcMar>
+              <w:top w:type="dxa" w:w="80"/>
+              <w:left w:type="dxa" w:w="120"/>
+              <w:bottom w:type="dxa" w:w="80"/>
+              <w:right w:type="dxa" w:w="120"/>
+            </w:tcMar>
+          </w:tcPr>
+          <w:p>
+            <w:r>
+              <w:t>Property details</w:t>
+            </w:r>
+          </w:p>
+        </w:tc>
+        <w:tc>
+          <w:tcPr>
+            <w:tcW w:type="dxa" w:w="5235"/>
+            <w:tcBorders>
+              <w:top w:val="single" w:color="A6A6A6" w:sz="4"/>
+              <w:left w:val="single" w:color="A6A6A6" w:sz="4"/>
+              <w:bottom w:val="single" w:color="A6A6A6" w:sz="4"/>
+              <w:right w:val="single" w:color="A6A6A6" w:sz="4"/>
+            </w:tcBorders>
+            <w:tcMar>
+              <w:top w:type="dxa" w:w="80"/>
+              <w:left w:type="dxa" w:w="120"/>
+              <w:bottom w:type="dxa" w:w="80"/>
+              <w:right w:type="dxa" w:w="120"/>
+            </w:tcMar>
+          </w:tcPr>
+          <w:p>
+            <w:r>
+              <w:t>In Release 1 step 4: the distance to the main road is recorded; the residential photo checklist asks for separate toilets; and each part can carry a note.</w:t>
+            </w:r>
+          </w:p>
+        </w:tc>
+        <w:tc>
+          <w:tcPr>
+            <w:tcW w:type="dxa" w:w="1534"/>
+            <w:tcBorders>
+              <w:top w:val="single" w:color="A6A6A6" w:sz="4"/>
+              <w:left w:val="single" w:color="A6A6A6" w:sz="4"/>
+              <w:bottom w:val="single" w:color="A6A6A6" w:sz="4"/>
+              <w:right w:val="single" w:color="A6A6A6" w:sz="4"/>
+            </w:tcBorders>
+            <w:tcMar>
+              <w:top w:type="dxa" w:w="80"/>
+              <w:left w:type="dxa" w:w="120"/>
+              <w:bottom w:type="dxa" w:w="80"/>
+              <w:right w:type="dxa" w:w="120"/>
+            </w:tcMar>
+          </w:tcPr>
+          <w:p>
+            <w:r>
+              <w:t>23 Oct 2026</w:t>
+            </w:r>
+          </w:p>
+        </w:tc>
+      </w:tr>
+      <w:tr>
+        <w:tc>
+          <w:tcPr>
+            <w:tcW w:type="dxa" w:w="632"/>
+            <w:tcBorders>
+              <w:top w:val="single" w:color="A6A6A6" w:sz="4"/>
+              <w:left w:val="single" w:color="A6A6A6" w:sz="4"/>
+              <w:bottom w:val="single" w:color="A6A6A6" w:sz="4"/>
+              <w:right w:val="single" w:color="A6A6A6" w:sz="4"/>
+            </w:tcBorders>
+            <w:tcMar>
+              <w:top w:type="dxa" w:w="80"/>
+              <w:left w:type="dxa" w:w="120"/>
+              <w:bottom w:type="dxa" w:w="80"/>
+              <w:right w:type="dxa" w:w="120"/>
+            </w:tcMar>
+          </w:tcPr>
+          <w:p>
+            <w:r>
+              <w:t>57</w:t>
+            </w:r>
+          </w:p>
+        </w:tc>
+        <w:tc>
+          <w:tcPr>
+            <w:tcW w:type="dxa" w:w="1625"/>
+            <w:tcBorders>
+              <w:top w:val="single" w:color="A6A6A6" w:sz="4"/>
+              <w:left w:val="single" w:color="A6A6A6" w:sz="4"/>
+              <w:bottom w:val="single" w:color="A6A6A6" w:sz="4"/>
+              <w:right w:val="single" w:color="A6A6A6" w:sz="4"/>
+            </w:tcBorders>
+            <w:tcMar>
+              <w:top w:type="dxa" w:w="80"/>
+              <w:left w:type="dxa" w:w="120"/>
+              <w:bottom w:type="dxa" w:w="80"/>
+              <w:right w:type="dxa" w:w="120"/>
+            </w:tcMar>
+          </w:tcPr>
+          <w:p>
+            <w:r>
+              <w:t>Ratings and reviews</w:t>
+            </w:r>
+          </w:p>
+        </w:tc>
+        <w:tc>
+          <w:tcPr>
+            <w:tcW w:type="dxa" w:w="5235"/>
+            <w:tcBorders>
+              <w:top w:val="single" w:color="A6A6A6" w:sz="4"/>
+              <w:left w:val="single" w:color="A6A6A6" w:sz="4"/>
+              <w:bottom w:val="single" w:color="A6A6A6" w:sz="4"/>
+              <w:right w:val="single" w:color="A6A6A6" w:sz="4"/>
+            </w:tcBorders>
+            <w:tcMar>
+              <w:top w:type="dxa" w:w="80"/>
+              <w:left w:type="dxa" w:w="120"/>
+              <w:bottom w:type="dxa" w:w="80"/>
+              <w:right w:type="dxa" w:w="120"/>
+            </w:tcMar>
+          </w:tcPr>
+          <w:p>
+            <w:r>
+              <w:t>Ratings and reviews come in Release 2, with escrow and short lets.</w:t>
+            </w:r>
+          </w:p>
+        </w:tc>
+        <w:tc>
+          <w:tcPr>
+            <w:tcW w:type="dxa" w:w="1534"/>
+            <w:tcBorders>
+              <w:top w:val="single" w:color="A6A6A6" w:sz="4"/>
+              <w:left w:val="single" w:color="A6A6A6" w:sz="4"/>
+              <w:bottom w:val="single" w:color="A6A6A6" w:sz="4"/>
+              <w:right w:val="single" w:color="A6A6A6" w:sz="4"/>
+            </w:tcBorders>
+            <w:tcMar>
+              <w:top w:type="dxa" w:w="80"/>
+              <w:left w:type="dxa" w:w="120"/>
+              <w:bottom w:type="dxa" w:w="80"/>
+              <w:right w:type="dxa" w:w="120"/>
+            </w:tcMar>
+          </w:tcPr>
+          <w:p>
+            <w:r>
+              <w:t>23 Oct 2026</w:t>
+            </w:r>
+          </w:p>
+        </w:tc>
+      </w:tr>
+      <w:tr>
+        <w:tc>
+          <w:tcPr>
+            <w:tcW w:type="dxa" w:w="632"/>
+            <w:tcBorders>
+              <w:top w:val="single" w:color="A6A6A6" w:sz="4"/>
+              <w:left w:val="single" w:color="A6A6A6" w:sz="4"/>
+              <w:bottom w:val="single" w:color="A6A6A6" w:sz="4"/>
+              <w:right w:val="single" w:color="A6A6A6" w:sz="4"/>
+            </w:tcBorders>
+            <w:tcMar>
+              <w:top w:type="dxa" w:w="80"/>
+              <w:left w:type="dxa" w:w="120"/>
+              <w:bottom w:type="dxa" w:w="80"/>
+              <w:right w:type="dxa" w:w="120"/>
+            </w:tcMar>
+          </w:tcPr>
+          <w:p>
+            <w:r>
+              <w:t>58</w:t>
+            </w:r>
+          </w:p>
+        </w:tc>
+        <w:tc>
+          <w:tcPr>
+            <w:tcW w:type="dxa" w:w="1625"/>
+            <w:tcBorders>
+              <w:top w:val="single" w:color="A6A6A6" w:sz="4"/>
+              <w:left w:val="single" w:color="A6A6A6" w:sz="4"/>
+              <w:bottom w:val="single" w:color="A6A6A6" w:sz="4"/>
+              <w:right w:val="single" w:color="A6A6A6" w:sz="4"/>
+            </w:tcBorders>
+            <w:tcMar>
+              <w:top w:type="dxa" w:w="80"/>
+              <w:left w:type="dxa" w:w="120"/>
+              <w:bottom w:type="dxa" w:w="80"/>
+              <w:right w:type="dxa" w:w="120"/>
+            </w:tcMar>
+          </w:tcPr>
+          <w:p>
+            <w:r>
+              <w:t>Automatic checks</w:t>
+            </w:r>
+          </w:p>
+        </w:tc>
+        <w:tc>
+          <w:tcPr>
+            <w:tcW w:type="dxa" w:w="5235"/>
+            <w:tcBorders>
+              <w:top w:val="single" w:color="A6A6A6" w:sz="4"/>
+              <w:left w:val="single" w:color="A6A6A6" w:sz="4"/>
+              <w:bottom w:val="single" w:color="A6A6A6" w:sz="4"/>
+              <w:right w:val="single" w:color="A6A6A6" w:sz="4"/>
+            </w:tcBorders>
+            <w:tcMar>
+              <w:top w:type="dxa" w:w="80"/>
+              <w:left w:type="dxa" w:w="120"/>
+              <w:bottom w:type="dxa" w:w="80"/>
+              <w:right w:type="dxa" w:w="120"/>
+            </w:tcMar>
+          </w:tcPr>
+          <w:p>
+            <w:r>
+              <w:t>Release 1: live photo check, walkthrough video GPS path, all duplicate checks (location, photo fingerprint, document numbers and address), and name match by the verification team. Release 2: satellite check and stolen photo check.</w:t>
+            </w:r>
+          </w:p>
+        </w:tc>
+        <w:tc>
+          <w:tcPr>
+            <w:tcW w:type="dxa" w:w="1534"/>
+            <w:tcBorders>
+              <w:top w:val="single" w:color="A6A6A6" w:sz="4"/>
+              <w:left w:val="single" w:color="A6A6A6" w:sz="4"/>
+              <w:bottom w:val="single" w:color="A6A6A6" w:sz="4"/>
+              <w:right w:val="single" w:color="A6A6A6" w:sz="4"/>
+            </w:tcBorders>
+            <w:tcMar>
+              <w:top w:type="dxa" w:w="80"/>
+              <w:left w:type="dxa" w:w="120"/>
+              <w:bottom w:type="dxa" w:w="80"/>
+              <w:right w:type="dxa" w:w="120"/>
+            </w:tcMar>
+          </w:tcPr>
+          <w:p>
+            <w:r>
+              <w:t>23 Oct 2026</w:t>
+            </w:r>
+          </w:p>
+        </w:tc>
+      </w:tr>
+      <w:tr>
+        <w:tc>
+          <w:tcPr>
+            <w:tcW w:type="dxa" w:w="632"/>
+            <w:tcBorders>
+              <w:top w:val="single" w:color="A6A6A6" w:sz="4"/>
+              <w:left w:val="single" w:color="A6A6A6" w:sz="4"/>
+              <w:bottom w:val="single" w:color="A6A6A6" w:sz="4"/>
+              <w:right w:val="single" w:color="A6A6A6" w:sz="4"/>
+            </w:tcBorders>
+            <w:tcMar>
+              <w:top w:type="dxa" w:w="80"/>
+              <w:left w:type="dxa" w:w="120"/>
+              <w:bottom w:type="dxa" w:w="80"/>
+              <w:right w:type="dxa" w:w="120"/>
+            </w:tcMar>
+          </w:tcPr>
+          <w:p>
+            <w:r>
+              <w:t>59</w:t>
+            </w:r>
+          </w:p>
+        </w:tc>
+        <w:tc>
+          <w:tcPr>
+            <w:tcW w:type="dxa" w:w="1625"/>
+            <w:tcBorders>
+              <w:top w:val="single" w:color="A6A6A6" w:sz="4"/>
+              <w:left w:val="single" w:color="A6A6A6" w:sz="4"/>
+              <w:bottom w:val="single" w:color="A6A6A6" w:sz="4"/>
+              <w:right w:val="single" w:color="A6A6A6" w:sz="4"/>
+            </w:tcBorders>
+            <w:tcMar>
+              <w:top w:type="dxa" w:w="80"/>
+              <w:left w:type="dxa" w:w="120"/>
+              <w:bottom w:type="dxa" w:w="80"/>
+              <w:right w:type="dxa" w:w="120"/>
+            </w:tcMar>
+          </w:tcPr>
+          <w:p>
+            <w:r>
+              <w:t>Technical points</w:t>
+            </w:r>
+          </w:p>
+        </w:tc>
+        <w:tc>
+          <w:tcPr>
+            <w:tcW w:type="dxa" w:w="5235"/>
+            <w:tcBorders>
+              <w:top w:val="single" w:color="A6A6A6" w:sz="4"/>
+              <w:left w:val="single" w:color="A6A6A6" w:sz="4"/>
+              <w:bottom w:val="single" w:color="A6A6A6" w:sz="4"/>
+              <w:right w:val="single" w:color="A6A6A6" w:sz="4"/>
+            </w:tcBorders>
+            <w:tcMar>
+              <w:top w:type="dxa" w:w="80"/>
+              <w:left w:type="dxa" w:w="120"/>
+              <w:bottom w:type="dxa" w:w="80"/>
+              <w:right w:type="dxa" w:w="120"/>
+            </w:tcMar>
+          </w:tcPr>
+          <w:p>
+            <w:r>
+              <w:t>Rate limits move to Redis and BullMQ starts with the first background job. Request logs never record search locations (Specification Section 15.2).</w:t>
+            </w:r>
+          </w:p>
+        </w:tc>
+        <w:tc>
+          <w:tcPr>
+            <w:tcW w:type="dxa" w:w="1534"/>
+            <w:tcBorders>
+              <w:top w:val="single" w:color="A6A6A6" w:sz="4"/>
+              <w:left w:val="single" w:color="A6A6A6" w:sz="4"/>
+              <w:bottom w:val="single" w:color="A6A6A6" w:sz="4"/>
+              <w:right w:val="single" w:color="A6A6A6" w:sz="4"/>
+            </w:tcBorders>
+            <w:tcMar>
+              <w:top w:type="dxa" w:w="80"/>
+              <w:left w:type="dxa" w:w="120"/>
+              <w:bottom w:type="dxa" w:w="80"/>
+              <w:right w:type="dxa" w:w="120"/>
+            </w:tcMar>
+          </w:tcPr>
+          <w:p>
+            <w:r>
+              <w:t>23 Oct 2026</w:t>
+            </w:r>
+          </w:p>
+        </w:tc>
+      </w:tr>
     </w:tbl>
     <w:p>
       <w:pPr>
@@ -4715,74 +6605,6 @@
           <w:p>
             <w:r>
               <w:t xml:space="preserve">To be decided</w:t>
-            </w:r>
-          </w:p>
-        </w:tc>
-      </w:tr>
-      <w:tr>
-        <w:tc>
-          <w:tcPr>
-            <w:tcW w:type="dxa" w:w="632"/>
-            <w:tcBorders>
-              <w:top w:val="single" w:color="A6A6A6" w:sz="4"/>
-              <w:left w:val="single" w:color="A6A6A6" w:sz="4"/>
-              <w:bottom w:val="single" w:color="A6A6A6" w:sz="4"/>
-              <w:right w:val="single" w:color="A6A6A6" w:sz="4"/>
-            </w:tcBorders>
-            <w:tcMar>
-              <w:top w:type="dxa" w:w="80"/>
-              <w:left w:type="dxa" w:w="120"/>
-              <w:bottom w:type="dxa" w:w="80"/>
-              <w:right w:type="dxa" w:w="120"/>
-            </w:tcMar>
-          </w:tcPr>
-          <w:p>
-            <w:r>
-              <w:t>14</w:t>
-            </w:r>
-          </w:p>
-        </w:tc>
-        <w:tc>
-          <w:tcPr>
-            <w:tcW w:type="dxa" w:w="4784"/>
-            <w:tcBorders>
-              <w:top w:val="single" w:color="A6A6A6" w:sz="4"/>
-              <w:left w:val="single" w:color="A6A6A6" w:sz="4"/>
-              <w:bottom w:val="single" w:color="A6A6A6" w:sz="4"/>
-              <w:right w:val="single" w:color="A6A6A6" w:sz="4"/>
-            </w:tcBorders>
-            <w:tcMar>
-              <w:top w:type="dxa" w:w="80"/>
-              <w:left w:type="dxa" w:w="120"/>
-              <w:bottom w:type="dxa" w:w="80"/>
-              <w:right w:type="dxa" w:w="120"/>
-            </w:tcMar>
-          </w:tcPr>
-          <w:p>
-            <w:r>
-              <w:t>Identity documents accepted in Nigeria besides NIN (for example voter's card, international passport, driver's licence)</w:t>
-            </w:r>
-          </w:p>
-        </w:tc>
-        <w:tc>
-          <w:tcPr>
-            <w:tcW w:type="dxa" w:w="3610"/>
-            <w:tcBorders>
-              <w:top w:val="single" w:color="A6A6A6" w:sz="4"/>
-              <w:left w:val="single" w:color="A6A6A6" w:sz="4"/>
-              <w:bottom w:val="single" w:color="A6A6A6" w:sz="4"/>
-              <w:right w:val="single" w:color="A6A6A6" w:sz="4"/>
-            </w:tcBorders>
-            <w:tcMar>
-              <w:top w:type="dxa" w:w="80"/>
-              <w:left w:type="dxa" w:w="120"/>
-              <w:bottom w:type="dxa" w:w="80"/>
-              <w:right w:type="dxa" w:w="120"/>
-            </w:tcMar>
-          </w:tcPr>
-          <w:p>
-            <w:r>
-              <w:t>To be decided before identity checks go live; held in the country settings</w:t>
             </w:r>
           </w:p>
         </w:tc>

</xml_diff>

<commit_message>
Status after pull requests #10 and #11; decision 64 (actions need level 1)
- STATUS.md: specification check and email step marked as merged; ADR 0006 point 1 removed from the
  waiting list
- Decisions Log: decision 64
- ADR 0006: point 1 confirmed; status accepted
- Product Specification 1.5: Section 3.1 states that any action beyond browsing needs level 1

Co-Authored-By: Claude Opus 5.5 <noreply@anthropic.com>
Claude-Session: https://claude.ai/code/session_01LvvfiTEfqhn9xLA45B6EdW
</commit_message>
<xml_diff>
--- a/docs/specs/FindHouseQuick_Decisions_Log.docx
+++ b/docs/specs/FindHouseQuick_Decisions_Log.docx
@@ -5965,6 +5965,96 @@
           </w:p>
         </w:tc>
       </w:tr>
+      <w:tr>
+        <w:tc>
+          <w:tcPr>
+            <w:tcW w:type="dxa" w:w="632"/>
+            <w:tcBorders>
+              <w:top w:val="single" w:color="A6A6A6" w:sz="4"/>
+              <w:left w:val="single" w:color="A6A6A6" w:sz="4"/>
+              <w:bottom w:val="single" w:color="A6A6A6" w:sz="4"/>
+              <w:right w:val="single" w:color="A6A6A6" w:sz="4"/>
+            </w:tcBorders>
+            <w:tcMar>
+              <w:top w:type="dxa" w:w="80"/>
+              <w:left w:type="dxa" w:w="120"/>
+              <w:bottom w:type="dxa" w:w="80"/>
+              <w:right w:type="dxa" w:w="120"/>
+            </w:tcMar>
+          </w:tcPr>
+          <w:p>
+            <w:r>
+              <w:t>64</w:t>
+            </w:r>
+          </w:p>
+        </w:tc>
+        <w:tc>
+          <w:tcPr>
+            <w:tcW w:type="dxa" w:w="1625"/>
+            <w:tcBorders>
+              <w:top w:val="single" w:color="A6A6A6" w:sz="4"/>
+              <w:left w:val="single" w:color="A6A6A6" w:sz="4"/>
+              <w:bottom w:val="single" w:color="A6A6A6" w:sz="4"/>
+              <w:right w:val="single" w:color="A6A6A6" w:sz="4"/>
+            </w:tcBorders>
+            <w:tcMar>
+              <w:top w:type="dxa" w:w="80"/>
+              <w:left w:type="dxa" w:w="120"/>
+              <w:bottom w:type="dxa" w:w="80"/>
+              <w:right w:type="dxa" w:w="120"/>
+            </w:tcMar>
+          </w:tcPr>
+          <w:p>
+            <w:r>
+              <w:t>Actions need level 1</w:t>
+            </w:r>
+          </w:p>
+        </w:tc>
+        <w:tc>
+          <w:tcPr>
+            <w:tcW w:type="dxa" w:w="5235"/>
+            <w:tcBorders>
+              <w:top w:val="single" w:color="A6A6A6" w:sz="4"/>
+              <w:left w:val="single" w:color="A6A6A6" w:sz="4"/>
+              <w:bottom w:val="single" w:color="A6A6A6" w:sz="4"/>
+              <w:right w:val="single" w:color="A6A6A6" w:sz="4"/>
+            </w:tcBorders>
+            <w:tcMar>
+              <w:top w:type="dxa" w:w="80"/>
+              <w:left w:type="dxa" w:w="120"/>
+              <w:bottom w:type="dxa" w:w="80"/>
+              <w:right w:type="dxa" w:w="120"/>
+            </w:tcMar>
+          </w:tcPr>
+          <w:p>
+            <w:r>
+              <w:t>Every action beyond browsing needs verification level 1, which means both the phone number and the email address are confirmed. Confirms the reading of decisions 35 and 37 in ADR 0006, point 1. Source: chat, 23 October 2026 (confirmed earlier; restated in chat).</w:t>
+            </w:r>
+          </w:p>
+        </w:tc>
+        <w:tc>
+          <w:tcPr>
+            <w:tcW w:type="dxa" w:w="1534"/>
+            <w:tcBorders>
+              <w:top w:val="single" w:color="A6A6A6" w:sz="4"/>
+              <w:left w:val="single" w:color="A6A6A6" w:sz="4"/>
+              <w:bottom w:val="single" w:color="A6A6A6" w:sz="4"/>
+              <w:right w:val="single" w:color="A6A6A6" w:sz="4"/>
+            </w:tcBorders>
+            <w:tcMar>
+              <w:top w:type="dxa" w:w="80"/>
+              <w:left w:type="dxa" w:w="120"/>
+              <w:bottom w:type="dxa" w:w="80"/>
+              <w:right w:type="dxa" w:w="120"/>
+            </w:tcMar>
+          </w:tcPr>
+          <w:p>
+            <w:r>
+              <w:t>23 Oct 2026</w:t>
+            </w:r>
+          </w:p>
+        </w:tc>
+      </w:tr>
     </w:tbl>
     <w:p>
       <w:pPr>
@@ -7169,7 +7259,7 @@
           </w:tcPr>
           <w:p>
             <w:r>
-              <w:t>1.4, 23 October 2026</w:t>
+              <w:t>1.5, 23 October 2026</w:t>
             </w:r>
           </w:p>
         </w:tc>

</xml_diff>

<commit_message>
Decision 68 (own icon set); colours approved; icons redrawn
Co-Authored-By: Claude Opus 5.5 <noreply@anthropic.com>
Claude-Session: https://claude.ai/code/session_01QEVs5DsHdDxpHJsp9WjrLL
</commit_message>
<xml_diff>
--- a/docs/specs/FindHouseQuick_Decisions_Log.docx
+++ b/docs/specs/FindHouseQuick_Decisions_Log.docx
@@ -6299,6 +6299,96 @@
           <w:p>
             <w:r>
               <w:t>The screen designs are made in Penpot (free and open source) through its connector, instead of Figma, because Figma's AI connector needs a paid seat the company cannot pay for yet. If the Penpot connector does not work reliably, the designs are made with Claude's Design artifact type instead, and the Managing Director is told. The rest of decision 42 stays: there is no human designer; the Managing Director reviews and approves the designs; and no app screen is built until its design is approved. Replaces decision 42 in part (the Figma connector). Source: chat, 23 October 2026.</w:t>
+            </w:r>
+          </w:p>
+        </w:tc>
+        <w:tc>
+          <w:tcPr>
+            <w:tcW w:type="dxa" w:w="1534"/>
+            <w:tcBorders>
+              <w:top w:val="single" w:color="A6A6A6" w:sz="4"/>
+              <w:left w:val="single" w:color="A6A6A6" w:sz="4"/>
+              <w:bottom w:val="single" w:color="A6A6A6" w:sz="4"/>
+              <w:right w:val="single" w:color="A6A6A6" w:sz="4"/>
+            </w:tcBorders>
+            <w:tcMar>
+              <w:top w:type="dxa" w:w="80"/>
+              <w:left w:type="dxa" w:w="120"/>
+              <w:bottom w:type="dxa" w:w="80"/>
+              <w:right w:type="dxa" w:w="120"/>
+            </w:tcMar>
+          </w:tcPr>
+          <w:p>
+            <w:r>
+              <w:t>23 Oct 2026</w:t>
+            </w:r>
+          </w:p>
+        </w:tc>
+      </w:tr>
+      <w:tr>
+        <w:tc>
+          <w:tcPr>
+            <w:tcW w:type="dxa" w:w="632"/>
+            <w:tcBorders>
+              <w:top w:val="single" w:color="A6A6A6" w:sz="4"/>
+              <w:left w:val="single" w:color="A6A6A6" w:sz="4"/>
+              <w:bottom w:val="single" w:color="A6A6A6" w:sz="4"/>
+              <w:right w:val="single" w:color="A6A6A6" w:sz="4"/>
+            </w:tcBorders>
+            <w:tcMar>
+              <w:top w:type="dxa" w:w="80"/>
+              <w:left w:type="dxa" w:w="120"/>
+              <w:bottom w:type="dxa" w:w="80"/>
+              <w:right w:type="dxa" w:w="120"/>
+            </w:tcMar>
+          </w:tcPr>
+          <w:p>
+            <w:r>
+              <w:t>68</w:t>
+            </w:r>
+          </w:p>
+        </w:tc>
+        <w:tc>
+          <w:tcPr>
+            <w:tcW w:type="dxa" w:w="1625"/>
+            <w:tcBorders>
+              <w:top w:val="single" w:color="A6A6A6" w:sz="4"/>
+              <w:left w:val="single" w:color="A6A6A6" w:sz="4"/>
+              <w:bottom w:val="single" w:color="A6A6A6" w:sz="4"/>
+              <w:right w:val="single" w:color="A6A6A6" w:sz="4"/>
+            </w:tcBorders>
+            <w:tcMar>
+              <w:top w:type="dxa" w:w="80"/>
+              <w:left w:type="dxa" w:w="120"/>
+              <w:bottom w:type="dxa" w:w="80"/>
+              <w:right w:type="dxa" w:w="120"/>
+            </w:tcMar>
+          </w:tcPr>
+          <w:p>
+            <w:r>
+              <w:t>Icons</w:t>
+            </w:r>
+          </w:p>
+        </w:tc>
+        <w:tc>
+          <w:tcPr>
+            <w:tcW w:type="dxa" w:w="5235"/>
+            <w:tcBorders>
+              <w:top w:val="single" w:color="A6A6A6" w:sz="4"/>
+              <w:left w:val="single" w:color="A6A6A6" w:sz="4"/>
+              <w:bottom w:val="single" w:color="A6A6A6" w:sz="4"/>
+              <w:right w:val="single" w:color="A6A6A6" w:sz="4"/>
+            </w:tcBorders>
+            <w:tcMar>
+              <w:top w:type="dxa" w:w="80"/>
+              <w:left w:type="dxa" w:w="120"/>
+              <w:bottom w:type="dxa" w:w="80"/>
+              <w:right w:type="dxa" w:w="120"/>
+            </w:tcMar>
+          </w:tcPr>
+          <w:p>
+            <w:r>
+              <w:t>FindHouseQuick uses its own icon set, drawn for it in the design sessions and held to a standard above Font Awesome's paid (Pro) set. No outside icon set, free or paid, is used. The set has two matching styles: outline for normal use and filled for selected states. Source: chat, 23 October 2026.</w:t>
             </w:r>
           </w:p>
         </w:tc>

</xml_diff>

<commit_message>
Decision 69: Source Sans 3 replaces Roboto
Co-Authored-By: Claude Opus 5.5 <noreply@anthropic.com>
Claude-Session: https://claude.ai/code/session_01QEVs5DsHdDxpHJsp9WjrLL
</commit_message>
<xml_diff>
--- a/docs/specs/FindHouseQuick_Decisions_Log.docx
+++ b/docs/specs/FindHouseQuick_Decisions_Log.docx
@@ -6389,6 +6389,96 @@
           <w:p>
             <w:r>
               <w:t>FindHouseQuick uses its own icon set, drawn for it in the design sessions and held to a standard above Font Awesome's paid (Pro) set. No outside icon set, free or paid, is used. The set has two matching styles: outline for normal use and filled for selected states. Source: chat, 23 October 2026.</w:t>
+            </w:r>
+          </w:p>
+        </w:tc>
+        <w:tc>
+          <w:tcPr>
+            <w:tcW w:type="dxa" w:w="1534"/>
+            <w:tcBorders>
+              <w:top w:val="single" w:color="A6A6A6" w:sz="4"/>
+              <w:left w:val="single" w:color="A6A6A6" w:sz="4"/>
+              <w:bottom w:val="single" w:color="A6A6A6" w:sz="4"/>
+              <w:right w:val="single" w:color="A6A6A6" w:sz="4"/>
+            </w:tcBorders>
+            <w:tcMar>
+              <w:top w:type="dxa" w:w="80"/>
+              <w:left w:type="dxa" w:w="120"/>
+              <w:bottom w:type="dxa" w:w="80"/>
+              <w:right w:type="dxa" w:w="120"/>
+            </w:tcMar>
+          </w:tcPr>
+          <w:p>
+            <w:r>
+              <w:t>23 Oct 2026</w:t>
+            </w:r>
+          </w:p>
+        </w:tc>
+      </w:tr>
+      <w:tr>
+        <w:tc>
+          <w:tcPr>
+            <w:tcW w:type="dxa" w:w="632"/>
+            <w:tcBorders>
+              <w:top w:val="single" w:color="A6A6A6" w:sz="4"/>
+              <w:left w:val="single" w:color="A6A6A6" w:sz="4"/>
+              <w:bottom w:val="single" w:color="A6A6A6" w:sz="4"/>
+              <w:right w:val="single" w:color="A6A6A6" w:sz="4"/>
+            </w:tcBorders>
+            <w:tcMar>
+              <w:top w:type="dxa" w:w="80"/>
+              <w:left w:type="dxa" w:w="120"/>
+              <w:bottom w:type="dxa" w:w="80"/>
+              <w:right w:type="dxa" w:w="120"/>
+            </w:tcMar>
+          </w:tcPr>
+          <w:p>
+            <w:r>
+              <w:t>69</w:t>
+            </w:r>
+          </w:p>
+        </w:tc>
+        <w:tc>
+          <w:tcPr>
+            <w:tcW w:type="dxa" w:w="1625"/>
+            <w:tcBorders>
+              <w:top w:val="single" w:color="A6A6A6" w:sz="4"/>
+              <w:left w:val="single" w:color="A6A6A6" w:sz="4"/>
+              <w:bottom w:val="single" w:color="A6A6A6" w:sz="4"/>
+              <w:right w:val="single" w:color="A6A6A6" w:sz="4"/>
+            </w:tcBorders>
+            <w:tcMar>
+              <w:top w:type="dxa" w:w="80"/>
+              <w:left w:type="dxa" w:w="120"/>
+              <w:bottom w:type="dxa" w:w="80"/>
+              <w:right w:type="dxa" w:w="120"/>
+            </w:tcMar>
+          </w:tcPr>
+          <w:p>
+            <w:r>
+              <w:t>Font</w:t>
+            </w:r>
+          </w:p>
+        </w:tc>
+        <w:tc>
+          <w:tcPr>
+            <w:tcW w:type="dxa" w:w="5235"/>
+            <w:tcBorders>
+              <w:top w:val="single" w:color="A6A6A6" w:sz="4"/>
+              <w:left w:val="single" w:color="A6A6A6" w:sz="4"/>
+              <w:bottom w:val="single" w:color="A6A6A6" w:sz="4"/>
+              <w:right w:val="single" w:color="A6A6A6" w:sz="4"/>
+            </w:tcBorders>
+            <w:tcMar>
+              <w:top w:type="dxa" w:w="80"/>
+              <w:left w:type="dxa" w:w="120"/>
+              <w:bottom w:type="dxa" w:w="80"/>
+              <w:right w:type="dxa" w:w="120"/>
+            </w:tcMar>
+          </w:tcPr>
+          <w:p>
+            <w:r>
+              <w:t>The app and website font is Source Sans 3 (free, open font licence), replacing Roboto in the design system. It was chosen from fonts checked to include the Naira sign and the dotted letters Yoruba and Igbo need; Roboto lacks the Yoruba letter ṣ. Source: chat, 23 October 2026.</w:t>
             </w:r>
           </w:p>
         </w:tc>

</xml_diff>

<commit_message>
Decision 70: scouts and the referral reward; Specification 1.6; ADR 0008 plan
Co-Authored-By: Claude Opus 5.5 <noreply@anthropic.com>
Claude-Session: https://claude.ai/code/session_01QEVs5DsHdDxpHJsp9WjrLL
</commit_message>
<xml_diff>
--- a/docs/specs/FindHouseQuick_Decisions_Log.docx
+++ b/docs/specs/FindHouseQuick_Decisions_Log.docx
@@ -67,7 +67,7 @@
           <w:sz w:val="22"/>
           <w:szCs w:val="22"/>
         </w:rPr>
-        <w:t>Updated 23 October 2026</w:t>
+        <w:t>Updated 24 October 2026</w:t>
       </w:r>
     </w:p>
     <w:p>
@@ -6505,6 +6505,96 @@
           </w:p>
         </w:tc>
       </w:tr>
+      <w:tr>
+        <w:tc>
+          <w:tcPr>
+            <w:tcW w:type="dxa" w:w="632"/>
+            <w:tcBorders>
+              <w:top w:val="single" w:color="A6A6A6" w:sz="4"/>
+              <w:left w:val="single" w:color="A6A6A6" w:sz="4"/>
+              <w:bottom w:val="single" w:color="A6A6A6" w:sz="4"/>
+              <w:right w:val="single" w:color="A6A6A6" w:sz="4"/>
+            </w:tcBorders>
+            <w:tcMar>
+              <w:top w:type="dxa" w:w="80"/>
+              <w:left w:type="dxa" w:w="120"/>
+              <w:bottom w:type="dxa" w:w="80"/>
+              <w:right w:type="dxa" w:w="120"/>
+            </w:tcMar>
+          </w:tcPr>
+          <w:p>
+            <w:r>
+              <w:t>70</w:t>
+            </w:r>
+          </w:p>
+        </w:tc>
+        <w:tc>
+          <w:tcPr>
+            <w:tcW w:type="dxa" w:w="1625"/>
+            <w:tcBorders>
+              <w:top w:val="single" w:color="A6A6A6" w:sz="4"/>
+              <w:left w:val="single" w:color="A6A6A6" w:sz="4"/>
+              <w:bottom w:val="single" w:color="A6A6A6" w:sz="4"/>
+              <w:right w:val="single" w:color="A6A6A6" w:sz="4"/>
+            </w:tcBorders>
+            <w:tcMar>
+              <w:top w:type="dxa" w:w="80"/>
+              <w:left w:type="dxa" w:w="120"/>
+              <w:bottom w:type="dxa" w:w="80"/>
+              <w:right w:type="dxa" w:w="120"/>
+            </w:tcMar>
+          </w:tcPr>
+          <w:p>
+            <w:r>
+              <w:t>Scouts and referral reward</w:t>
+            </w:r>
+          </w:p>
+        </w:tc>
+        <w:tc>
+          <w:tcPr>
+            <w:tcW w:type="dxa" w:w="5235"/>
+            <w:tcBorders>
+              <w:top w:val="single" w:color="A6A6A6" w:sz="4"/>
+              <w:left w:val="single" w:color="A6A6A6" w:sz="4"/>
+              <w:bottom w:val="single" w:color="A6A6A6" w:sz="4"/>
+              <w:right w:val="single" w:color="A6A6A6" w:sz="4"/>
+            </w:tcBorders>
+            <w:tcMar>
+              <w:top w:type="dxa" w:w="80"/>
+              <w:left w:type="dxa" w:w="120"/>
+              <w:bottom w:type="dxa" w:w="80"/>
+              <w:right w:type="dxa" w:w="120"/>
+            </w:tcMar>
+          </w:tcPr>
+          <w:p>
+            <w:r>
+              <w:t>Since decision 43 there is no field team capturing properties. Scouts are ordinary users who spot vacant properties and bring their landlords onto the app, which brings in listings and gives people a reason to talk about the app. Any user can opt in to be a scout; as with every action beyond browsing, they must be verified first, and verification is unchanged. A scout is not an agent and never lists, manages or speaks for a property. The scout reports a vacant property in the app and invites the landlord, either with an invitation link or by helping the landlord sign up on the landlord's own phone. The landlord enters his own details, accepts the terms himself, gets verified and lists the property himself (decision 43); if an agent is involved, the agent goes through the normal authority process (decision 7). The app records which scout brought in which landlord and property. Projectiles pays the scout a fixed referral reward from its own money, into the scout's verified bank account in their own name; it is never an extra charge on the tenant or landlord. It is paid once, for the first rental of that property only, and only when that rental is completed through the 2% completed rental fee and Projectiles has received the fee; a rental through escrow earns no referral reward. Checks: one scout per property, and the first valid invitation wins; no reward for a landlord or property already on the app; invitations expire after a set period; no reward where the scout is the landlord, the agent or the tenant of that property, or shares their phone, bank account or device. It is built behind its own feature switch, off by default; the reward amount (in minor units, kobo in Nigeria) and the invitation expiry are country settings; reward payouts are kept apart from the escrow ledger, since they are Projectiles' own money, and carry an idempotency key like every payout. The reward amount, the release, and the legal and tax questions are open points 16 to 19. Source: chat, 24 October 2026.</w:t>
+            </w:r>
+          </w:p>
+        </w:tc>
+        <w:tc>
+          <w:tcPr>
+            <w:tcW w:type="dxa" w:w="1534"/>
+            <w:tcBorders>
+              <w:top w:val="single" w:color="A6A6A6" w:sz="4"/>
+              <w:left w:val="single" w:color="A6A6A6" w:sz="4"/>
+              <w:bottom w:val="single" w:color="A6A6A6" w:sz="4"/>
+              <w:right w:val="single" w:color="A6A6A6" w:sz="4"/>
+            </w:tcBorders>
+            <w:tcMar>
+              <w:top w:type="dxa" w:w="80"/>
+              <w:left w:type="dxa" w:w="120"/>
+              <w:bottom w:type="dxa" w:w="80"/>
+              <w:right w:type="dxa" w:w="120"/>
+            </w:tcMar>
+          </w:tcPr>
+          <w:p>
+            <w:r>
+              <w:t>24 Oct 2026</w:t>
+            </w:r>
+          </w:p>
+        </w:tc>
+      </w:tr>
     </w:tbl>
     <w:p>
       <w:pPr>
@@ -7577,6 +7667,278 @@
           </w:p>
         </w:tc>
       </w:tr>
+      <w:tr>
+        <w:tc>
+          <w:tcPr>
+            <w:tcW w:type="dxa" w:w="632"/>
+            <w:tcBorders>
+              <w:top w:val="single" w:color="A6A6A6" w:sz="4"/>
+              <w:left w:val="single" w:color="A6A6A6" w:sz="4"/>
+              <w:bottom w:val="single" w:color="A6A6A6" w:sz="4"/>
+              <w:right w:val="single" w:color="A6A6A6" w:sz="4"/>
+            </w:tcBorders>
+            <w:tcMar>
+              <w:top w:type="dxa" w:w="80"/>
+              <w:left w:type="dxa" w:w="120"/>
+              <w:bottom w:type="dxa" w:w="80"/>
+              <w:right w:type="dxa" w:w="120"/>
+            </w:tcMar>
+          </w:tcPr>
+          <w:p>
+            <w:r>
+              <w:t>16</w:t>
+            </w:r>
+          </w:p>
+        </w:tc>
+        <w:tc>
+          <w:tcPr>
+            <w:tcW w:type="dxa" w:w="4784"/>
+            <w:tcBorders>
+              <w:top w:val="single" w:color="A6A6A6" w:sz="4"/>
+              <w:left w:val="single" w:color="A6A6A6" w:sz="4"/>
+              <w:bottom w:val="single" w:color="A6A6A6" w:sz="4"/>
+              <w:right w:val="single" w:color="A6A6A6" w:sz="4"/>
+            </w:tcBorders>
+            <w:tcMar>
+              <w:top w:type="dxa" w:w="80"/>
+              <w:left w:type="dxa" w:w="120"/>
+              <w:bottom w:type="dxa" w:w="80"/>
+              <w:right w:type="dxa" w:w="120"/>
+            </w:tcMar>
+          </w:tcPr>
+          <w:p>
+            <w:r>
+              <w:t>The scout referral reward amount (decision 70)</w:t>
+            </w:r>
+          </w:p>
+        </w:tc>
+        <w:tc>
+          <w:tcPr>
+            <w:tcW w:type="dxa" w:w="3610"/>
+            <w:tcBorders>
+              <w:top w:val="single" w:color="A6A6A6" w:sz="4"/>
+              <w:left w:val="single" w:color="A6A6A6" w:sz="4"/>
+              <w:bottom w:val="single" w:color="A6A6A6" w:sz="4"/>
+              <w:right w:val="single" w:color="A6A6A6" w:sz="4"/>
+            </w:tcBorders>
+            <w:tcMar>
+              <w:top w:type="dxa" w:w="80"/>
+              <w:left w:type="dxa" w:w="120"/>
+              <w:bottom w:type="dxa" w:w="80"/>
+              <w:right w:type="dxa" w:w="120"/>
+            </w:tcMar>
+          </w:tcPr>
+          <w:p>
+            <w:r>
+              <w:t>To be decided; held in the country settings</w:t>
+            </w:r>
+          </w:p>
+        </w:tc>
+      </w:tr>
+      <w:tr>
+        <w:tc>
+          <w:tcPr>
+            <w:tcW w:type="dxa" w:w="632"/>
+            <w:tcBorders>
+              <w:top w:val="single" w:color="A6A6A6" w:sz="4"/>
+              <w:left w:val="single" w:color="A6A6A6" w:sz="4"/>
+              <w:bottom w:val="single" w:color="A6A6A6" w:sz="4"/>
+              <w:right w:val="single" w:color="A6A6A6" w:sz="4"/>
+            </w:tcBorders>
+            <w:tcMar>
+              <w:top w:type="dxa" w:w="80"/>
+              <w:left w:type="dxa" w:w="120"/>
+              <w:bottom w:type="dxa" w:w="80"/>
+              <w:right w:type="dxa" w:w="120"/>
+            </w:tcMar>
+          </w:tcPr>
+          <w:p>
+            <w:r>
+              <w:t>17</w:t>
+            </w:r>
+          </w:p>
+        </w:tc>
+        <w:tc>
+          <w:tcPr>
+            <w:tcW w:type="dxa" w:w="4784"/>
+            <w:tcBorders>
+              <w:top w:val="single" w:color="A6A6A6" w:sz="4"/>
+              <w:left w:val="single" w:color="A6A6A6" w:sz="4"/>
+              <w:bottom w:val="single" w:color="A6A6A6" w:sz="4"/>
+              <w:right w:val="single" w:color="A6A6A6" w:sz="4"/>
+            </w:tcBorders>
+            <w:tcMar>
+              <w:top w:type="dxa" w:w="80"/>
+              <w:left w:type="dxa" w:w="120"/>
+              <w:bottom w:type="dxa" w:w="80"/>
+              <w:right w:type="dxa" w:w="120"/>
+            </w:tcMar>
+          </w:tcPr>
+          <w:p>
+            <w:r>
+              <w:t>Which release scouts and the referral reward go in (decision 70)</w:t>
+            </w:r>
+          </w:p>
+        </w:tc>
+        <w:tc>
+          <w:tcPr>
+            <w:tcW w:type="dxa" w:w="3610"/>
+            <w:tcBorders>
+              <w:top w:val="single" w:color="A6A6A6" w:sz="4"/>
+              <w:left w:val="single" w:color="A6A6A6" w:sz="4"/>
+              <w:bottom w:val="single" w:color="A6A6A6" w:sz="4"/>
+              <w:right w:val="single" w:color="A6A6A6" w:sz="4"/>
+            </w:tcBorders>
+            <w:tcMar>
+              <w:top w:type="dxa" w:w="80"/>
+              <w:left w:type="dxa" w:w="120"/>
+              <w:bottom w:type="dxa" w:w="80"/>
+              <w:right w:type="dxa" w:w="120"/>
+            </w:tcMar>
+          </w:tcPr>
+          <w:p>
+            <w:r>
+              <w:t>To be decided</w:t>
+            </w:r>
+          </w:p>
+        </w:tc>
+      </w:tr>
+      <w:tr>
+        <w:tc>
+          <w:tcPr>
+            <w:tcW w:type="dxa" w:w="632"/>
+            <w:tcBorders>
+              <w:top w:val="single" w:color="A6A6A6" w:sz="4"/>
+              <w:left w:val="single" w:color="A6A6A6" w:sz="4"/>
+              <w:bottom w:val="single" w:color="A6A6A6" w:sz="4"/>
+              <w:right w:val="single" w:color="A6A6A6" w:sz="4"/>
+            </w:tcBorders>
+            <w:tcMar>
+              <w:top w:type="dxa" w:w="80"/>
+              <w:left w:type="dxa" w:w="120"/>
+              <w:bottom w:type="dxa" w:w="80"/>
+              <w:right w:type="dxa" w:w="120"/>
+            </w:tcMar>
+          </w:tcPr>
+          <w:p>
+            <w:r>
+              <w:t>18</w:t>
+            </w:r>
+          </w:p>
+        </w:tc>
+        <w:tc>
+          <w:tcPr>
+            <w:tcW w:type="dxa" w:w="4784"/>
+            <w:tcBorders>
+              <w:top w:val="single" w:color="A6A6A6" w:sz="4"/>
+              <w:left w:val="single" w:color="A6A6A6" w:sz="4"/>
+              <w:bottom w:val="single" w:color="A6A6A6" w:sz="4"/>
+              <w:right w:val="single" w:color="A6A6A6" w:sz="4"/>
+            </w:tcBorders>
+            <w:tcMar>
+              <w:top w:type="dxa" w:w="80"/>
+              <w:left w:type="dxa" w:w="120"/>
+              <w:bottom w:type="dxa" w:w="80"/>
+              <w:right w:type="dxa" w:w="120"/>
+            </w:tcMar>
+          </w:tcPr>
+          <w:p>
+            <w:r>
+              <w:t>Whether paying for property introductions needs registration under state estate agency rules (decision 70)</w:t>
+            </w:r>
+          </w:p>
+        </w:tc>
+        <w:tc>
+          <w:tcPr>
+            <w:tcW w:type="dxa" w:w="3610"/>
+            <w:tcBorders>
+              <w:top w:val="single" w:color="A6A6A6" w:sz="4"/>
+              <w:left w:val="single" w:color="A6A6A6" w:sz="4"/>
+              <w:bottom w:val="single" w:color="A6A6A6" w:sz="4"/>
+              <w:right w:val="single" w:color="A6A6A6" w:sz="4"/>
+            </w:tcBorders>
+            <w:tcMar>
+              <w:top w:type="dxa" w:w="80"/>
+              <w:left w:type="dxa" w:w="120"/>
+              <w:bottom w:type="dxa" w:w="80"/>
+              <w:right w:type="dxa" w:w="120"/>
+            </w:tcMar>
+          </w:tcPr>
+          <w:p>
+            <w:r>
+              <w:t>To be confirmed with a lawyer before it goes live</w:t>
+            </w:r>
+          </w:p>
+        </w:tc>
+      </w:tr>
+      <w:tr>
+        <w:tc>
+          <w:tcPr>
+            <w:tcW w:type="dxa" w:w="632"/>
+            <w:tcBorders>
+              <w:top w:val="single" w:color="A6A6A6" w:sz="4"/>
+              <w:left w:val="single" w:color="A6A6A6" w:sz="4"/>
+              <w:bottom w:val="single" w:color="A6A6A6" w:sz="4"/>
+              <w:right w:val="single" w:color="A6A6A6" w:sz="4"/>
+            </w:tcBorders>
+            <w:tcMar>
+              <w:top w:type="dxa" w:w="80"/>
+              <w:left w:type="dxa" w:w="120"/>
+              <w:bottom w:type="dxa" w:w="80"/>
+              <w:right w:type="dxa" w:w="120"/>
+            </w:tcMar>
+          </w:tcPr>
+          <w:p>
+            <w:r>
+              <w:t>19</w:t>
+            </w:r>
+          </w:p>
+        </w:tc>
+        <w:tc>
+          <w:tcPr>
+            <w:tcW w:type="dxa" w:w="4784"/>
+            <w:tcBorders>
+              <w:top w:val="single" w:color="A6A6A6" w:sz="4"/>
+              <w:left w:val="single" w:color="A6A6A6" w:sz="4"/>
+              <w:bottom w:val="single" w:color="A6A6A6" w:sz="4"/>
+              <w:right w:val="single" w:color="A6A6A6" w:sz="4"/>
+            </w:tcBorders>
+            <w:tcMar>
+              <w:top w:type="dxa" w:w="80"/>
+              <w:left w:type="dxa" w:w="120"/>
+              <w:bottom w:type="dxa" w:w="80"/>
+              <w:right w:type="dxa" w:w="120"/>
+            </w:tcMar>
+          </w:tcPr>
+          <w:p>
+            <w:r>
+              <w:t>How withholding tax applies to scout referral rewards (decision 70)</w:t>
+            </w:r>
+          </w:p>
+        </w:tc>
+        <w:tc>
+          <w:tcPr>
+            <w:tcW w:type="dxa" w:w="3610"/>
+            <w:tcBorders>
+              <w:top w:val="single" w:color="A6A6A6" w:sz="4"/>
+              <w:left w:val="single" w:color="A6A6A6" w:sz="4"/>
+              <w:bottom w:val="single" w:color="A6A6A6" w:sz="4"/>
+              <w:right w:val="single" w:color="A6A6A6" w:sz="4"/>
+            </w:tcBorders>
+            <w:tcMar>
+              <w:top w:type="dxa" w:w="80"/>
+              <w:left w:type="dxa" w:w="120"/>
+              <w:bottom w:type="dxa" w:w="80"/>
+              <w:right w:type="dxa" w:w="120"/>
+            </w:tcMar>
+          </w:tcPr>
+          <w:p>
+            <w:r>
+              <w:t>To be confirmed with a tax adviser before it goes live</w:t>
+            </w:r>
+          </w:p>
+        </w:tc>
+      </w:tr>
     </w:tbl>
     <w:p>
       <w:pPr>
@@ -7709,7 +8071,7 @@
           </w:tcPr>
           <w:p>
             <w:r>
-              <w:t>1.5, 23 October 2026</w:t>
+              <w:t>1.6, 24 October 2026</w:t>
             </w:r>
           </w:p>
         </w:tc>

</xml_diff>

<commit_message>
Decision 71: scouts at level 1, one reward per unit, no invitation expiry, payouts approved by staff
Co-Authored-By: Claude Opus 5.5 <noreply@anthropic.com>
Claude-Session: https://claude.ai/code/session_01QEVs5DsHdDxpHJsp9WjrLL
</commit_message>
<xml_diff>
--- a/docs/specs/FindHouseQuick_Decisions_Log.docx
+++ b/docs/specs/FindHouseQuick_Decisions_Log.docx
@@ -6595,6 +6595,96 @@
           </w:p>
         </w:tc>
       </w:tr>
+      <w:tr>
+        <w:tc>
+          <w:tcPr>
+            <w:tcW w:type="dxa" w:w="632"/>
+            <w:tcBorders>
+              <w:top w:val="single" w:color="A6A6A6" w:sz="4"/>
+              <w:left w:val="single" w:color="A6A6A6" w:sz="4"/>
+              <w:bottom w:val="single" w:color="A6A6A6" w:sz="4"/>
+              <w:right w:val="single" w:color="A6A6A6" w:sz="4"/>
+            </w:tcBorders>
+            <w:tcMar>
+              <w:top w:type="dxa" w:w="80"/>
+              <w:left w:type="dxa" w:w="120"/>
+              <w:bottom w:type="dxa" w:w="80"/>
+              <w:right w:type="dxa" w:w="120"/>
+            </w:tcMar>
+          </w:tcPr>
+          <w:p>
+            <w:r>
+              <w:t>71</w:t>
+            </w:r>
+          </w:p>
+        </w:tc>
+        <w:tc>
+          <w:tcPr>
+            <w:tcW w:type="dxa" w:w="1625"/>
+            <w:tcBorders>
+              <w:top w:val="single" w:color="A6A6A6" w:sz="4"/>
+              <w:left w:val="single" w:color="A6A6A6" w:sz="4"/>
+              <w:bottom w:val="single" w:color="A6A6A6" w:sz="4"/>
+              <w:right w:val="single" w:color="A6A6A6" w:sz="4"/>
+            </w:tcBorders>
+            <w:tcMar>
+              <w:top w:type="dxa" w:w="80"/>
+              <w:left w:type="dxa" w:w="120"/>
+              <w:bottom w:type="dxa" w:w="80"/>
+              <w:right w:type="dxa" w:w="120"/>
+            </w:tcMar>
+          </w:tcPr>
+          <w:p>
+            <w:r>
+              <w:t>Scouts: details</w:t>
+            </w:r>
+          </w:p>
+        </w:tc>
+        <w:tc>
+          <w:tcPr>
+            <w:tcW w:type="dxa" w:w="5235"/>
+            <w:tcBorders>
+              <w:top w:val="single" w:color="A6A6A6" w:sz="4"/>
+              <w:left w:val="single" w:color="A6A6A6" w:sz="4"/>
+              <w:bottom w:val="single" w:color="A6A6A6" w:sz="4"/>
+              <w:right w:val="single" w:color="A6A6A6" w:sz="4"/>
+            </w:tcBorders>
+            <w:tcMar>
+              <w:top w:type="dxa" w:w="80"/>
+              <w:left w:type="dxa" w:w="120"/>
+              <w:bottom w:type="dxa" w:w="80"/>
+              <w:right w:type="dxa" w:w="120"/>
+            </w:tcMar>
+          </w:tcPr>
+          <w:p>
+            <w:r>
+              <w:t>Level 1 is enough to opt in as a scout, report a property and invite a landlord; withdrawing a reward needs the further verification for payouts: identity checked and a bank account confirmed in the scout's own name. For scout rewards only, every unit that can be rented and paid for counts as one property, so a building with four flats earns up to four rewards, one for the first rental of each flat. Invitations do not expire, so there is no invitation expiry setting. Every reward payout is approved by staff before it is paid. Replaces decision 70 in part (the invitation expiry). Source: chat, 24 October 2026.</w:t>
+            </w:r>
+          </w:p>
+        </w:tc>
+        <w:tc>
+          <w:tcPr>
+            <w:tcW w:type="dxa" w:w="1534"/>
+            <w:tcBorders>
+              <w:top w:val="single" w:color="A6A6A6" w:sz="4"/>
+              <w:left w:val="single" w:color="A6A6A6" w:sz="4"/>
+              <w:bottom w:val="single" w:color="A6A6A6" w:sz="4"/>
+              <w:right w:val="single" w:color="A6A6A6" w:sz="4"/>
+            </w:tcBorders>
+            <w:tcMar>
+              <w:top w:type="dxa" w:w="80"/>
+              <w:left w:type="dxa" w:w="120"/>
+              <w:bottom w:type="dxa" w:w="80"/>
+              <w:right w:type="dxa" w:w="120"/>
+            </w:tcMar>
+          </w:tcPr>
+          <w:p>
+            <w:r>
+              <w:t>24 Oct 2026</w:t>
+            </w:r>
+          </w:p>
+        </w:tc>
+      </w:tr>
     </w:tbl>
     <w:p>
       <w:pPr>
@@ -7935,6 +8025,74 @@
           <w:p>
             <w:r>
               <w:t>To be confirmed with a tax adviser before it goes live</w:t>
+            </w:r>
+          </w:p>
+        </w:tc>
+      </w:tr>
+      <w:tr>
+        <w:tc>
+          <w:tcPr>
+            <w:tcW w:type="dxa" w:w="632"/>
+            <w:tcBorders>
+              <w:top w:val="single" w:color="A6A6A6" w:sz="4"/>
+              <w:left w:val="single" w:color="A6A6A6" w:sz="4"/>
+              <w:bottom w:val="single" w:color="A6A6A6" w:sz="4"/>
+              <w:right w:val="single" w:color="A6A6A6" w:sz="4"/>
+            </w:tcBorders>
+            <w:tcMar>
+              <w:top w:type="dxa" w:w="80"/>
+              <w:left w:type="dxa" w:w="120"/>
+              <w:bottom w:type="dxa" w:w="80"/>
+              <w:right w:type="dxa" w:w="120"/>
+            </w:tcMar>
+          </w:tcPr>
+          <w:p>
+            <w:r>
+              <w:t>20</w:t>
+            </w:r>
+          </w:p>
+        </w:tc>
+        <w:tc>
+          <w:tcPr>
+            <w:tcW w:type="dxa" w:w="4784"/>
+            <w:tcBorders>
+              <w:top w:val="single" w:color="A6A6A6" w:sz="4"/>
+              <w:left w:val="single" w:color="A6A6A6" w:sz="4"/>
+              <w:bottom w:val="single" w:color="A6A6A6" w:sz="4"/>
+              <w:right w:val="single" w:color="A6A6A6" w:sz="4"/>
+            </w:tcBorders>
+            <w:tcMar>
+              <w:top w:type="dxa" w:w="80"/>
+              <w:left w:type="dxa" w:w="120"/>
+              <w:bottom w:type="dxa" w:w="80"/>
+              <w:right w:type="dxa" w:w="120"/>
+            </w:tcMar>
+          </w:tcPr>
+          <w:p>
+            <w:r>
+              <w:t>Whether the scout reward is due once both the tenant's and the landlord's completed rental fees are received, or once either is (decision 70)</w:t>
+            </w:r>
+          </w:p>
+        </w:tc>
+        <w:tc>
+          <w:tcPr>
+            <w:tcW w:type="dxa" w:w="3610"/>
+            <w:tcBorders>
+              <w:top w:val="single" w:color="A6A6A6" w:sz="4"/>
+              <w:left w:val="single" w:color="A6A6A6" w:sz="4"/>
+              <w:bottom w:val="single" w:color="A6A6A6" w:sz="4"/>
+              <w:right w:val="single" w:color="A6A6A6" w:sz="4"/>
+            </w:tcBorders>
+            <w:tcMar>
+              <w:top w:type="dxa" w:w="80"/>
+              <w:left w:type="dxa" w:w="120"/>
+              <w:bottom w:type="dxa" w:w="80"/>
+              <w:right w:type="dxa" w:w="120"/>
+            </w:tcMar>
+          </w:tcPr>
+          <w:p>
+            <w:r>
+              <w:t>To be decided before payouts are built</w:t>
             </w:r>
           </w:p>
         </w:tc>

</xml_diff>

<commit_message>
Remove open point 20: the reward is due once Projectiles has its full fee
Co-Authored-By: Claude Opus 5.5 <noreply@anthropic.com>
Claude-Session: https://claude.ai/code/session_01QEVs5DsHdDxpHJsp9WjrLL
</commit_message>
<xml_diff>
--- a/docs/specs/FindHouseQuick_Decisions_Log.docx
+++ b/docs/specs/FindHouseQuick_Decisions_Log.docx
@@ -8025,74 +8025,6 @@
           <w:p>
             <w:r>
               <w:t>To be confirmed with a tax adviser before it goes live</w:t>
-            </w:r>
-          </w:p>
-        </w:tc>
-      </w:tr>
-      <w:tr>
-        <w:tc>
-          <w:tcPr>
-            <w:tcW w:type="dxa" w:w="632"/>
-            <w:tcBorders>
-              <w:top w:val="single" w:color="A6A6A6" w:sz="4"/>
-              <w:left w:val="single" w:color="A6A6A6" w:sz="4"/>
-              <w:bottom w:val="single" w:color="A6A6A6" w:sz="4"/>
-              <w:right w:val="single" w:color="A6A6A6" w:sz="4"/>
-            </w:tcBorders>
-            <w:tcMar>
-              <w:top w:type="dxa" w:w="80"/>
-              <w:left w:type="dxa" w:w="120"/>
-              <w:bottom w:type="dxa" w:w="80"/>
-              <w:right w:type="dxa" w:w="120"/>
-            </w:tcMar>
-          </w:tcPr>
-          <w:p>
-            <w:r>
-              <w:t>20</w:t>
-            </w:r>
-          </w:p>
-        </w:tc>
-        <w:tc>
-          <w:tcPr>
-            <w:tcW w:type="dxa" w:w="4784"/>
-            <w:tcBorders>
-              <w:top w:val="single" w:color="A6A6A6" w:sz="4"/>
-              <w:left w:val="single" w:color="A6A6A6" w:sz="4"/>
-              <w:bottom w:val="single" w:color="A6A6A6" w:sz="4"/>
-              <w:right w:val="single" w:color="A6A6A6" w:sz="4"/>
-            </w:tcBorders>
-            <w:tcMar>
-              <w:top w:type="dxa" w:w="80"/>
-              <w:left w:type="dxa" w:w="120"/>
-              <w:bottom w:type="dxa" w:w="80"/>
-              <w:right w:type="dxa" w:w="120"/>
-            </w:tcMar>
-          </w:tcPr>
-          <w:p>
-            <w:r>
-              <w:t>Whether the scout reward is due once both the tenant's and the landlord's completed rental fees are received, or once either is (decision 70)</w:t>
-            </w:r>
-          </w:p>
-        </w:tc>
-        <w:tc>
-          <w:tcPr>
-            <w:tcW w:type="dxa" w:w="3610"/>
-            <w:tcBorders>
-              <w:top w:val="single" w:color="A6A6A6" w:sz="4"/>
-              <w:left w:val="single" w:color="A6A6A6" w:sz="4"/>
-              <w:bottom w:val="single" w:color="A6A6A6" w:sz="4"/>
-              <w:right w:val="single" w:color="A6A6A6" w:sz="4"/>
-            </w:tcBorders>
-            <w:tcMar>
-              <w:top w:type="dxa" w:w="80"/>
-              <w:left w:type="dxa" w:w="120"/>
-              <w:bottom w:type="dxa" w:w="80"/>
-              <w:right w:type="dxa" w:w="120"/>
-            </w:tcMar>
-          </w:tcPr>
-          <w:p>
-            <w:r>
-              <w:t>To be decided before payouts are built</w:t>
             </w:r>
           </w:p>
         </w:tc>

</xml_diff>

<commit_message>
Decisions 72 and 73: scouts in Release 1; the complete screen list
Decision 72: scouts are built in Release 1 (step 5a); reward payouts come with
the completed rental fee in Release 2. Closes open point 17.
Decision 73: 112 screens on the phone app (87), website (112) and desktop
software (105), 304 designs, listed in docs/designs.md.
Product Specification 1.7; Technical Architecture 1.1; STATUS, ADR 0008 and
the docs index updated.

Co-Authored-By: Claude Opus 5.5 <noreply@anthropic.com>
Claude-Session: https://claude.ai/code/session_01Ldobdy64eRo1kv947RTJgi
</commit_message>
<xml_diff>
--- a/docs/specs/FindHouseQuick_Decisions_Log.docx
+++ b/docs/specs/FindHouseQuick_Decisions_Log.docx
@@ -6685,6 +6685,186 @@
           </w:p>
         </w:tc>
       </w:tr>
+      <w:tr>
+        <w:tc>
+          <w:tcPr>
+            <w:tcW w:type="dxa" w:w="632"/>
+            <w:tcBorders>
+              <w:top w:val="single" w:color="A6A6A6" w:sz="4"/>
+              <w:left w:val="single" w:color="A6A6A6" w:sz="4"/>
+              <w:bottom w:val="single" w:color="A6A6A6" w:sz="4"/>
+              <w:right w:val="single" w:color="A6A6A6" w:sz="4"/>
+            </w:tcBorders>
+            <w:tcMar>
+              <w:top w:type="dxa" w:w="80"/>
+              <w:left w:type="dxa" w:w="120"/>
+              <w:bottom w:type="dxa" w:w="80"/>
+              <w:right w:type="dxa" w:w="120"/>
+            </w:tcMar>
+          </w:tcPr>
+          <w:p>
+            <w:r>
+              <w:t>72</w:t>
+            </w:r>
+          </w:p>
+        </w:tc>
+        <w:tc>
+          <w:tcPr>
+            <w:tcW w:type="dxa" w:w="1625"/>
+            <w:tcBorders>
+              <w:top w:val="single" w:color="A6A6A6" w:sz="4"/>
+              <w:left w:val="single" w:color="A6A6A6" w:sz="4"/>
+              <w:bottom w:val="single" w:color="A6A6A6" w:sz="4"/>
+              <w:right w:val="single" w:color="A6A6A6" w:sz="4"/>
+            </w:tcBorders>
+            <w:tcMar>
+              <w:top w:type="dxa" w:w="80"/>
+              <w:left w:type="dxa" w:w="120"/>
+              <w:bottom w:type="dxa" w:w="80"/>
+              <w:right w:type="dxa" w:w="120"/>
+            </w:tcMar>
+          </w:tcPr>
+          <w:p>
+            <w:r>
+              <w:t>Scouts: release</w:t>
+            </w:r>
+          </w:p>
+        </w:tc>
+        <w:tc>
+          <w:tcPr>
+            <w:tcW w:type="dxa" w:w="5235"/>
+            <w:tcBorders>
+              <w:top w:val="single" w:color="A6A6A6" w:sz="4"/>
+              <w:left w:val="single" w:color="A6A6A6" w:sz="4"/>
+              <w:bottom w:val="single" w:color="A6A6A6" w:sz="4"/>
+              <w:right w:val="single" w:color="A6A6A6" w:sz="4"/>
+            </w:tcBorders>
+            <w:tcMar>
+              <w:top w:type="dxa" w:w="80"/>
+              <w:left w:type="dxa" w:w="120"/>
+              <w:bottom w:type="dxa" w:w="80"/>
+              <w:right w:type="dxa" w:w="120"/>
+            </w:tcMar>
+          </w:tcPr>
+          <w:p>
+            <w:r>
+              <w:t>Scouts and the referral reward (decisions 70 and 71) are built in Release 1, alongside the other Release 1 features: opting in as a scout, reporting vacant properties, inviting landlords, the referral record and the staff screens for referrals. The reward itself can only be paid once the completed rental fee and payouts exist (Release 2); until then each reward is recorded as waiting for a rental. Settles open point 17. Source: chat, 24 October 2026.</w:t>
+            </w:r>
+          </w:p>
+        </w:tc>
+        <w:tc>
+          <w:tcPr>
+            <w:tcW w:type="dxa" w:w="1534"/>
+            <w:tcBorders>
+              <w:top w:val="single" w:color="A6A6A6" w:sz="4"/>
+              <w:left w:val="single" w:color="A6A6A6" w:sz="4"/>
+              <w:bottom w:val="single" w:color="A6A6A6" w:sz="4"/>
+              <w:right w:val="single" w:color="A6A6A6" w:sz="4"/>
+            </w:tcBorders>
+            <w:tcMar>
+              <w:top w:type="dxa" w:w="80"/>
+              <w:left w:type="dxa" w:w="120"/>
+              <w:bottom w:type="dxa" w:w="80"/>
+              <w:right w:type="dxa" w:w="120"/>
+            </w:tcMar>
+          </w:tcPr>
+          <w:p>
+            <w:r>
+              <w:t>24 Oct 2026</w:t>
+            </w:r>
+          </w:p>
+        </w:tc>
+      </w:tr>
+      <w:tr>
+        <w:tc>
+          <w:tcPr>
+            <w:tcW w:type="dxa" w:w="632"/>
+            <w:tcBorders>
+              <w:top w:val="single" w:color="A6A6A6" w:sz="4"/>
+              <w:left w:val="single" w:color="A6A6A6" w:sz="4"/>
+              <w:bottom w:val="single" w:color="A6A6A6" w:sz="4"/>
+              <w:right w:val="single" w:color="A6A6A6" w:sz="4"/>
+            </w:tcBorders>
+            <w:tcMar>
+              <w:top w:type="dxa" w:w="80"/>
+              <w:left w:type="dxa" w:w="120"/>
+              <w:bottom w:type="dxa" w:w="80"/>
+              <w:right w:type="dxa" w:w="120"/>
+            </w:tcMar>
+          </w:tcPr>
+          <w:p>
+            <w:r>
+              <w:t>73</w:t>
+            </w:r>
+          </w:p>
+        </w:tc>
+        <w:tc>
+          <w:tcPr>
+            <w:tcW w:type="dxa" w:w="1625"/>
+            <w:tcBorders>
+              <w:top w:val="single" w:color="A6A6A6" w:sz="4"/>
+              <w:left w:val="single" w:color="A6A6A6" w:sz="4"/>
+              <w:bottom w:val="single" w:color="A6A6A6" w:sz="4"/>
+              <w:right w:val="single" w:color="A6A6A6" w:sz="4"/>
+            </w:tcBorders>
+            <w:tcMar>
+              <w:top w:type="dxa" w:w="80"/>
+              <w:left w:type="dxa" w:w="120"/>
+              <w:bottom w:type="dxa" w:w="80"/>
+              <w:right w:type="dxa" w:w="120"/>
+            </w:tcMar>
+          </w:tcPr>
+          <w:p>
+            <w:r>
+              <w:t>Screens to be designed</w:t>
+            </w:r>
+          </w:p>
+        </w:tc>
+        <w:tc>
+          <w:tcPr>
+            <w:tcW w:type="dxa" w:w="5235"/>
+            <w:tcBorders>
+              <w:top w:val="single" w:color="A6A6A6" w:sz="4"/>
+              <w:left w:val="single" w:color="A6A6A6" w:sz="4"/>
+              <w:bottom w:val="single" w:color="A6A6A6" w:sz="4"/>
+              <w:right w:val="single" w:color="A6A6A6" w:sz="4"/>
+            </w:tcBorders>
+            <w:tcMar>
+              <w:top w:type="dxa" w:w="80"/>
+              <w:left w:type="dxa" w:w="120"/>
+              <w:bottom w:type="dxa" w:w="80"/>
+              <w:right w:type="dxa" w:w="120"/>
+            </w:tcMar>
+          </w:tcPr>
+          <w:p>
+            <w:r>
+              <w:t>The screens to be designed are fixed in docs/designs.md: 112 screens. The website does everything the app does, so it has every user screen, not only common pages. Phone app: the 87 screens for every user type (tenants, landlords, agents and scouts). Website: the same 87 user screens laid out for a wide screen, the 18 staff screens and 7 public pages, 112 in all. Desktop software: the 87 user screens and the 18 staff screens, 105 in all. That is 304 designs. Adding a building, taking photos of each part and recording the walkthrough video are done on site with the phone's camera and GPS (Specification Sections 5.3 and 6.2), so on the website and desktop those three screens send the user to the phone. The screen designs (Release 0, step 2c) are complete only when all 304 are approved. New screens are added to the list only by a recorded decision. Source: chat, 24 October 2026.</w:t>
+            </w:r>
+          </w:p>
+        </w:tc>
+        <w:tc>
+          <w:tcPr>
+            <w:tcW w:type="dxa" w:w="1534"/>
+            <w:tcBorders>
+              <w:top w:val="single" w:color="A6A6A6" w:sz="4"/>
+              <w:left w:val="single" w:color="A6A6A6" w:sz="4"/>
+              <w:bottom w:val="single" w:color="A6A6A6" w:sz="4"/>
+              <w:right w:val="single" w:color="A6A6A6" w:sz="4"/>
+            </w:tcBorders>
+            <w:tcMar>
+              <w:top w:type="dxa" w:w="80"/>
+              <w:left w:type="dxa" w:w="120"/>
+              <w:bottom w:type="dxa" w:w="80"/>
+              <w:right w:type="dxa" w:w="120"/>
+            </w:tcMar>
+          </w:tcPr>
+          <w:p>
+            <w:r>
+              <w:t>24 Oct 2026</w:t>
+            </w:r>
+          </w:p>
+        </w:tc>
+      </w:tr>
     </w:tbl>
     <w:p>
       <w:pPr>
@@ -7844,74 +8024,6 @@
           </w:tcPr>
           <w:p>
             <w:r>
-              <w:t>17</w:t>
-            </w:r>
-          </w:p>
-        </w:tc>
-        <w:tc>
-          <w:tcPr>
-            <w:tcW w:type="dxa" w:w="4784"/>
-            <w:tcBorders>
-              <w:top w:val="single" w:color="A6A6A6" w:sz="4"/>
-              <w:left w:val="single" w:color="A6A6A6" w:sz="4"/>
-              <w:bottom w:val="single" w:color="A6A6A6" w:sz="4"/>
-              <w:right w:val="single" w:color="A6A6A6" w:sz="4"/>
-            </w:tcBorders>
-            <w:tcMar>
-              <w:top w:type="dxa" w:w="80"/>
-              <w:left w:type="dxa" w:w="120"/>
-              <w:bottom w:type="dxa" w:w="80"/>
-              <w:right w:type="dxa" w:w="120"/>
-            </w:tcMar>
-          </w:tcPr>
-          <w:p>
-            <w:r>
-              <w:t>Which release scouts and the referral reward go in (decision 70)</w:t>
-            </w:r>
-          </w:p>
-        </w:tc>
-        <w:tc>
-          <w:tcPr>
-            <w:tcW w:type="dxa" w:w="3610"/>
-            <w:tcBorders>
-              <w:top w:val="single" w:color="A6A6A6" w:sz="4"/>
-              <w:left w:val="single" w:color="A6A6A6" w:sz="4"/>
-              <w:bottom w:val="single" w:color="A6A6A6" w:sz="4"/>
-              <w:right w:val="single" w:color="A6A6A6" w:sz="4"/>
-            </w:tcBorders>
-            <w:tcMar>
-              <w:top w:type="dxa" w:w="80"/>
-              <w:left w:type="dxa" w:w="120"/>
-              <w:bottom w:type="dxa" w:w="80"/>
-              <w:right w:type="dxa" w:w="120"/>
-            </w:tcMar>
-          </w:tcPr>
-          <w:p>
-            <w:r>
-              <w:t>To be decided</w:t>
-            </w:r>
-          </w:p>
-        </w:tc>
-      </w:tr>
-      <w:tr>
-        <w:tc>
-          <w:tcPr>
-            <w:tcW w:type="dxa" w:w="632"/>
-            <w:tcBorders>
-              <w:top w:val="single" w:color="A6A6A6" w:sz="4"/>
-              <w:left w:val="single" w:color="A6A6A6" w:sz="4"/>
-              <w:bottom w:val="single" w:color="A6A6A6" w:sz="4"/>
-              <w:right w:val="single" w:color="A6A6A6" w:sz="4"/>
-            </w:tcBorders>
-            <w:tcMar>
-              <w:top w:type="dxa" w:w="80"/>
-              <w:left w:type="dxa" w:w="120"/>
-              <w:bottom w:type="dxa" w:w="80"/>
-              <w:right w:type="dxa" w:w="120"/>
-            </w:tcMar>
-          </w:tcPr>
-          <w:p>
-            <w:r>
               <w:t>18</w:t>
             </w:r>
           </w:p>
@@ -8161,7 +8273,7 @@
           </w:tcPr>
           <w:p>
             <w:r>
-              <w:t>1.6, 24 October 2026</w:t>
+              <w:t>1.7, 24 October 2026</w:t>
             </w:r>
           </w:p>
         </w:tc>
@@ -8207,7 +8319,7 @@
           </w:tcPr>
           <w:p>
             <w:r>
-              <w:t xml:space="preserve">1.0, 22 October 2026</w:t>
+              <w:t>1.1, 24 October 2026</w:t>
             </w:r>
           </w:p>
         </w:tc>

</xml_diff>

<commit_message>
Decision 74: responsive website and resizable desktop software; screen widths; Specification 1.8
Co-Authored-By: Claude Opus 5.5 <noreply@anthropic.com>
Claude-Session: https://claude.ai/code/session_01TGHwecHFuHmuouFRz99ypc
</commit_message>
<xml_diff>
--- a/docs/specs/FindHouseQuick_Decisions_Log.docx
+++ b/docs/specs/FindHouseQuick_Decisions_Log.docx
@@ -67,7 +67,7 @@
           <w:sz w:val="22"/>
           <w:szCs w:val="22"/>
         </w:rPr>
-        <w:t>Updated 24 October 2026</w:t>
+        <w:t>Updated 25 October 2026</w:t>
       </w:r>
     </w:p>
     <w:p>
@@ -6861,6 +6861,96 @@
           <w:p>
             <w:r>
               <w:t>24 Oct 2026</w:t>
+            </w:r>
+          </w:p>
+        </w:tc>
+      </w:tr>
+      <w:tr>
+        <w:tc>
+          <w:tcPr>
+            <w:tcW w:type="dxa" w:w="632"/>
+            <w:tcBorders>
+              <w:top w:val="single" w:color="A6A6A6" w:sz="4"/>
+              <w:left w:val="single" w:color="A6A6A6" w:sz="4"/>
+              <w:bottom w:val="single" w:color="A6A6A6" w:sz="4"/>
+              <w:right w:val="single" w:color="A6A6A6" w:sz="4"/>
+            </w:tcBorders>
+            <w:tcMar>
+              <w:top w:type="dxa" w:w="80"/>
+              <w:left w:type="dxa" w:w="120"/>
+              <w:bottom w:type="dxa" w:w="80"/>
+              <w:right w:type="dxa" w:w="120"/>
+            </w:tcMar>
+          </w:tcPr>
+          <w:p>
+            <w:r>
+              <w:t>74</w:t>
+            </w:r>
+          </w:p>
+        </w:tc>
+        <w:tc>
+          <w:tcPr>
+            <w:tcW w:type="dxa" w:w="1625"/>
+            <w:tcBorders>
+              <w:top w:val="single" w:color="A6A6A6" w:sz="4"/>
+              <w:left w:val="single" w:color="A6A6A6" w:sz="4"/>
+              <w:bottom w:val="single" w:color="A6A6A6" w:sz="4"/>
+              <w:right w:val="single" w:color="A6A6A6" w:sz="4"/>
+            </w:tcBorders>
+            <w:tcMar>
+              <w:top w:type="dxa" w:w="80"/>
+              <w:left w:type="dxa" w:w="120"/>
+              <w:bottom w:type="dxa" w:w="80"/>
+              <w:right w:type="dxa" w:w="120"/>
+            </w:tcMar>
+          </w:tcPr>
+          <w:p>
+            <w:r>
+              <w:t>Screen widths</w:t>
+            </w:r>
+          </w:p>
+        </w:tc>
+        <w:tc>
+          <w:tcPr>
+            <w:tcW w:type="dxa" w:w="5235"/>
+            <w:tcBorders>
+              <w:top w:val="single" w:color="A6A6A6" w:sz="4"/>
+              <w:left w:val="single" w:color="A6A6A6" w:sz="4"/>
+              <w:bottom w:val="single" w:color="A6A6A6" w:sz="4"/>
+              <w:right w:val="single" w:color="A6A6A6" w:sz="4"/>
+            </w:tcBorders>
+            <w:tcMar>
+              <w:top w:type="dxa" w:w="80"/>
+              <w:left w:type="dxa" w:w="120"/>
+              <w:bottom w:type="dxa" w:w="80"/>
+              <w:right w:type="dxa" w:w="120"/>
+            </w:tcMar>
+          </w:tcPr>
+          <w:p>
+            <w:r>
+              <w:t>The website is responsive and must work on every screen size without breaking. Each website design is drawn at the desktop width of 1366 pixels, with its tablet layout at 768; at phone width (360), the user screens follow the approved phone screens, and the public pages are drawn at that width too. Above 1366 the layout stretches, with the content kept to a comfortable width. The desktop software is designed for computers and laptops at 1366 by 768, in a window the user can resize, as most software allows. A website design includes its tablet and phone layouts, so the count of 304 designs in decision 73 is unchanged. Adds to decision 73. Source: chat, 25 October 2026.</w:t>
+            </w:r>
+          </w:p>
+        </w:tc>
+        <w:tc>
+          <w:tcPr>
+            <w:tcW w:type="dxa" w:w="1534"/>
+            <w:tcBorders>
+              <w:top w:val="single" w:color="A6A6A6" w:sz="4"/>
+              <w:left w:val="single" w:color="A6A6A6" w:sz="4"/>
+              <w:bottom w:val="single" w:color="A6A6A6" w:sz="4"/>
+              <w:right w:val="single" w:color="A6A6A6" w:sz="4"/>
+            </w:tcBorders>
+            <w:tcMar>
+              <w:top w:type="dxa" w:w="80"/>
+              <w:left w:type="dxa" w:w="120"/>
+              <w:bottom w:type="dxa" w:w="80"/>
+              <w:right w:type="dxa" w:w="120"/>
+            </w:tcMar>
+          </w:tcPr>
+          <w:p>
+            <w:r>
+              <w:t>25 Oct 2026</w:t>
             </w:r>
           </w:p>
         </w:tc>

</xml_diff>

<commit_message>
Decisions 73 and 74 changed in place: desktop software for staff only; Specification 1.9
Co-Authored-By: Claude Opus 5.5 <noreply@anthropic.com>
Claude-Session: https://claude.ai/code/session_01AxcXAKHEb19xS6bnoeXwy7
</commit_message>
<xml_diff>
--- a/docs/specs/FindHouseQuick_Decisions_Log.docx
+++ b/docs/specs/FindHouseQuick_Decisions_Log.docx
@@ -67,7 +67,7 @@
           <w:sz w:val="22"/>
           <w:szCs w:val="22"/>
         </w:rPr>
-        <w:t>Updated 25 October 2026</w:t>
+        <w:t>Updated 27 October 2026</w:t>
       </w:r>
     </w:p>
     <w:p>
@@ -6838,7 +6838,7 @@
           </w:tcPr>
           <w:p>
             <w:r>
-              <w:t>The screens to be designed are fixed in docs/designs.md: 112 screens. The website does everything the app does, so it has every user screen, not only common pages. Phone app: the 87 screens for every user type (tenants, landlords, agents and scouts). Website: the same 87 user screens laid out for a wide screen, the 18 staff screens and 7 public pages, 112 in all. Desktop software: the 87 user screens and the 18 staff screens, 105 in all. That is 304 designs. Adding a building, taking photos of each part and recording the walkthrough video are done on site with the phone's camera and GPS (Specification Sections 5.3 and 6.2), so on the website and desktop those three screens send the user to the phone. The screen designs (Release 0, step 2c) are complete only when all 304 are approved. New screens are added to the list only by a recorded decision. Source: chat, 24 October 2026.</w:t>
+              <w:t>The screens to be designed are fixed in docs/designs.md: 112 screens. The website does everything the app does, so it has every user screen, not only common pages. Phone app: the 87 screens for every user type (tenants, landlords, agents and scouts). Website: the same 87 user screens laid out for a wide screen, the 18 staff screens and 7 public pages, 112 in all. Desktop software: the 18 staff screens only; tenants, landlords, agents and scouts use the phone app and the website. That is 217 designs. Adding a building, taking photos of each part and recording the walkthrough video are done on site with the phone's camera and GPS (Specification Sections 5.3 and 6.2), so on the website those three screens send the user to the phone. The screen designs (Release 0, step 2c) are complete only when all 217 are approved. New screens are added to the list only by a recorded decision. Source: chat, 24 October 2026.</w:t>
             </w:r>
           </w:p>
         </w:tc>
@@ -6928,7 +6928,7 @@
           </w:tcPr>
           <w:p>
             <w:r>
-              <w:t>The website is responsive and must work on every screen size without breaking. Each website design is drawn at the desktop width of 1366 pixels, with its tablet layout at 768; at phone width (360), the user screens follow the approved phone screens, and the public pages are drawn at that width too. Above 1366 the layout stretches, with the content kept to a comfortable width. The desktop software is designed for computers and laptops at 1366 by 768, in a window the user can resize, as most software allows. A website design includes its tablet and phone layouts, so the count of 304 designs in decision 73 is unchanged. Adds to decision 73. Source: chat, 25 October 2026.</w:t>
+              <w:t>The website is responsive and must work on every screen size without breaking. Each website design is drawn at the desktop width of 1366 pixels, with its tablet layout at 768; at phone width (360), the user screens follow the approved phone screens, and the public pages are drawn at that width too. Above 1366 the layout stretches, with the content kept to a comfortable width. The desktop software, for staff only, is designed for computers and laptops at 1366 by 768, in a window the user can resize, as most software allows. A website design includes its tablet and phone layouts, so the count of 217 designs in decision 73 is unchanged. Adds to decision 73. Source: chat, 25 October 2026.</w:t>
             </w:r>
           </w:p>
         </w:tc>

</xml_diff>

<commit_message>
Decision 75: admin screens 113 to 115 added; screens 56 and 100 changed (designs in progress)
Co-Authored-By: Claude Opus 5.5 <noreply@anthropic.com>
Claude-Session: https://claude.ai/code/session_01AxcXAKHEb19xS6bnoeXwy7
</commit_message>
<xml_diff>
--- a/docs/specs/FindHouseQuick_Decisions_Log.docx
+++ b/docs/specs/FindHouseQuick_Decisions_Log.docx
@@ -6951,6 +6951,96 @@
           <w:p>
             <w:r>
               <w:t>25 Oct 2026</w:t>
+            </w:r>
+          </w:p>
+        </w:tc>
+      </w:tr>
+      <w:tr>
+        <w:tc>
+          <w:tcPr>
+            <w:tcW w:type="dxa" w:w="632"/>
+            <w:tcBorders>
+              <w:top w:val="single" w:color="A6A6A6" w:sz="4"/>
+              <w:left w:val="single" w:color="A6A6A6" w:sz="4"/>
+              <w:bottom w:val="single" w:color="A6A6A6" w:sz="4"/>
+              <w:right w:val="single" w:color="A6A6A6" w:sz="4"/>
+            </w:tcBorders>
+            <w:tcMar>
+              <w:top w:type="dxa" w:w="80"/>
+              <w:left w:type="dxa" w:w="120"/>
+              <w:bottom w:type="dxa" w:w="80"/>
+              <w:right w:type="dxa" w:w="120"/>
+            </w:tcMar>
+          </w:tcPr>
+          <w:p>
+            <w:r>
+              <w:t>75</w:t>
+            </w:r>
+          </w:p>
+        </w:tc>
+        <w:tc>
+          <w:tcPr>
+            <w:tcW w:type="dxa" w:w="1625"/>
+            <w:tcBorders>
+              <w:top w:val="single" w:color="A6A6A6" w:sz="4"/>
+              <w:left w:val="single" w:color="A6A6A6" w:sz="4"/>
+              <w:bottom w:val="single" w:color="A6A6A6" w:sz="4"/>
+              <w:right w:val="single" w:color="A6A6A6" w:sz="4"/>
+            </w:tcBorders>
+            <w:tcMar>
+              <w:top w:type="dxa" w:w="80"/>
+              <w:left w:type="dxa" w:w="120"/>
+              <w:bottom w:type="dxa" w:w="80"/>
+              <w:right w:type="dxa" w:w="120"/>
+            </w:tcMar>
+          </w:tcPr>
+          <w:p>
+            <w:r>
+              <w:t>Admin screens added</w:t>
+            </w:r>
+          </w:p>
+        </w:tc>
+        <w:tc>
+          <w:tcPr>
+            <w:tcW w:type="dxa" w:w="5235"/>
+            <w:tcBorders>
+              <w:top w:val="single" w:color="A6A6A6" w:sz="4"/>
+              <w:left w:val="single" w:color="A6A6A6" w:sz="4"/>
+              <w:bottom w:val="single" w:color="A6A6A6" w:sz="4"/>
+              <w:right w:val="single" w:color="A6A6A6" w:sz="4"/>
+            </w:tcBorders>
+            <w:tcMar>
+              <w:top w:type="dxa" w:w="80"/>
+              <w:left w:type="dxa" w:w="120"/>
+              <w:bottom w:type="dxa" w:w="80"/>
+              <w:right w:type="dxa" w:w="120"/>
+            </w:tcMar>
+          </w:tcPr>
+          <w:p>
+            <w:r>
+              <w:t>Three staff screens are added to the list of screens to be designed (decision 73): 113 Regions and cities (switching states and cities on or off), 114 Property types and photo checklists, and 115 Document types, each on the website (at 1366 and 768) and in the desktop software. Screen 100 (Country controls) also shows the country's languages, its on/off switch and the choices for unit details, and screen 56 (Parts checklist) gets a note on each part (decision 56). The list becomes 115 screens: 87 on the phone app, 115 on the website and 21 in the desktop software, 223 designs. Adds to decision 73. Source: chat, 29 October 2026.</w:t>
+            </w:r>
+          </w:p>
+        </w:tc>
+        <w:tc>
+          <w:tcPr>
+            <w:tcW w:type="dxa" w:w="1534"/>
+            <w:tcBorders>
+              <w:top w:val="single" w:color="A6A6A6" w:sz="4"/>
+              <w:left w:val="single" w:color="A6A6A6" w:sz="4"/>
+              <w:bottom w:val="single" w:color="A6A6A6" w:sz="4"/>
+              <w:right w:val="single" w:color="A6A6A6" w:sz="4"/>
+            </w:tcBorders>
+            <w:tcMar>
+              <w:top w:type="dxa" w:w="80"/>
+              <w:left w:type="dxa" w:w="120"/>
+              <w:bottom w:type="dxa" w:w="80"/>
+              <w:right w:type="dxa" w:w="120"/>
+            </w:tcMar>
+          </w:tcPr>
+          <w:p>
+            <w:r>
+              <w:t>29 Oct 2026</w:t>
             </w:r>
           </w:p>
         </w:tc>

</xml_diff>